<commit_message>
Course 2 Trainee User Guide: marked-lab deadlines (23:59 CT) and submission rules
Co-Authored-By: Claude Opus 5.5 <noreply@anthropic.com>
Claude-Session: https://claude.ai/code/session_018fWq9UNCNi5rGqwUiTA1Zk
</commit_message>
<xml_diff>
--- a/materials/00-start-here/GRC-Trainee-User-Guide-Start-to-Finish.docx
+++ b/materials/00-start-here/GRC-Trainee-User-Guide-Start-to-Finish.docx
@@ -4884,7 +4884,7 @@
                 <w:sz w:val="19"/>
                 <w:szCs w:val="19"/>
               </w:rPr>
-              <w:t xml:space="preserve">Marked build 1: PFCG role from the matrix (B1)</w:t>
+              <w:t xml:space="preserve">Marked build 1: PFCG role from the matrix (B1) · submit by 23:59 CT on the day of session 4</w:t>
             </w:r>
           </w:p>
         </w:tc>
@@ -5510,7 +5510,7 @@
                 <w:sz w:val="19"/>
                 <w:szCs w:val="19"/>
               </w:rPr>
-              <w:t xml:space="preserve">Marked build 2: MSMP / BRF+ workflow (B3)</w:t>
+              <w:t xml:space="preserve">Marked build 2: MSMP / BRF+ workflow (B3) · submit by 23:59 CT on the day of session 10</w:t>
             </w:r>
           </w:p>
         </w:tc>
@@ -5827,7 +5827,7 @@
                 <w:sz w:val="19"/>
                 <w:szCs w:val="19"/>
               </w:rPr>
-              <w:t xml:space="preserve">Marked build 3: Fiori OData &amp; S_SERVICE (B10)</w:t>
+              <w:t xml:space="preserve">Marked build 3: Fiori OData &amp; S_SERVICE (B10) · submit by 23:59 CT on the day of session 13</w:t>
             </w:r>
           </w:p>
         </w:tc>
@@ -6829,7 +6829,7 @@
           <w:sz w:val="21"/>
           <w:szCs w:val="21"/>
         </w:rPr>
-        <w:t xml:space="preserve"> complete the lab, then submit your write-up and evidence for marking. Marking is done by a TIB instructor.</w:t>
+        <w:t xml:space="preserve"> complete the lab, then submit your Field 13 write-up and every part's capture by the deadline in section 12. Marking is done by a TIB instructor.</w:t>
       </w:r>
     </w:p>
     <w:p>
@@ -8024,7 +8024,7 @@
                 <w:sz w:val="19"/>
                 <w:szCs w:val="19"/>
               </w:rPr>
-              <w:t xml:space="preserve">Marked deliverable 1: Security Audit Log filters (B12)</w:t>
+              <w:t xml:space="preserve">Marked deliverable 1: Security Audit Log filters (B12) · submit by 23:59 CT on the day of session 7</w:t>
             </w:r>
           </w:p>
         </w:tc>
@@ -8813,7 +8813,7 @@
                 <w:sz w:val="19"/>
                 <w:szCs w:val="19"/>
               </w:rPr>
-              <w:t xml:space="preserve">Marked deliverable 2: auditor evidence pack (C12)</w:t>
+              <w:t xml:space="preserve">Marked deliverable 2: auditor evidence pack (C12) · submit by 23:59 CT on the day of session 11</w:t>
             </w:r>
           </w:p>
         </w:tc>
@@ -8924,7 +8924,7 @@
                 <w:sz w:val="19"/>
                 <w:szCs w:val="19"/>
               </w:rPr>
-              <w:t xml:space="preserve">Marked deliverable 3: mitigating-control evidence review (D7)</w:t>
+              <w:t xml:space="preserve">Marked deliverable 3: mitigating-control evidence review (D7) · submit by 23:59 CT on the day of session 12</w:t>
             </w:r>
           </w:p>
         </w:tc>
@@ -10155,6 +10155,1180 @@
           <w:szCs w:val="30"/>
         </w:rPr>
         <w:t xml:space="preserve">12. Certificates</w:t>
+      </w:r>
+    </w:p>
+    <w:tbl>
+      <w:tblPr>
+        <w:tblW w:type="dxa" w:w="10080"/>
+        <w:tblLayout w:type="fixed"/>
+      </w:tblPr>
+      <w:tblGrid>
+        <w:gridCol w:w="2700"/>
+        <w:gridCol w:w="1400"/>
+        <w:gridCol w:w="1000"/>
+        <w:gridCol w:w="3080"/>
+        <w:gridCol w:w="1900"/>
+      </w:tblGrid>
+      <w:tr>
+        <w:trPr>
+          <w:tblHeader/>
+        </w:trPr>
+        <w:tc>
+          <w:tcPr>
+            <w:tcW w:type="dxa" w:w="2700"/>
+            <w:tcBorders>
+              <w:top w:val="single" w:color="D5DCE6" w:sz="4"/>
+              <w:left w:val="single" w:color="D5DCE6" w:sz="4"/>
+              <w:bottom w:val="single" w:color="D5DCE6" w:sz="4"/>
+              <w:right w:val="single" w:color="D5DCE6" w:sz="4"/>
+            </w:tcBorders>
+            <w:shd w:fill="1B3358" w:color="auto" w:val="clear"/>
+            <w:tcMar>
+              <w:top w:type="dxa" w:w="50"/>
+              <w:left w:type="dxa" w:w="100"/>
+              <w:bottom w:type="dxa" w:w="50"/>
+              <w:right w:type="dxa" w:w="100"/>
+            </w:tcMar>
+          </w:tcPr>
+          <w:p>
+            <w:pPr>
+              <w:spacing w:before="0" w:after="0" w:line="240"/>
+            </w:pPr>
+            <w:r>
+              <w:rPr>
+                <w:rFonts w:ascii="Calibri" w:cs="Calibri" w:eastAsia="Calibri" w:hAnsi="Calibri"/>
+                <w:b/>
+                <w:bCs/>
+                <w:color w:val="FFFFFF"/>
+                <w:sz w:val="19"/>
+                <w:szCs w:val="19"/>
+              </w:rPr>
+              <w:t xml:space="preserve">Marked work</w:t>
+            </w:r>
+          </w:p>
+        </w:tc>
+        <w:tc>
+          <w:tcPr>
+            <w:tcW w:type="dxa" w:w="1400"/>
+            <w:tcBorders>
+              <w:top w:val="single" w:color="D5DCE6" w:sz="4"/>
+              <w:left w:val="single" w:color="D5DCE6" w:sz="4"/>
+              <w:bottom w:val="single" w:color="D5DCE6" w:sz="4"/>
+              <w:right w:val="single" w:color="D5DCE6" w:sz="4"/>
+            </w:tcBorders>
+            <w:shd w:fill="1B3358" w:color="auto" w:val="clear"/>
+            <w:tcMar>
+              <w:top w:type="dxa" w:w="50"/>
+              <w:left w:type="dxa" w:w="100"/>
+              <w:bottom w:type="dxa" w:w="50"/>
+              <w:right w:type="dxa" w:w="100"/>
+            </w:tcMar>
+          </w:tcPr>
+          <w:p>
+            <w:pPr>
+              <w:spacing w:before="0" w:after="0" w:line="240"/>
+            </w:pPr>
+            <w:r>
+              <w:rPr>
+                <w:rFonts w:ascii="Calibri" w:cs="Calibri" w:eastAsia="Calibri" w:hAnsi="Calibri"/>
+                <w:b/>
+                <w:bCs/>
+                <w:color w:val="FFFFFF"/>
+                <w:sz w:val="19"/>
+                <w:szCs w:val="19"/>
+              </w:rPr>
+              <w:t xml:space="preserve">Level</w:t>
+            </w:r>
+          </w:p>
+        </w:tc>
+        <w:tc>
+          <w:tcPr>
+            <w:tcW w:type="dxa" w:w="1000"/>
+            <w:tcBorders>
+              <w:top w:val="single" w:color="D5DCE6" w:sz="4"/>
+              <w:left w:val="single" w:color="D5DCE6" w:sz="4"/>
+              <w:bottom w:val="single" w:color="D5DCE6" w:sz="4"/>
+              <w:right w:val="single" w:color="D5DCE6" w:sz="4"/>
+            </w:tcBorders>
+            <w:shd w:fill="1B3358" w:color="auto" w:val="clear"/>
+            <w:tcMar>
+              <w:top w:type="dxa" w:w="50"/>
+              <w:left w:type="dxa" w:w="100"/>
+              <w:bottom w:type="dxa" w:w="50"/>
+              <w:right w:type="dxa" w:w="100"/>
+            </w:tcMar>
+          </w:tcPr>
+          <w:p>
+            <w:pPr>
+              <w:spacing w:before="0" w:after="0" w:line="240"/>
+            </w:pPr>
+            <w:r>
+              <w:rPr>
+                <w:rFonts w:ascii="Calibri" w:cs="Calibri" w:eastAsia="Calibri" w:hAnsi="Calibri"/>
+                <w:b/>
+                <w:bCs/>
+                <w:color w:val="FFFFFF"/>
+                <w:sz w:val="19"/>
+                <w:szCs w:val="19"/>
+              </w:rPr>
+              <w:t xml:space="preserve">Set in</w:t>
+            </w:r>
+          </w:p>
+        </w:tc>
+        <w:tc>
+          <w:tcPr>
+            <w:tcW w:type="dxa" w:w="3080"/>
+            <w:tcBorders>
+              <w:top w:val="single" w:color="D5DCE6" w:sz="4"/>
+              <w:left w:val="single" w:color="D5DCE6" w:sz="4"/>
+              <w:bottom w:val="single" w:color="D5DCE6" w:sz="4"/>
+              <w:right w:val="single" w:color="D5DCE6" w:sz="4"/>
+            </w:tcBorders>
+            <w:shd w:fill="1B3358" w:color="auto" w:val="clear"/>
+            <w:tcMar>
+              <w:top w:type="dxa" w:w="50"/>
+              <w:left w:type="dxa" w:w="100"/>
+              <w:bottom w:type="dxa" w:w="50"/>
+              <w:right w:type="dxa" w:w="100"/>
+            </w:tcMar>
+          </w:tcPr>
+          <w:p>
+            <w:pPr>
+              <w:spacing w:before="0" w:after="0" w:line="240"/>
+            </w:pPr>
+            <w:r>
+              <w:rPr>
+                <w:rFonts w:ascii="Calibri" w:cs="Calibri" w:eastAsia="Calibri" w:hAnsi="Calibri"/>
+                <w:b/>
+                <w:bCs/>
+                <w:color w:val="FFFFFF"/>
+                <w:sz w:val="19"/>
+                <w:szCs w:val="19"/>
+              </w:rPr>
+              <w:t xml:space="preserve">Submit by</w:t>
+            </w:r>
+          </w:p>
+        </w:tc>
+        <w:tc>
+          <w:tcPr>
+            <w:tcW w:type="dxa" w:w="1900"/>
+            <w:tcBorders>
+              <w:top w:val="single" w:color="D5DCE6" w:sz="4"/>
+              <w:left w:val="single" w:color="D5DCE6" w:sz="4"/>
+              <w:bottom w:val="single" w:color="D5DCE6" w:sz="4"/>
+              <w:right w:val="single" w:color="D5DCE6" w:sz="4"/>
+            </w:tcBorders>
+            <w:shd w:fill="1B3358" w:color="auto" w:val="clear"/>
+            <w:tcMar>
+              <w:top w:type="dxa" w:w="50"/>
+              <w:left w:type="dxa" w:w="100"/>
+              <w:bottom w:type="dxa" w:w="50"/>
+              <w:right w:type="dxa" w:w="100"/>
+            </w:tcMar>
+          </w:tcPr>
+          <w:p>
+            <w:pPr>
+              <w:spacing w:before="0" w:after="0" w:line="240"/>
+            </w:pPr>
+            <w:r>
+              <w:rPr>
+                <w:rFonts w:ascii="Calibri" w:cs="Calibri" w:eastAsia="Calibri" w:hAnsi="Calibri"/>
+                <w:b/>
+                <w:bCs/>
+                <w:color w:val="FFFFFF"/>
+                <w:sz w:val="19"/>
+                <w:szCs w:val="19"/>
+              </w:rPr>
+              <w:t xml:space="preserve">Returned</w:t>
+            </w:r>
+          </w:p>
+        </w:tc>
+      </w:tr>
+      <w:tr>
+        <w:trPr>
+          <w:cantSplit/>
+        </w:trPr>
+        <w:tc>
+          <w:tcPr>
+            <w:tcW w:type="dxa" w:w="2700"/>
+            <w:tcBorders>
+              <w:top w:val="single" w:color="D5DCE6" w:sz="4"/>
+              <w:left w:val="single" w:color="D5DCE6" w:sz="4"/>
+              <w:bottom w:val="single" w:color="D5DCE6" w:sz="4"/>
+              <w:right w:val="single" w:color="D5DCE6" w:sz="4"/>
+            </w:tcBorders>
+            <w:shd w:fill="FFFFFF" w:color="auto" w:val="clear"/>
+            <w:tcMar>
+              <w:top w:type="dxa" w:w="50"/>
+              <w:left w:type="dxa" w:w="100"/>
+              <w:bottom w:type="dxa" w:w="50"/>
+              <w:right w:type="dxa" w:w="100"/>
+            </w:tcMar>
+          </w:tcPr>
+          <w:p>
+            <w:pPr>
+              <w:spacing w:before="0" w:after="0" w:line="240"/>
+            </w:pPr>
+            <w:r>
+              <w:rPr>
+                <w:rFonts w:ascii="Calibri" w:cs="Calibri" w:eastAsia="Calibri" w:hAnsi="Calibri"/>
+                <w:sz w:val="19"/>
+                <w:szCs w:val="19"/>
+              </w:rPr>
+              <w:t xml:space="preserve">B1 — PFCG role build</w:t>
+            </w:r>
+          </w:p>
+        </w:tc>
+        <w:tc>
+          <w:tcPr>
+            <w:tcW w:type="dxa" w:w="1400"/>
+            <w:tcBorders>
+              <w:top w:val="single" w:color="D5DCE6" w:sz="4"/>
+              <w:left w:val="single" w:color="D5DCE6" w:sz="4"/>
+              <w:bottom w:val="single" w:color="D5DCE6" w:sz="4"/>
+              <w:right w:val="single" w:color="D5DCE6" w:sz="4"/>
+            </w:tcBorders>
+            <w:shd w:fill="FFFFFF" w:color="auto" w:val="clear"/>
+            <w:tcMar>
+              <w:top w:type="dxa" w:w="50"/>
+              <w:left w:type="dxa" w:w="100"/>
+              <w:bottom w:type="dxa" w:w="50"/>
+              <w:right w:type="dxa" w:w="100"/>
+            </w:tcMar>
+          </w:tcPr>
+          <w:p>
+            <w:pPr>
+              <w:spacing w:before="0" w:after="0" w:line="240"/>
+            </w:pPr>
+            <w:r>
+              <w:rPr>
+                <w:rFonts w:ascii="Calibri" w:cs="Calibri" w:eastAsia="Calibri" w:hAnsi="Calibri"/>
+                <w:sz w:val="19"/>
+                <w:szCs w:val="19"/>
+              </w:rPr>
+              <w:t xml:space="preserve">Intermediate</w:t>
+            </w:r>
+          </w:p>
+        </w:tc>
+        <w:tc>
+          <w:tcPr>
+            <w:tcW w:type="dxa" w:w="1000"/>
+            <w:tcBorders>
+              <w:top w:val="single" w:color="D5DCE6" w:sz="4"/>
+              <w:left w:val="single" w:color="D5DCE6" w:sz="4"/>
+              <w:bottom w:val="single" w:color="D5DCE6" w:sz="4"/>
+              <w:right w:val="single" w:color="D5DCE6" w:sz="4"/>
+            </w:tcBorders>
+            <w:shd w:fill="FFFFFF" w:color="auto" w:val="clear"/>
+            <w:tcMar>
+              <w:top w:type="dxa" w:w="50"/>
+              <w:left w:type="dxa" w:w="100"/>
+              <w:bottom w:type="dxa" w:w="50"/>
+              <w:right w:type="dxa" w:w="100"/>
+            </w:tcMar>
+          </w:tcPr>
+          <w:p>
+            <w:pPr>
+              <w:spacing w:before="0" w:after="0" w:line="240"/>
+            </w:pPr>
+            <w:r>
+              <w:rPr>
+                <w:rFonts w:ascii="Calibri" w:cs="Calibri" w:eastAsia="Calibri" w:hAnsi="Calibri"/>
+                <w:sz w:val="19"/>
+                <w:szCs w:val="19"/>
+              </w:rPr>
+              <w:t xml:space="preserve">S3</w:t>
+            </w:r>
+          </w:p>
+        </w:tc>
+        <w:tc>
+          <w:tcPr>
+            <w:tcW w:type="dxa" w:w="3080"/>
+            <w:tcBorders>
+              <w:top w:val="single" w:color="D5DCE6" w:sz="4"/>
+              <w:left w:val="single" w:color="D5DCE6" w:sz="4"/>
+              <w:bottom w:val="single" w:color="D5DCE6" w:sz="4"/>
+              <w:right w:val="single" w:color="D5DCE6" w:sz="4"/>
+            </w:tcBorders>
+            <w:shd w:fill="FFFFFF" w:color="auto" w:val="clear"/>
+            <w:tcMar>
+              <w:top w:type="dxa" w:w="50"/>
+              <w:left w:type="dxa" w:w="100"/>
+              <w:bottom w:type="dxa" w:w="50"/>
+              <w:right w:type="dxa" w:w="100"/>
+            </w:tcMar>
+          </w:tcPr>
+          <w:p>
+            <w:pPr>
+              <w:spacing w:before="0" w:after="0" w:line="240"/>
+            </w:pPr>
+            <w:r>
+              <w:rPr>
+                <w:rFonts w:ascii="Calibri" w:cs="Calibri" w:eastAsia="Calibri" w:hAnsi="Calibri"/>
+                <w:sz w:val="19"/>
+                <w:szCs w:val="19"/>
+              </w:rPr>
+              <w:t xml:space="preserve">23:59 CT on the day of S4</w:t>
+            </w:r>
+          </w:p>
+        </w:tc>
+        <w:tc>
+          <w:tcPr>
+            <w:tcW w:type="dxa" w:w="1900"/>
+            <w:tcBorders>
+              <w:top w:val="single" w:color="D5DCE6" w:sz="4"/>
+              <w:left w:val="single" w:color="D5DCE6" w:sz="4"/>
+              <w:bottom w:val="single" w:color="D5DCE6" w:sz="4"/>
+              <w:right w:val="single" w:color="D5DCE6" w:sz="4"/>
+            </w:tcBorders>
+            <w:shd w:fill="FFFFFF" w:color="auto" w:val="clear"/>
+            <w:tcMar>
+              <w:top w:type="dxa" w:w="50"/>
+              <w:left w:type="dxa" w:w="100"/>
+              <w:bottom w:type="dxa" w:w="50"/>
+              <w:right w:type="dxa" w:w="100"/>
+            </w:tcMar>
+          </w:tcPr>
+          <w:p>
+            <w:pPr>
+              <w:spacing w:before="0" w:after="0" w:line="240"/>
+            </w:pPr>
+            <w:r>
+              <w:rPr>
+                <w:rFonts w:ascii="Calibri" w:cs="Calibri" w:eastAsia="Calibri" w:hAnsi="Calibri"/>
+                <w:sz w:val="19"/>
+                <w:szCs w:val="19"/>
+              </w:rPr>
+              <w:t xml:space="preserve">S6</w:t>
+            </w:r>
+          </w:p>
+        </w:tc>
+      </w:tr>
+      <w:tr>
+        <w:trPr>
+          <w:cantSplit/>
+        </w:trPr>
+        <w:tc>
+          <w:tcPr>
+            <w:tcW w:type="dxa" w:w="2700"/>
+            <w:tcBorders>
+              <w:top w:val="single" w:color="D5DCE6" w:sz="4"/>
+              <w:left w:val="single" w:color="D5DCE6" w:sz="4"/>
+              <w:bottom w:val="single" w:color="D5DCE6" w:sz="4"/>
+              <w:right w:val="single" w:color="D5DCE6" w:sz="4"/>
+            </w:tcBorders>
+            <w:shd w:fill="F4F6FA" w:color="auto" w:val="clear"/>
+            <w:tcMar>
+              <w:top w:type="dxa" w:w="50"/>
+              <w:left w:type="dxa" w:w="100"/>
+              <w:bottom w:type="dxa" w:w="50"/>
+              <w:right w:type="dxa" w:w="100"/>
+            </w:tcMar>
+          </w:tcPr>
+          <w:p>
+            <w:pPr>
+              <w:spacing w:before="0" w:after="0" w:line="240"/>
+            </w:pPr>
+            <w:r>
+              <w:rPr>
+                <w:rFonts w:ascii="Calibri" w:cs="Calibri" w:eastAsia="Calibri" w:hAnsi="Calibri"/>
+                <w:sz w:val="19"/>
+                <w:szCs w:val="19"/>
+              </w:rPr>
+              <w:t xml:space="preserve">B3 — MSMP / BRF+ build</w:t>
+            </w:r>
+          </w:p>
+        </w:tc>
+        <w:tc>
+          <w:tcPr>
+            <w:tcW w:type="dxa" w:w="1400"/>
+            <w:tcBorders>
+              <w:top w:val="single" w:color="D5DCE6" w:sz="4"/>
+              <w:left w:val="single" w:color="D5DCE6" w:sz="4"/>
+              <w:bottom w:val="single" w:color="D5DCE6" w:sz="4"/>
+              <w:right w:val="single" w:color="D5DCE6" w:sz="4"/>
+            </w:tcBorders>
+            <w:shd w:fill="F4F6FA" w:color="auto" w:val="clear"/>
+            <w:tcMar>
+              <w:top w:type="dxa" w:w="50"/>
+              <w:left w:type="dxa" w:w="100"/>
+              <w:bottom w:type="dxa" w:w="50"/>
+              <w:right w:type="dxa" w:w="100"/>
+            </w:tcMar>
+          </w:tcPr>
+          <w:p>
+            <w:pPr>
+              <w:spacing w:before="0" w:after="0" w:line="240"/>
+            </w:pPr>
+            <w:r>
+              <w:rPr>
+                <w:rFonts w:ascii="Calibri" w:cs="Calibri" w:eastAsia="Calibri" w:hAnsi="Calibri"/>
+                <w:sz w:val="19"/>
+                <w:szCs w:val="19"/>
+              </w:rPr>
+              <w:t xml:space="preserve">Intermediate</w:t>
+            </w:r>
+          </w:p>
+        </w:tc>
+        <w:tc>
+          <w:tcPr>
+            <w:tcW w:type="dxa" w:w="1000"/>
+            <w:tcBorders>
+              <w:top w:val="single" w:color="D5DCE6" w:sz="4"/>
+              <w:left w:val="single" w:color="D5DCE6" w:sz="4"/>
+              <w:bottom w:val="single" w:color="D5DCE6" w:sz="4"/>
+              <w:right w:val="single" w:color="D5DCE6" w:sz="4"/>
+            </w:tcBorders>
+            <w:shd w:fill="F4F6FA" w:color="auto" w:val="clear"/>
+            <w:tcMar>
+              <w:top w:type="dxa" w:w="50"/>
+              <w:left w:type="dxa" w:w="100"/>
+              <w:bottom w:type="dxa" w:w="50"/>
+              <w:right w:type="dxa" w:w="100"/>
+            </w:tcMar>
+          </w:tcPr>
+          <w:p>
+            <w:pPr>
+              <w:spacing w:before="0" w:after="0" w:line="240"/>
+            </w:pPr>
+            <w:r>
+              <w:rPr>
+                <w:rFonts w:ascii="Calibri" w:cs="Calibri" w:eastAsia="Calibri" w:hAnsi="Calibri"/>
+                <w:sz w:val="19"/>
+                <w:szCs w:val="19"/>
+              </w:rPr>
+              <w:t xml:space="preserve">S9</w:t>
+            </w:r>
+          </w:p>
+        </w:tc>
+        <w:tc>
+          <w:tcPr>
+            <w:tcW w:type="dxa" w:w="3080"/>
+            <w:tcBorders>
+              <w:top w:val="single" w:color="D5DCE6" w:sz="4"/>
+              <w:left w:val="single" w:color="D5DCE6" w:sz="4"/>
+              <w:bottom w:val="single" w:color="D5DCE6" w:sz="4"/>
+              <w:right w:val="single" w:color="D5DCE6" w:sz="4"/>
+            </w:tcBorders>
+            <w:shd w:fill="F4F6FA" w:color="auto" w:val="clear"/>
+            <w:tcMar>
+              <w:top w:type="dxa" w:w="50"/>
+              <w:left w:type="dxa" w:w="100"/>
+              <w:bottom w:type="dxa" w:w="50"/>
+              <w:right w:type="dxa" w:w="100"/>
+            </w:tcMar>
+          </w:tcPr>
+          <w:p>
+            <w:pPr>
+              <w:spacing w:before="0" w:after="0" w:line="240"/>
+            </w:pPr>
+            <w:r>
+              <w:rPr>
+                <w:rFonts w:ascii="Calibri" w:cs="Calibri" w:eastAsia="Calibri" w:hAnsi="Calibri"/>
+                <w:sz w:val="19"/>
+                <w:szCs w:val="19"/>
+              </w:rPr>
+              <w:t xml:space="preserve">23:59 CT on the day of S10</w:t>
+            </w:r>
+          </w:p>
+        </w:tc>
+        <w:tc>
+          <w:tcPr>
+            <w:tcW w:type="dxa" w:w="1900"/>
+            <w:tcBorders>
+              <w:top w:val="single" w:color="D5DCE6" w:sz="4"/>
+              <w:left w:val="single" w:color="D5DCE6" w:sz="4"/>
+              <w:bottom w:val="single" w:color="D5DCE6" w:sz="4"/>
+              <w:right w:val="single" w:color="D5DCE6" w:sz="4"/>
+            </w:tcBorders>
+            <w:shd w:fill="F4F6FA" w:color="auto" w:val="clear"/>
+            <w:tcMar>
+              <w:top w:type="dxa" w:w="50"/>
+              <w:left w:type="dxa" w:w="100"/>
+              <w:bottom w:type="dxa" w:w="50"/>
+              <w:right w:type="dxa" w:w="100"/>
+            </w:tcMar>
+          </w:tcPr>
+          <w:p>
+            <w:pPr>
+              <w:spacing w:before="0" w:after="0" w:line="240"/>
+            </w:pPr>
+            <w:r>
+              <w:rPr>
+                <w:rFonts w:ascii="Calibri" w:cs="Calibri" w:eastAsia="Calibri" w:hAnsi="Calibri"/>
+                <w:sz w:val="19"/>
+                <w:szCs w:val="19"/>
+              </w:rPr>
+              <w:t xml:space="preserve">S12</w:t>
+            </w:r>
+          </w:p>
+        </w:tc>
+      </w:tr>
+      <w:tr>
+        <w:trPr>
+          <w:cantSplit/>
+        </w:trPr>
+        <w:tc>
+          <w:tcPr>
+            <w:tcW w:type="dxa" w:w="2700"/>
+            <w:tcBorders>
+              <w:top w:val="single" w:color="D5DCE6" w:sz="4"/>
+              <w:left w:val="single" w:color="D5DCE6" w:sz="4"/>
+              <w:bottom w:val="single" w:color="D5DCE6" w:sz="4"/>
+              <w:right w:val="single" w:color="D5DCE6" w:sz="4"/>
+            </w:tcBorders>
+            <w:shd w:fill="FFFFFF" w:color="auto" w:val="clear"/>
+            <w:tcMar>
+              <w:top w:type="dxa" w:w="50"/>
+              <w:left w:type="dxa" w:w="100"/>
+              <w:bottom w:type="dxa" w:w="50"/>
+              <w:right w:type="dxa" w:w="100"/>
+            </w:tcMar>
+          </w:tcPr>
+          <w:p>
+            <w:pPr>
+              <w:spacing w:before="0" w:after="0" w:line="240"/>
+            </w:pPr>
+            <w:r>
+              <w:rPr>
+                <w:rFonts w:ascii="Calibri" w:cs="Calibri" w:eastAsia="Calibri" w:hAnsi="Calibri"/>
+                <w:sz w:val="19"/>
+                <w:szCs w:val="19"/>
+              </w:rPr>
+              <w:t xml:space="preserve">B10 — OData &amp; S_SERVICE</w:t>
+            </w:r>
+          </w:p>
+        </w:tc>
+        <w:tc>
+          <w:tcPr>
+            <w:tcW w:type="dxa" w:w="1400"/>
+            <w:tcBorders>
+              <w:top w:val="single" w:color="D5DCE6" w:sz="4"/>
+              <w:left w:val="single" w:color="D5DCE6" w:sz="4"/>
+              <w:bottom w:val="single" w:color="D5DCE6" w:sz="4"/>
+              <w:right w:val="single" w:color="D5DCE6" w:sz="4"/>
+            </w:tcBorders>
+            <w:shd w:fill="FFFFFF" w:color="auto" w:val="clear"/>
+            <w:tcMar>
+              <w:top w:type="dxa" w:w="50"/>
+              <w:left w:type="dxa" w:w="100"/>
+              <w:bottom w:type="dxa" w:w="50"/>
+              <w:right w:type="dxa" w:w="100"/>
+            </w:tcMar>
+          </w:tcPr>
+          <w:p>
+            <w:pPr>
+              <w:spacing w:before="0" w:after="0" w:line="240"/>
+            </w:pPr>
+            <w:r>
+              <w:rPr>
+                <w:rFonts w:ascii="Calibri" w:cs="Calibri" w:eastAsia="Calibri" w:hAnsi="Calibri"/>
+                <w:sz w:val="19"/>
+                <w:szCs w:val="19"/>
+              </w:rPr>
+              <w:t xml:space="preserve">Intermediate</w:t>
+            </w:r>
+          </w:p>
+        </w:tc>
+        <w:tc>
+          <w:tcPr>
+            <w:tcW w:type="dxa" w:w="1000"/>
+            <w:tcBorders>
+              <w:top w:val="single" w:color="D5DCE6" w:sz="4"/>
+              <w:left w:val="single" w:color="D5DCE6" w:sz="4"/>
+              <w:bottom w:val="single" w:color="D5DCE6" w:sz="4"/>
+              <w:right w:val="single" w:color="D5DCE6" w:sz="4"/>
+            </w:tcBorders>
+            <w:shd w:fill="FFFFFF" w:color="auto" w:val="clear"/>
+            <w:tcMar>
+              <w:top w:type="dxa" w:w="50"/>
+              <w:left w:type="dxa" w:w="100"/>
+              <w:bottom w:type="dxa" w:w="50"/>
+              <w:right w:type="dxa" w:w="100"/>
+            </w:tcMar>
+          </w:tcPr>
+          <w:p>
+            <w:pPr>
+              <w:spacing w:before="0" w:after="0" w:line="240"/>
+            </w:pPr>
+            <w:r>
+              <w:rPr>
+                <w:rFonts w:ascii="Calibri" w:cs="Calibri" w:eastAsia="Calibri" w:hAnsi="Calibri"/>
+                <w:sz w:val="19"/>
+                <w:szCs w:val="19"/>
+              </w:rPr>
+              <w:t xml:space="preserve">S12</w:t>
+            </w:r>
+          </w:p>
+        </w:tc>
+        <w:tc>
+          <w:tcPr>
+            <w:tcW w:type="dxa" w:w="3080"/>
+            <w:tcBorders>
+              <w:top w:val="single" w:color="D5DCE6" w:sz="4"/>
+              <w:left w:val="single" w:color="D5DCE6" w:sz="4"/>
+              <w:bottom w:val="single" w:color="D5DCE6" w:sz="4"/>
+              <w:right w:val="single" w:color="D5DCE6" w:sz="4"/>
+            </w:tcBorders>
+            <w:shd w:fill="FFFFFF" w:color="auto" w:val="clear"/>
+            <w:tcMar>
+              <w:top w:type="dxa" w:w="50"/>
+              <w:left w:type="dxa" w:w="100"/>
+              <w:bottom w:type="dxa" w:w="50"/>
+              <w:right w:type="dxa" w:w="100"/>
+            </w:tcMar>
+          </w:tcPr>
+          <w:p>
+            <w:pPr>
+              <w:spacing w:before="0" w:after="0" w:line="240"/>
+            </w:pPr>
+            <w:r>
+              <w:rPr>
+                <w:rFonts w:ascii="Calibri" w:cs="Calibri" w:eastAsia="Calibri" w:hAnsi="Calibri"/>
+                <w:sz w:val="19"/>
+                <w:szCs w:val="19"/>
+              </w:rPr>
+              <w:t xml:space="preserve">23:59 CT on the day of S13</w:t>
+            </w:r>
+          </w:p>
+        </w:tc>
+        <w:tc>
+          <w:tcPr>
+            <w:tcW w:type="dxa" w:w="1900"/>
+            <w:tcBorders>
+              <w:top w:val="single" w:color="D5DCE6" w:sz="4"/>
+              <w:left w:val="single" w:color="D5DCE6" w:sz="4"/>
+              <w:bottom w:val="single" w:color="D5DCE6" w:sz="4"/>
+              <w:right w:val="single" w:color="D5DCE6" w:sz="4"/>
+            </w:tcBorders>
+            <w:shd w:fill="FFFFFF" w:color="auto" w:val="clear"/>
+            <w:tcMar>
+              <w:top w:type="dxa" w:w="50"/>
+              <w:left w:type="dxa" w:w="100"/>
+              <w:bottom w:type="dxa" w:w="50"/>
+              <w:right w:type="dxa" w:w="100"/>
+            </w:tcMar>
+          </w:tcPr>
+          <w:p>
+            <w:pPr>
+              <w:spacing w:before="0" w:after="0" w:line="240"/>
+            </w:pPr>
+            <w:r>
+              <w:rPr>
+                <w:rFonts w:ascii="Calibri" w:cs="Calibri" w:eastAsia="Calibri" w:hAnsi="Calibri"/>
+                <w:sz w:val="19"/>
+                <w:szCs w:val="19"/>
+              </w:rPr>
+              <w:t xml:space="preserve">S15</w:t>
+            </w:r>
+          </w:p>
+        </w:tc>
+      </w:tr>
+      <w:tr>
+        <w:trPr>
+          <w:cantSplit/>
+        </w:trPr>
+        <w:tc>
+          <w:tcPr>
+            <w:tcW w:type="dxa" w:w="2700"/>
+            <w:tcBorders>
+              <w:top w:val="single" w:color="D5DCE6" w:sz="4"/>
+              <w:left w:val="single" w:color="D5DCE6" w:sz="4"/>
+              <w:bottom w:val="single" w:color="D5DCE6" w:sz="4"/>
+              <w:right w:val="single" w:color="D5DCE6" w:sz="4"/>
+            </w:tcBorders>
+            <w:shd w:fill="F4F6FA" w:color="auto" w:val="clear"/>
+            <w:tcMar>
+              <w:top w:type="dxa" w:w="50"/>
+              <w:left w:type="dxa" w:w="100"/>
+              <w:bottom w:type="dxa" w:w="50"/>
+              <w:right w:type="dxa" w:w="100"/>
+            </w:tcMar>
+          </w:tcPr>
+          <w:p>
+            <w:pPr>
+              <w:spacing w:before="0" w:after="0" w:line="240"/>
+            </w:pPr>
+            <w:r>
+              <w:rPr>
+                <w:rFonts w:ascii="Calibri" w:cs="Calibri" w:eastAsia="Calibri" w:hAnsi="Calibri"/>
+                <w:sz w:val="19"/>
+                <w:szCs w:val="19"/>
+              </w:rPr>
+              <w:t xml:space="preserve">B12 — Security Audit Log</w:t>
+            </w:r>
+          </w:p>
+        </w:tc>
+        <w:tc>
+          <w:tcPr>
+            <w:tcW w:type="dxa" w:w="1400"/>
+            <w:tcBorders>
+              <w:top w:val="single" w:color="D5DCE6" w:sz="4"/>
+              <w:left w:val="single" w:color="D5DCE6" w:sz="4"/>
+              <w:bottom w:val="single" w:color="D5DCE6" w:sz="4"/>
+              <w:right w:val="single" w:color="D5DCE6" w:sz="4"/>
+            </w:tcBorders>
+            <w:shd w:fill="F4F6FA" w:color="auto" w:val="clear"/>
+            <w:tcMar>
+              <w:top w:type="dxa" w:w="50"/>
+              <w:left w:type="dxa" w:w="100"/>
+              <w:bottom w:type="dxa" w:w="50"/>
+              <w:right w:type="dxa" w:w="100"/>
+            </w:tcMar>
+          </w:tcPr>
+          <w:p>
+            <w:pPr>
+              <w:spacing w:before="0" w:after="0" w:line="240"/>
+            </w:pPr>
+            <w:r>
+              <w:rPr>
+                <w:rFonts w:ascii="Calibri" w:cs="Calibri" w:eastAsia="Calibri" w:hAnsi="Calibri"/>
+                <w:sz w:val="19"/>
+                <w:szCs w:val="19"/>
+              </w:rPr>
+              <w:t xml:space="preserve">Advanced</w:t>
+            </w:r>
+          </w:p>
+        </w:tc>
+        <w:tc>
+          <w:tcPr>
+            <w:tcW w:type="dxa" w:w="1000"/>
+            <w:tcBorders>
+              <w:top w:val="single" w:color="D5DCE6" w:sz="4"/>
+              <w:left w:val="single" w:color="D5DCE6" w:sz="4"/>
+              <w:bottom w:val="single" w:color="D5DCE6" w:sz="4"/>
+              <w:right w:val="single" w:color="D5DCE6" w:sz="4"/>
+            </w:tcBorders>
+            <w:shd w:fill="F4F6FA" w:color="auto" w:val="clear"/>
+            <w:tcMar>
+              <w:top w:type="dxa" w:w="50"/>
+              <w:left w:type="dxa" w:w="100"/>
+              <w:bottom w:type="dxa" w:w="50"/>
+              <w:right w:type="dxa" w:w="100"/>
+            </w:tcMar>
+          </w:tcPr>
+          <w:p>
+            <w:pPr>
+              <w:spacing w:before="0" w:after="0" w:line="240"/>
+            </w:pPr>
+            <w:r>
+              <w:rPr>
+                <w:rFonts w:ascii="Calibri" w:cs="Calibri" w:eastAsia="Calibri" w:hAnsi="Calibri"/>
+                <w:sz w:val="19"/>
+                <w:szCs w:val="19"/>
+              </w:rPr>
+              <w:t xml:space="preserve">S6</w:t>
+            </w:r>
+          </w:p>
+        </w:tc>
+        <w:tc>
+          <w:tcPr>
+            <w:tcW w:type="dxa" w:w="3080"/>
+            <w:tcBorders>
+              <w:top w:val="single" w:color="D5DCE6" w:sz="4"/>
+              <w:left w:val="single" w:color="D5DCE6" w:sz="4"/>
+              <w:bottom w:val="single" w:color="D5DCE6" w:sz="4"/>
+              <w:right w:val="single" w:color="D5DCE6" w:sz="4"/>
+            </w:tcBorders>
+            <w:shd w:fill="F4F6FA" w:color="auto" w:val="clear"/>
+            <w:tcMar>
+              <w:top w:type="dxa" w:w="50"/>
+              <w:left w:type="dxa" w:w="100"/>
+              <w:bottom w:type="dxa" w:w="50"/>
+              <w:right w:type="dxa" w:w="100"/>
+            </w:tcMar>
+          </w:tcPr>
+          <w:p>
+            <w:pPr>
+              <w:spacing w:before="0" w:after="0" w:line="240"/>
+            </w:pPr>
+            <w:r>
+              <w:rPr>
+                <w:rFonts w:ascii="Calibri" w:cs="Calibri" w:eastAsia="Calibri" w:hAnsi="Calibri"/>
+                <w:sz w:val="19"/>
+                <w:szCs w:val="19"/>
+              </w:rPr>
+              <w:t xml:space="preserve">23:59 CT on the day of S7</w:t>
+            </w:r>
+          </w:p>
+        </w:tc>
+        <w:tc>
+          <w:tcPr>
+            <w:tcW w:type="dxa" w:w="1900"/>
+            <w:tcBorders>
+              <w:top w:val="single" w:color="D5DCE6" w:sz="4"/>
+              <w:left w:val="single" w:color="D5DCE6" w:sz="4"/>
+              <w:bottom w:val="single" w:color="D5DCE6" w:sz="4"/>
+              <w:right w:val="single" w:color="D5DCE6" w:sz="4"/>
+            </w:tcBorders>
+            <w:shd w:fill="F4F6FA" w:color="auto" w:val="clear"/>
+            <w:tcMar>
+              <w:top w:type="dxa" w:w="50"/>
+              <w:left w:type="dxa" w:w="100"/>
+              <w:bottom w:type="dxa" w:w="50"/>
+              <w:right w:type="dxa" w:w="100"/>
+            </w:tcMar>
+          </w:tcPr>
+          <w:p>
+            <w:pPr>
+              <w:spacing w:before="0" w:after="0" w:line="240"/>
+            </w:pPr>
+            <w:r>
+              <w:rPr>
+                <w:rFonts w:ascii="Calibri" w:cs="Calibri" w:eastAsia="Calibri" w:hAnsi="Calibri"/>
+                <w:sz w:val="19"/>
+                <w:szCs w:val="19"/>
+              </w:rPr>
+              <w:t xml:space="preserve">S9</w:t>
+            </w:r>
+          </w:p>
+        </w:tc>
+      </w:tr>
+      <w:tr>
+        <w:trPr>
+          <w:cantSplit/>
+        </w:trPr>
+        <w:tc>
+          <w:tcPr>
+            <w:tcW w:type="dxa" w:w="2700"/>
+            <w:tcBorders>
+              <w:top w:val="single" w:color="D5DCE6" w:sz="4"/>
+              <w:left w:val="single" w:color="D5DCE6" w:sz="4"/>
+              <w:bottom w:val="single" w:color="D5DCE6" w:sz="4"/>
+              <w:right w:val="single" w:color="D5DCE6" w:sz="4"/>
+            </w:tcBorders>
+            <w:shd w:fill="FFFFFF" w:color="auto" w:val="clear"/>
+            <w:tcMar>
+              <w:top w:type="dxa" w:w="50"/>
+              <w:left w:type="dxa" w:w="100"/>
+              <w:bottom w:type="dxa" w:w="50"/>
+              <w:right w:type="dxa" w:w="100"/>
+            </w:tcMar>
+          </w:tcPr>
+          <w:p>
+            <w:pPr>
+              <w:spacing w:before="0" w:after="0" w:line="240"/>
+            </w:pPr>
+            <w:r>
+              <w:rPr>
+                <w:rFonts w:ascii="Calibri" w:cs="Calibri" w:eastAsia="Calibri" w:hAnsi="Calibri"/>
+                <w:sz w:val="19"/>
+                <w:szCs w:val="19"/>
+              </w:rPr>
+              <w:t xml:space="preserve">C12 — Auditor evidence pack</w:t>
+            </w:r>
+          </w:p>
+        </w:tc>
+        <w:tc>
+          <w:tcPr>
+            <w:tcW w:type="dxa" w:w="1400"/>
+            <w:tcBorders>
+              <w:top w:val="single" w:color="D5DCE6" w:sz="4"/>
+              <w:left w:val="single" w:color="D5DCE6" w:sz="4"/>
+              <w:bottom w:val="single" w:color="D5DCE6" w:sz="4"/>
+              <w:right w:val="single" w:color="D5DCE6" w:sz="4"/>
+            </w:tcBorders>
+            <w:shd w:fill="FFFFFF" w:color="auto" w:val="clear"/>
+            <w:tcMar>
+              <w:top w:type="dxa" w:w="50"/>
+              <w:left w:type="dxa" w:w="100"/>
+              <w:bottom w:type="dxa" w:w="50"/>
+              <w:right w:type="dxa" w:w="100"/>
+            </w:tcMar>
+          </w:tcPr>
+          <w:p>
+            <w:pPr>
+              <w:spacing w:before="0" w:after="0" w:line="240"/>
+            </w:pPr>
+            <w:r>
+              <w:rPr>
+                <w:rFonts w:ascii="Calibri" w:cs="Calibri" w:eastAsia="Calibri" w:hAnsi="Calibri"/>
+                <w:sz w:val="19"/>
+                <w:szCs w:val="19"/>
+              </w:rPr>
+              <w:t xml:space="preserve">Advanced</w:t>
+            </w:r>
+          </w:p>
+        </w:tc>
+        <w:tc>
+          <w:tcPr>
+            <w:tcW w:type="dxa" w:w="1000"/>
+            <w:tcBorders>
+              <w:top w:val="single" w:color="D5DCE6" w:sz="4"/>
+              <w:left w:val="single" w:color="D5DCE6" w:sz="4"/>
+              <w:bottom w:val="single" w:color="D5DCE6" w:sz="4"/>
+              <w:right w:val="single" w:color="D5DCE6" w:sz="4"/>
+            </w:tcBorders>
+            <w:shd w:fill="FFFFFF" w:color="auto" w:val="clear"/>
+            <w:tcMar>
+              <w:top w:type="dxa" w:w="50"/>
+              <w:left w:type="dxa" w:w="100"/>
+              <w:bottom w:type="dxa" w:w="50"/>
+              <w:right w:type="dxa" w:w="100"/>
+            </w:tcMar>
+          </w:tcPr>
+          <w:p>
+            <w:pPr>
+              <w:spacing w:before="0" w:after="0" w:line="240"/>
+            </w:pPr>
+            <w:r>
+              <w:rPr>
+                <w:rFonts w:ascii="Calibri" w:cs="Calibri" w:eastAsia="Calibri" w:hAnsi="Calibri"/>
+                <w:sz w:val="19"/>
+                <w:szCs w:val="19"/>
+              </w:rPr>
+              <w:t xml:space="preserve">S10</w:t>
+            </w:r>
+          </w:p>
+        </w:tc>
+        <w:tc>
+          <w:tcPr>
+            <w:tcW w:type="dxa" w:w="3080"/>
+            <w:tcBorders>
+              <w:top w:val="single" w:color="D5DCE6" w:sz="4"/>
+              <w:left w:val="single" w:color="D5DCE6" w:sz="4"/>
+              <w:bottom w:val="single" w:color="D5DCE6" w:sz="4"/>
+              <w:right w:val="single" w:color="D5DCE6" w:sz="4"/>
+            </w:tcBorders>
+            <w:shd w:fill="FFFFFF" w:color="auto" w:val="clear"/>
+            <w:tcMar>
+              <w:top w:type="dxa" w:w="50"/>
+              <w:left w:type="dxa" w:w="100"/>
+              <w:bottom w:type="dxa" w:w="50"/>
+              <w:right w:type="dxa" w:w="100"/>
+            </w:tcMar>
+          </w:tcPr>
+          <w:p>
+            <w:pPr>
+              <w:spacing w:before="0" w:after="0" w:line="240"/>
+            </w:pPr>
+            <w:r>
+              <w:rPr>
+                <w:rFonts w:ascii="Calibri" w:cs="Calibri" w:eastAsia="Calibri" w:hAnsi="Calibri"/>
+                <w:sz w:val="19"/>
+                <w:szCs w:val="19"/>
+              </w:rPr>
+              <w:t xml:space="preserve">23:59 CT on the day of S11</w:t>
+            </w:r>
+          </w:p>
+        </w:tc>
+        <w:tc>
+          <w:tcPr>
+            <w:tcW w:type="dxa" w:w="1900"/>
+            <w:tcBorders>
+              <w:top w:val="single" w:color="D5DCE6" w:sz="4"/>
+              <w:left w:val="single" w:color="D5DCE6" w:sz="4"/>
+              <w:bottom w:val="single" w:color="D5DCE6" w:sz="4"/>
+              <w:right w:val="single" w:color="D5DCE6" w:sz="4"/>
+            </w:tcBorders>
+            <w:shd w:fill="FFFFFF" w:color="auto" w:val="clear"/>
+            <w:tcMar>
+              <w:top w:type="dxa" w:w="50"/>
+              <w:left w:type="dxa" w:w="100"/>
+              <w:bottom w:type="dxa" w:w="50"/>
+              <w:right w:type="dxa" w:w="100"/>
+            </w:tcMar>
+          </w:tcPr>
+          <w:p>
+            <w:pPr>
+              <w:spacing w:before="0" w:after="0" w:line="240"/>
+            </w:pPr>
+            <w:r>
+              <w:rPr>
+                <w:rFonts w:ascii="Calibri" w:cs="Calibri" w:eastAsia="Calibri" w:hAnsi="Calibri"/>
+                <w:sz w:val="19"/>
+                <w:szCs w:val="19"/>
+              </w:rPr>
+              <w:t xml:space="preserve">S12</w:t>
+            </w:r>
+          </w:p>
+        </w:tc>
+      </w:tr>
+      <w:tr>
+        <w:trPr>
+          <w:cantSplit/>
+        </w:trPr>
+        <w:tc>
+          <w:tcPr>
+            <w:tcW w:type="dxa" w:w="2700"/>
+            <w:tcBorders>
+              <w:top w:val="single" w:color="D5DCE6" w:sz="4"/>
+              <w:left w:val="single" w:color="D5DCE6" w:sz="4"/>
+              <w:bottom w:val="single" w:color="D5DCE6" w:sz="4"/>
+              <w:right w:val="single" w:color="D5DCE6" w:sz="4"/>
+            </w:tcBorders>
+            <w:shd w:fill="F4F6FA" w:color="auto" w:val="clear"/>
+            <w:tcMar>
+              <w:top w:type="dxa" w:w="50"/>
+              <w:left w:type="dxa" w:w="100"/>
+              <w:bottom w:type="dxa" w:w="50"/>
+              <w:right w:type="dxa" w:w="100"/>
+            </w:tcMar>
+          </w:tcPr>
+          <w:p>
+            <w:pPr>
+              <w:spacing w:before="0" w:after="0" w:line="240"/>
+            </w:pPr>
+            <w:r>
+              <w:rPr>
+                <w:rFonts w:ascii="Calibri" w:cs="Calibri" w:eastAsia="Calibri" w:hAnsi="Calibri"/>
+                <w:sz w:val="19"/>
+                <w:szCs w:val="19"/>
+              </w:rPr>
+              <w:t xml:space="preserve">D7 — Mitigating controls</w:t>
+            </w:r>
+          </w:p>
+        </w:tc>
+        <w:tc>
+          <w:tcPr>
+            <w:tcW w:type="dxa" w:w="1400"/>
+            <w:tcBorders>
+              <w:top w:val="single" w:color="D5DCE6" w:sz="4"/>
+              <w:left w:val="single" w:color="D5DCE6" w:sz="4"/>
+              <w:bottom w:val="single" w:color="D5DCE6" w:sz="4"/>
+              <w:right w:val="single" w:color="D5DCE6" w:sz="4"/>
+            </w:tcBorders>
+            <w:shd w:fill="F4F6FA" w:color="auto" w:val="clear"/>
+            <w:tcMar>
+              <w:top w:type="dxa" w:w="50"/>
+              <w:left w:type="dxa" w:w="100"/>
+              <w:bottom w:type="dxa" w:w="50"/>
+              <w:right w:type="dxa" w:w="100"/>
+            </w:tcMar>
+          </w:tcPr>
+          <w:p>
+            <w:pPr>
+              <w:spacing w:before="0" w:after="0" w:line="240"/>
+            </w:pPr>
+            <w:r>
+              <w:rPr>
+                <w:rFonts w:ascii="Calibri" w:cs="Calibri" w:eastAsia="Calibri" w:hAnsi="Calibri"/>
+                <w:sz w:val="19"/>
+                <w:szCs w:val="19"/>
+              </w:rPr>
+              <w:t xml:space="preserve">Advanced</w:t>
+            </w:r>
+          </w:p>
+        </w:tc>
+        <w:tc>
+          <w:tcPr>
+            <w:tcW w:type="dxa" w:w="1000"/>
+            <w:tcBorders>
+              <w:top w:val="single" w:color="D5DCE6" w:sz="4"/>
+              <w:left w:val="single" w:color="D5DCE6" w:sz="4"/>
+              <w:bottom w:val="single" w:color="D5DCE6" w:sz="4"/>
+              <w:right w:val="single" w:color="D5DCE6" w:sz="4"/>
+            </w:tcBorders>
+            <w:shd w:fill="F4F6FA" w:color="auto" w:val="clear"/>
+            <w:tcMar>
+              <w:top w:type="dxa" w:w="50"/>
+              <w:left w:type="dxa" w:w="100"/>
+              <w:bottom w:type="dxa" w:w="50"/>
+              <w:right w:type="dxa" w:w="100"/>
+            </w:tcMar>
+          </w:tcPr>
+          <w:p>
+            <w:pPr>
+              <w:spacing w:before="0" w:after="0" w:line="240"/>
+            </w:pPr>
+            <w:r>
+              <w:rPr>
+                <w:rFonts w:ascii="Calibri" w:cs="Calibri" w:eastAsia="Calibri" w:hAnsi="Calibri"/>
+                <w:sz w:val="19"/>
+                <w:szCs w:val="19"/>
+              </w:rPr>
+              <w:t xml:space="preserve">S11</w:t>
+            </w:r>
+          </w:p>
+        </w:tc>
+        <w:tc>
+          <w:tcPr>
+            <w:tcW w:type="dxa" w:w="3080"/>
+            <w:tcBorders>
+              <w:top w:val="single" w:color="D5DCE6" w:sz="4"/>
+              <w:left w:val="single" w:color="D5DCE6" w:sz="4"/>
+              <w:bottom w:val="single" w:color="D5DCE6" w:sz="4"/>
+              <w:right w:val="single" w:color="D5DCE6" w:sz="4"/>
+            </w:tcBorders>
+            <w:shd w:fill="F4F6FA" w:color="auto" w:val="clear"/>
+            <w:tcMar>
+              <w:top w:type="dxa" w:w="50"/>
+              <w:left w:type="dxa" w:w="100"/>
+              <w:bottom w:type="dxa" w:w="50"/>
+              <w:right w:type="dxa" w:w="100"/>
+            </w:tcMar>
+          </w:tcPr>
+          <w:p>
+            <w:pPr>
+              <w:spacing w:before="0" w:after="0" w:line="240"/>
+            </w:pPr>
+            <w:r>
+              <w:rPr>
+                <w:rFonts w:ascii="Calibri" w:cs="Calibri" w:eastAsia="Calibri" w:hAnsi="Calibri"/>
+                <w:sz w:val="19"/>
+                <w:szCs w:val="19"/>
+              </w:rPr>
+              <w:t xml:space="preserve">23:59 CT on the day of S12</w:t>
+            </w:r>
+          </w:p>
+        </w:tc>
+        <w:tc>
+          <w:tcPr>
+            <w:tcW w:type="dxa" w:w="1900"/>
+            <w:tcBorders>
+              <w:top w:val="single" w:color="D5DCE6" w:sz="4"/>
+              <w:left w:val="single" w:color="D5DCE6" w:sz="4"/>
+              <w:bottom w:val="single" w:color="D5DCE6" w:sz="4"/>
+              <w:right w:val="single" w:color="D5DCE6" w:sz="4"/>
+            </w:tcBorders>
+            <w:shd w:fill="F4F6FA" w:color="auto" w:val="clear"/>
+            <w:tcMar>
+              <w:top w:type="dxa" w:w="50"/>
+              <w:left w:type="dxa" w:w="100"/>
+              <w:bottom w:type="dxa" w:w="50"/>
+              <w:right w:type="dxa" w:w="100"/>
+            </w:tcMar>
+          </w:tcPr>
+          <w:p>
+            <w:pPr>
+              <w:spacing w:before="0" w:after="0" w:line="240"/>
+            </w:pPr>
+            <w:r>
+              <w:rPr>
+                <w:rFonts w:ascii="Calibri" w:cs="Calibri" w:eastAsia="Calibri" w:hAnsi="Calibri"/>
+                <w:sz w:val="19"/>
+                <w:szCs w:val="19"/>
+              </w:rPr>
+              <w:t xml:space="preserve">Within one week</w:t>
+            </w:r>
+          </w:p>
+        </w:tc>
+      </w:tr>
+    </w:tbl>
+    <w:p>
+      <w:pPr>
+        <w:spacing w:before="0" w:after="60" w:line="240"/>
+      </w:pPr>
+      <w:r>
+        <w:rPr>
+          <w:rFonts w:ascii="Calibri" w:cs="Calibri" w:eastAsia="Calibri" w:hAnsi="Calibri"/>
+          <w:sz w:val="21"/>
+          <w:szCs w:val="21"/>
+        </w:rPr>
+        <w:t xml:space="preserve"/>
+      </w:r>
+    </w:p>
+    <w:p>
+      <w:pPr>
+        <w:spacing w:before="0" w:after="80" w:line="240"/>
+      </w:pPr>
+      <w:r>
+        <w:rPr>
+          <w:rFonts w:ascii="Calibri" w:cs="Calibri" w:eastAsia="Calibri" w:hAnsi="Calibri"/>
+          <w:sz w:val="21"/>
+          <w:szCs w:val="21"/>
+        </w:rPr>
+        <w:t xml:space="preserve">Submit your Field 13 write-up and the capture from every part of the lab. Work built outside your ZZ_TRAIN_ namespace, with no verification evidence, or with a write-up copied from the model is returned for resubmission. Resubmissions are due one week after return. A piece passes at 60 or above, with no rubric line below 40.</w:t>
       </w:r>
     </w:p>
     <w:tbl>

</xml_diff>

<commit_message>
Course 2 graded-work briefs (ASSESS-001, 002, 005) in Course Materials; User Guide rubric, submission and panel rules
Co-Authored-By: Claude Opus 5.5 <noreply@anthropic.com>
Claude-Session: https://claude.ai/code/session_018fWq9UNCNi5rGqwUiTA1Zk
</commit_message>
<xml_diff>
--- a/materials/00-start-here/GRC-Trainee-User-Guide-Start-to-Finish.docx
+++ b/materials/00-start-here/GRC-Trainee-User-Guide-Start-to-Finish.docx
@@ -6829,7 +6829,25 @@
           <w:sz w:val="21"/>
           <w:szCs w:val="21"/>
         </w:rPr>
-        <w:t xml:space="preserve"> complete the lab, then submit your Field 13 write-up and every part's capture by the deadline in section 12. Marking is done by a TIB instructor.</w:t>
+        <w:t xml:space="preserve"> complete the lab, then submit it by the deadline in section 12. The full brief for each is in </w:t>
+      </w:r>
+      <w:r>
+        <w:rPr>
+          <w:rFonts w:ascii="Calibri" w:cs="Calibri" w:eastAsia="Calibri" w:hAnsi="Calibri"/>
+          <w:b/>
+          <w:bCs/>
+          <w:sz w:val="21"/>
+          <w:szCs w:val="21"/>
+        </w:rPr>
+        <w:t xml:space="preserve">Marked Build Briefs — Intermediate</w:t>
+      </w:r>
+      <w:r>
+        <w:rPr>
+          <w:rFonts w:ascii="Calibri" w:cs="Calibri" w:eastAsia="Calibri" w:hAnsi="Calibri"/>
+          <w:sz w:val="21"/>
+          <w:szCs w:val="21"/>
+        </w:rPr>
+        <w:t xml:space="preserve"> (Course Materials). Marking is done by a TIB instructor.</w:t>
       </w:r>
     </w:p>
     <w:p>
@@ -9415,7 +9433,25 @@
           <w:sz w:val="21"/>
           <w:szCs w:val="21"/>
         </w:rPr>
-        <w:t xml:space="preserve"> submit each for marking as your enrolment instructions say.</w:t>
+        <w:t xml:space="preserve"> submit each by the deadline in section 12. The full brief for each is in </w:t>
+      </w:r>
+      <w:r>
+        <w:rPr>
+          <w:rFonts w:ascii="Calibri" w:cs="Calibri" w:eastAsia="Calibri" w:hAnsi="Calibri"/>
+          <w:b/>
+          <w:bCs/>
+          <w:sz w:val="21"/>
+          <w:szCs w:val="21"/>
+        </w:rPr>
+        <w:t xml:space="preserve">Marked Deliverable Briefs — Advanced</w:t>
+      </w:r>
+      <w:r>
+        <w:rPr>
+          <w:rFonts w:ascii="Calibri" w:cs="Calibri" w:eastAsia="Calibri" w:hAnsi="Calibri"/>
+          <w:sz w:val="21"/>
+          <w:szCs w:val="21"/>
+        </w:rPr>
+        <w:t xml:space="preserve"> (Course Materials).</w:t>
       </w:r>
     </w:p>
     <w:p>
@@ -11328,7 +11364,767 @@
           <w:sz w:val="21"/>
           <w:szCs w:val="21"/>
         </w:rPr>
-        <w:t xml:space="preserve">Submit your Field 13 write-up and the capture from every part of the lab. Work built outside your ZZ_TRAIN_ namespace, with no verification evidence, or with a write-up copied from the model is returned for resubmission. Resubmissions are due one week after return. A piece passes at 60 or above, with no rubric line below 40.</w:t>
+        <w:t xml:space="preserve">How to submit: copy fields 1–14 of the lab and a capture for every part into one Word or PDF file named with the lab code and your name (for example B1_Your-Name.docx), and send it as your enrolment instructions say. Work built outside your ZZ_TRAIN_ namespace, with no verification evidence, or with a write-up copied from the model is returned for resubmission. Resubmissions are due one week after return. A piece passes at 60 or above, with no rubric line below 40.</w:t>
+      </w:r>
+    </w:p>
+    <w:tbl>
+      <w:tblPr>
+        <w:tblW w:type="dxa" w:w="10080"/>
+        <w:tblLayout w:type="fixed"/>
+      </w:tblPr>
+      <w:tblGrid>
+        <w:gridCol w:w="3600"/>
+        <w:gridCol w:w="900"/>
+        <w:gridCol w:w="5580"/>
+      </w:tblGrid>
+      <w:tr>
+        <w:trPr>
+          <w:tblHeader/>
+        </w:trPr>
+        <w:tc>
+          <w:tcPr>
+            <w:tcW w:type="dxa" w:w="3600"/>
+            <w:tcBorders>
+              <w:top w:val="single" w:color="D5DCE6" w:sz="4"/>
+              <w:left w:val="single" w:color="D5DCE6" w:sz="4"/>
+              <w:bottom w:val="single" w:color="D5DCE6" w:sz="4"/>
+              <w:right w:val="single" w:color="D5DCE6" w:sz="4"/>
+            </w:tcBorders>
+            <w:shd w:fill="1B3358" w:color="auto" w:val="clear"/>
+            <w:tcMar>
+              <w:top w:type="dxa" w:w="50"/>
+              <w:left w:type="dxa" w:w="100"/>
+              <w:bottom w:type="dxa" w:w="50"/>
+              <w:right w:type="dxa" w:w="100"/>
+            </w:tcMar>
+          </w:tcPr>
+          <w:p>
+            <w:pPr>
+              <w:spacing w:before="0" w:after="0" w:line="240"/>
+            </w:pPr>
+            <w:r>
+              <w:rPr>
+                <w:rFonts w:ascii="Calibri" w:cs="Calibri" w:eastAsia="Calibri" w:hAnsi="Calibri"/>
+                <w:b/>
+                <w:bCs/>
+                <w:color w:val="FFFFFF"/>
+                <w:sz w:val="19"/>
+                <w:szCs w:val="19"/>
+              </w:rPr>
+              <w:t xml:space="preserve">Rubric line</w:t>
+            </w:r>
+          </w:p>
+        </w:tc>
+        <w:tc>
+          <w:tcPr>
+            <w:tcW w:type="dxa" w:w="900"/>
+            <w:tcBorders>
+              <w:top w:val="single" w:color="D5DCE6" w:sz="4"/>
+              <w:left w:val="single" w:color="D5DCE6" w:sz="4"/>
+              <w:bottom w:val="single" w:color="D5DCE6" w:sz="4"/>
+              <w:right w:val="single" w:color="D5DCE6" w:sz="4"/>
+            </w:tcBorders>
+            <w:shd w:fill="1B3358" w:color="auto" w:val="clear"/>
+            <w:tcMar>
+              <w:top w:type="dxa" w:w="50"/>
+              <w:left w:type="dxa" w:w="100"/>
+              <w:bottom w:type="dxa" w:w="50"/>
+              <w:right w:type="dxa" w:w="100"/>
+            </w:tcMar>
+          </w:tcPr>
+          <w:p>
+            <w:pPr>
+              <w:spacing w:before="0" w:after="0" w:line="240"/>
+            </w:pPr>
+            <w:r>
+              <w:rPr>
+                <w:rFonts w:ascii="Calibri" w:cs="Calibri" w:eastAsia="Calibri" w:hAnsi="Calibri"/>
+                <w:b/>
+                <w:bCs/>
+                <w:color w:val="FFFFFF"/>
+                <w:sz w:val="19"/>
+                <w:szCs w:val="19"/>
+              </w:rPr>
+              <w:t xml:space="preserve">Weight</w:t>
+            </w:r>
+          </w:p>
+        </w:tc>
+        <w:tc>
+          <w:tcPr>
+            <w:tcW w:type="dxa" w:w="5580"/>
+            <w:tcBorders>
+              <w:top w:val="single" w:color="D5DCE6" w:sz="4"/>
+              <w:left w:val="single" w:color="D5DCE6" w:sz="4"/>
+              <w:bottom w:val="single" w:color="D5DCE6" w:sz="4"/>
+              <w:right w:val="single" w:color="D5DCE6" w:sz="4"/>
+            </w:tcBorders>
+            <w:shd w:fill="1B3358" w:color="auto" w:val="clear"/>
+            <w:tcMar>
+              <w:top w:type="dxa" w:w="50"/>
+              <w:left w:type="dxa" w:w="100"/>
+              <w:bottom w:type="dxa" w:w="50"/>
+              <w:right w:type="dxa" w:w="100"/>
+            </w:tcMar>
+          </w:tcPr>
+          <w:p>
+            <w:pPr>
+              <w:spacing w:before="0" w:after="0" w:line="240"/>
+            </w:pPr>
+            <w:r>
+              <w:rPr>
+                <w:rFonts w:ascii="Calibri" w:cs="Calibri" w:eastAsia="Calibri" w:hAnsi="Calibri"/>
+                <w:b/>
+                <w:bCs/>
+                <w:color w:val="FFFFFF"/>
+                <w:sz w:val="19"/>
+                <w:szCs w:val="19"/>
+              </w:rPr>
+              <w:t xml:space="preserve">What the marker is asking</w:t>
+            </w:r>
+          </w:p>
+        </w:tc>
+      </w:tr>
+      <w:tr>
+        <w:trPr>
+          <w:cantSplit/>
+        </w:trPr>
+        <w:tc>
+          <w:tcPr>
+            <w:tcW w:type="dxa" w:w="3600"/>
+            <w:tcBorders>
+              <w:top w:val="single" w:color="D5DCE6" w:sz="4"/>
+              <w:left w:val="single" w:color="D5DCE6" w:sz="4"/>
+              <w:bottom w:val="single" w:color="D5DCE6" w:sz="4"/>
+              <w:right w:val="single" w:color="D5DCE6" w:sz="4"/>
+            </w:tcBorders>
+            <w:shd w:fill="FFFFFF" w:color="auto" w:val="clear"/>
+            <w:tcMar>
+              <w:top w:type="dxa" w:w="50"/>
+              <w:left w:type="dxa" w:w="100"/>
+              <w:bottom w:type="dxa" w:w="50"/>
+              <w:right w:type="dxa" w:w="100"/>
+            </w:tcMar>
+          </w:tcPr>
+          <w:p>
+            <w:pPr>
+              <w:spacing w:before="0" w:after="0" w:line="240"/>
+            </w:pPr>
+            <w:r>
+              <w:rPr>
+                <w:rFonts w:ascii="Calibri" w:cs="Calibri" w:eastAsia="Calibri" w:hAnsi="Calibri"/>
+                <w:sz w:val="19"/>
+                <w:szCs w:val="19"/>
+              </w:rPr>
+              <w:t xml:space="preserve">Diagnosis &amp; scope (fields 1–8)</w:t>
+            </w:r>
+          </w:p>
+        </w:tc>
+        <w:tc>
+          <w:tcPr>
+            <w:tcW w:type="dxa" w:w="900"/>
+            <w:tcBorders>
+              <w:top w:val="single" w:color="D5DCE6" w:sz="4"/>
+              <w:left w:val="single" w:color="D5DCE6" w:sz="4"/>
+              <w:bottom w:val="single" w:color="D5DCE6" w:sz="4"/>
+              <w:right w:val="single" w:color="D5DCE6" w:sz="4"/>
+            </w:tcBorders>
+            <w:shd w:fill="FFFFFF" w:color="auto" w:val="clear"/>
+            <w:tcMar>
+              <w:top w:type="dxa" w:w="50"/>
+              <w:left w:type="dxa" w:w="100"/>
+              <w:bottom w:type="dxa" w:w="50"/>
+              <w:right w:type="dxa" w:w="100"/>
+            </w:tcMar>
+          </w:tcPr>
+          <w:p>
+            <w:pPr>
+              <w:spacing w:before="0" w:after="0" w:line="240"/>
+            </w:pPr>
+            <w:r>
+              <w:rPr>
+                <w:rFonts w:ascii="Calibri" w:cs="Calibri" w:eastAsia="Calibri" w:hAnsi="Calibri"/>
+                <w:sz w:val="19"/>
+                <w:szCs w:val="19"/>
+              </w:rPr>
+              <w:t xml:space="preserve">20%</w:t>
+            </w:r>
+          </w:p>
+        </w:tc>
+        <w:tc>
+          <w:tcPr>
+            <w:tcW w:type="dxa" w:w="5580"/>
+            <w:tcBorders>
+              <w:top w:val="single" w:color="D5DCE6" w:sz="4"/>
+              <w:left w:val="single" w:color="D5DCE6" w:sz="4"/>
+              <w:bottom w:val="single" w:color="D5DCE6" w:sz="4"/>
+              <w:right w:val="single" w:color="D5DCE6" w:sz="4"/>
+            </w:tcBorders>
+            <w:shd w:fill="FFFFFF" w:color="auto" w:val="clear"/>
+            <w:tcMar>
+              <w:top w:type="dxa" w:w="50"/>
+              <w:left w:type="dxa" w:w="100"/>
+              <w:bottom w:type="dxa" w:w="50"/>
+              <w:right w:type="dxa" w:w="100"/>
+            </w:tcMar>
+          </w:tcPr>
+          <w:p>
+            <w:pPr>
+              <w:spacing w:before="0" w:after="0" w:line="240"/>
+            </w:pPr>
+            <w:r>
+              <w:rPr>
+                <w:rFonts w:ascii="Calibri" w:cs="Calibri" w:eastAsia="Calibri" w:hAnsi="Calibri"/>
+                <w:sz w:val="19"/>
+                <w:szCs w:val="19"/>
+              </w:rPr>
+              <w:t xml:space="preserve">What is broken or needed, why it matters, the full scope and how you confirmed it</w:t>
+            </w:r>
+          </w:p>
+        </w:tc>
+      </w:tr>
+      <w:tr>
+        <w:trPr>
+          <w:cantSplit/>
+        </w:trPr>
+        <w:tc>
+          <w:tcPr>
+            <w:tcW w:type="dxa" w:w="3600"/>
+            <w:tcBorders>
+              <w:top w:val="single" w:color="D5DCE6" w:sz="4"/>
+              <w:left w:val="single" w:color="D5DCE6" w:sz="4"/>
+              <w:bottom w:val="single" w:color="D5DCE6" w:sz="4"/>
+              <w:right w:val="single" w:color="D5DCE6" w:sz="4"/>
+            </w:tcBorders>
+            <w:shd w:fill="F4F6FA" w:color="auto" w:val="clear"/>
+            <w:tcMar>
+              <w:top w:type="dxa" w:w="50"/>
+              <w:left w:type="dxa" w:w="100"/>
+              <w:bottom w:type="dxa" w:w="50"/>
+              <w:right w:type="dxa" w:w="100"/>
+            </w:tcMar>
+          </w:tcPr>
+          <w:p>
+            <w:pPr>
+              <w:spacing w:before="0" w:after="0" w:line="240"/>
+            </w:pPr>
+            <w:r>
+              <w:rPr>
+                <w:rFonts w:ascii="Calibri" w:cs="Calibri" w:eastAsia="Calibri" w:hAnsi="Calibri"/>
+                <w:sz w:val="19"/>
+                <w:szCs w:val="19"/>
+              </w:rPr>
+              <w:t xml:space="preserve">Design / fix approach (fields 5, 9)</w:t>
+            </w:r>
+          </w:p>
+        </w:tc>
+        <w:tc>
+          <w:tcPr>
+            <w:tcW w:type="dxa" w:w="900"/>
+            <w:tcBorders>
+              <w:top w:val="single" w:color="D5DCE6" w:sz="4"/>
+              <w:left w:val="single" w:color="D5DCE6" w:sz="4"/>
+              <w:bottom w:val="single" w:color="D5DCE6" w:sz="4"/>
+              <w:right w:val="single" w:color="D5DCE6" w:sz="4"/>
+            </w:tcBorders>
+            <w:shd w:fill="F4F6FA" w:color="auto" w:val="clear"/>
+            <w:tcMar>
+              <w:top w:type="dxa" w:w="50"/>
+              <w:left w:type="dxa" w:w="100"/>
+              <w:bottom w:type="dxa" w:w="50"/>
+              <w:right w:type="dxa" w:w="100"/>
+            </w:tcMar>
+          </w:tcPr>
+          <w:p>
+            <w:pPr>
+              <w:spacing w:before="0" w:after="0" w:line="240"/>
+            </w:pPr>
+            <w:r>
+              <w:rPr>
+                <w:rFonts w:ascii="Calibri" w:cs="Calibri" w:eastAsia="Calibri" w:hAnsi="Calibri"/>
+                <w:sz w:val="19"/>
+                <w:szCs w:val="19"/>
+              </w:rPr>
+              <w:t xml:space="preserve">15%</w:t>
+            </w:r>
+          </w:p>
+        </w:tc>
+        <w:tc>
+          <w:tcPr>
+            <w:tcW w:type="dxa" w:w="5580"/>
+            <w:tcBorders>
+              <w:top w:val="single" w:color="D5DCE6" w:sz="4"/>
+              <w:left w:val="single" w:color="D5DCE6" w:sz="4"/>
+              <w:bottom w:val="single" w:color="D5DCE6" w:sz="4"/>
+              <w:right w:val="single" w:color="D5DCE6" w:sz="4"/>
+            </w:tcBorders>
+            <w:shd w:fill="F4F6FA" w:color="auto" w:val="clear"/>
+            <w:tcMar>
+              <w:top w:type="dxa" w:w="50"/>
+              <w:left w:type="dxa" w:w="100"/>
+              <w:bottom w:type="dxa" w:w="50"/>
+              <w:right w:type="dxa" w:w="100"/>
+            </w:tcMar>
+          </w:tcPr>
+          <w:p>
+            <w:pPr>
+              <w:spacing w:before="0" w:after="0" w:line="240"/>
+            </w:pPr>
+            <w:r>
+              <w:rPr>
+                <w:rFonts w:ascii="Calibri" w:cs="Calibri" w:eastAsia="Calibri" w:hAnsi="Calibri"/>
+                <w:sz w:val="19"/>
+                <w:szCs w:val="19"/>
+              </w:rPr>
+              <w:t xml:space="preserve">The target design is right and the order of work is justified</w:t>
+            </w:r>
+          </w:p>
+        </w:tc>
+      </w:tr>
+      <w:tr>
+        <w:trPr>
+          <w:cantSplit/>
+        </w:trPr>
+        <w:tc>
+          <w:tcPr>
+            <w:tcW w:type="dxa" w:w="3600"/>
+            <w:tcBorders>
+              <w:top w:val="single" w:color="D5DCE6" w:sz="4"/>
+              <w:left w:val="single" w:color="D5DCE6" w:sz="4"/>
+              <w:bottom w:val="single" w:color="D5DCE6" w:sz="4"/>
+              <w:right w:val="single" w:color="D5DCE6" w:sz="4"/>
+            </w:tcBorders>
+            <w:shd w:fill="FFFFFF" w:color="auto" w:val="clear"/>
+            <w:tcMar>
+              <w:top w:type="dxa" w:w="50"/>
+              <w:left w:type="dxa" w:w="100"/>
+              <w:bottom w:type="dxa" w:w="50"/>
+              <w:right w:type="dxa" w:w="100"/>
+            </w:tcMar>
+          </w:tcPr>
+          <w:p>
+            <w:pPr>
+              <w:spacing w:before="0" w:after="0" w:line="240"/>
+            </w:pPr>
+            <w:r>
+              <w:rPr>
+                <w:rFonts w:ascii="Calibri" w:cs="Calibri" w:eastAsia="Calibri" w:hAnsi="Calibri"/>
+                <w:sz w:val="19"/>
+                <w:szCs w:val="19"/>
+              </w:rPr>
+              <w:t xml:space="preserve">Build accuracy (field 11)</w:t>
+            </w:r>
+          </w:p>
+        </w:tc>
+        <w:tc>
+          <w:tcPr>
+            <w:tcW w:type="dxa" w:w="900"/>
+            <w:tcBorders>
+              <w:top w:val="single" w:color="D5DCE6" w:sz="4"/>
+              <w:left w:val="single" w:color="D5DCE6" w:sz="4"/>
+              <w:bottom w:val="single" w:color="D5DCE6" w:sz="4"/>
+              <w:right w:val="single" w:color="D5DCE6" w:sz="4"/>
+            </w:tcBorders>
+            <w:shd w:fill="FFFFFF" w:color="auto" w:val="clear"/>
+            <w:tcMar>
+              <w:top w:type="dxa" w:w="50"/>
+              <w:left w:type="dxa" w:w="100"/>
+              <w:bottom w:type="dxa" w:w="50"/>
+              <w:right w:type="dxa" w:w="100"/>
+            </w:tcMar>
+          </w:tcPr>
+          <w:p>
+            <w:pPr>
+              <w:spacing w:before="0" w:after="0" w:line="240"/>
+            </w:pPr>
+            <w:r>
+              <w:rPr>
+                <w:rFonts w:ascii="Calibri" w:cs="Calibri" w:eastAsia="Calibri" w:hAnsi="Calibri"/>
+                <w:sz w:val="19"/>
+                <w:szCs w:val="19"/>
+              </w:rPr>
+              <w:t xml:space="preserve">20%</w:t>
+            </w:r>
+          </w:p>
+        </w:tc>
+        <w:tc>
+          <w:tcPr>
+            <w:tcW w:type="dxa" w:w="5580"/>
+            <w:tcBorders>
+              <w:top w:val="single" w:color="D5DCE6" w:sz="4"/>
+              <w:left w:val="single" w:color="D5DCE6" w:sz="4"/>
+              <w:bottom w:val="single" w:color="D5DCE6" w:sz="4"/>
+              <w:right w:val="single" w:color="D5DCE6" w:sz="4"/>
+            </w:tcBorders>
+            <w:shd w:fill="FFFFFF" w:color="auto" w:val="clear"/>
+            <w:tcMar>
+              <w:top w:type="dxa" w:w="50"/>
+              <w:left w:type="dxa" w:w="100"/>
+              <w:bottom w:type="dxa" w:w="50"/>
+              <w:right w:type="dxa" w:w="100"/>
+            </w:tcMar>
+          </w:tcPr>
+          <w:p>
+            <w:pPr>
+              <w:spacing w:before="0" w:after="0" w:line="240"/>
+            </w:pPr>
+            <w:r>
+              <w:rPr>
+                <w:rFonts w:ascii="Calibri" w:cs="Calibri" w:eastAsia="Calibri" w:hAnsi="Calibri"/>
+                <w:sz w:val="19"/>
+                <w:szCs w:val="19"/>
+              </w:rPr>
+              <w:t xml:space="preserve">Every part built correctly in your own ZZ_TRAIN_ copy</w:t>
+            </w:r>
+          </w:p>
+        </w:tc>
+      </w:tr>
+      <w:tr>
+        <w:trPr>
+          <w:cantSplit/>
+        </w:trPr>
+        <w:tc>
+          <w:tcPr>
+            <w:tcW w:type="dxa" w:w="3600"/>
+            <w:tcBorders>
+              <w:top w:val="single" w:color="D5DCE6" w:sz="4"/>
+              <w:left w:val="single" w:color="D5DCE6" w:sz="4"/>
+              <w:bottom w:val="single" w:color="D5DCE6" w:sz="4"/>
+              <w:right w:val="single" w:color="D5DCE6" w:sz="4"/>
+            </w:tcBorders>
+            <w:shd w:fill="F4F6FA" w:color="auto" w:val="clear"/>
+            <w:tcMar>
+              <w:top w:type="dxa" w:w="50"/>
+              <w:left w:type="dxa" w:w="100"/>
+              <w:bottom w:type="dxa" w:w="50"/>
+              <w:right w:type="dxa" w:w="100"/>
+            </w:tcMar>
+          </w:tcPr>
+          <w:p>
+            <w:pPr>
+              <w:spacing w:before="0" w:after="0" w:line="240"/>
+            </w:pPr>
+            <w:r>
+              <w:rPr>
+                <w:rFonts w:ascii="Calibri" w:cs="Calibri" w:eastAsia="Calibri" w:hAnsi="Calibri"/>
+                <w:sz w:val="19"/>
+                <w:szCs w:val="19"/>
+              </w:rPr>
+              <w:t xml:space="preserve">Verification evidence (fields 10, 12)</w:t>
+            </w:r>
+          </w:p>
+        </w:tc>
+        <w:tc>
+          <w:tcPr>
+            <w:tcW w:type="dxa" w:w="900"/>
+            <w:tcBorders>
+              <w:top w:val="single" w:color="D5DCE6" w:sz="4"/>
+              <w:left w:val="single" w:color="D5DCE6" w:sz="4"/>
+              <w:bottom w:val="single" w:color="D5DCE6" w:sz="4"/>
+              <w:right w:val="single" w:color="D5DCE6" w:sz="4"/>
+            </w:tcBorders>
+            <w:shd w:fill="F4F6FA" w:color="auto" w:val="clear"/>
+            <w:tcMar>
+              <w:top w:type="dxa" w:w="50"/>
+              <w:left w:type="dxa" w:w="100"/>
+              <w:bottom w:type="dxa" w:w="50"/>
+              <w:right w:type="dxa" w:w="100"/>
+            </w:tcMar>
+          </w:tcPr>
+          <w:p>
+            <w:pPr>
+              <w:spacing w:before="0" w:after="0" w:line="240"/>
+            </w:pPr>
+            <w:r>
+              <w:rPr>
+                <w:rFonts w:ascii="Calibri" w:cs="Calibri" w:eastAsia="Calibri" w:hAnsi="Calibri"/>
+                <w:sz w:val="19"/>
+                <w:szCs w:val="19"/>
+              </w:rPr>
+              <w:t xml:space="preserve">15%</w:t>
+            </w:r>
+          </w:p>
+        </w:tc>
+        <w:tc>
+          <w:tcPr>
+            <w:tcW w:type="dxa" w:w="5580"/>
+            <w:tcBorders>
+              <w:top w:val="single" w:color="D5DCE6" w:sz="4"/>
+              <w:left w:val="single" w:color="D5DCE6" w:sz="4"/>
+              <w:bottom w:val="single" w:color="D5DCE6" w:sz="4"/>
+              <w:right w:val="single" w:color="D5DCE6" w:sz="4"/>
+            </w:tcBorders>
+            <w:shd w:fill="F4F6FA" w:color="auto" w:val="clear"/>
+            <w:tcMar>
+              <w:top w:type="dxa" w:w="50"/>
+              <w:left w:type="dxa" w:w="100"/>
+              <w:bottom w:type="dxa" w:w="50"/>
+              <w:right w:type="dxa" w:w="100"/>
+            </w:tcMar>
+          </w:tcPr>
+          <w:p>
+            <w:pPr>
+              <w:spacing w:before="0" w:after="0" w:line="240"/>
+            </w:pPr>
+            <w:r>
+              <w:rPr>
+                <w:rFonts w:ascii="Calibri" w:cs="Calibri" w:eastAsia="Calibri" w:hAnsi="Calibri"/>
+                <w:sz w:val="19"/>
+                <w:szCs w:val="19"/>
+              </w:rPr>
+              <w:t xml:space="preserve">A capture for every part proves it works, including the negative test</w:t>
+            </w:r>
+          </w:p>
+        </w:tc>
+      </w:tr>
+      <w:tr>
+        <w:trPr>
+          <w:cantSplit/>
+        </w:trPr>
+        <w:tc>
+          <w:tcPr>
+            <w:tcW w:type="dxa" w:w="3600"/>
+            <w:tcBorders>
+              <w:top w:val="single" w:color="D5DCE6" w:sz="4"/>
+              <w:left w:val="single" w:color="D5DCE6" w:sz="4"/>
+              <w:bottom w:val="single" w:color="D5DCE6" w:sz="4"/>
+              <w:right w:val="single" w:color="D5DCE6" w:sz="4"/>
+            </w:tcBorders>
+            <w:shd w:fill="FFFFFF" w:color="auto" w:val="clear"/>
+            <w:tcMar>
+              <w:top w:type="dxa" w:w="50"/>
+              <w:left w:type="dxa" w:w="100"/>
+              <w:bottom w:type="dxa" w:w="50"/>
+              <w:right w:type="dxa" w:w="100"/>
+            </w:tcMar>
+          </w:tcPr>
+          <w:p>
+            <w:pPr>
+              <w:spacing w:before="0" w:after="0" w:line="240"/>
+            </w:pPr>
+            <w:r>
+              <w:rPr>
+                <w:rFonts w:ascii="Calibri" w:cs="Calibri" w:eastAsia="Calibri" w:hAnsi="Calibri"/>
+                <w:sz w:val="19"/>
+                <w:szCs w:val="19"/>
+              </w:rPr>
+              <w:t xml:space="preserve">Write-up quality (field 13)</w:t>
+            </w:r>
+          </w:p>
+        </w:tc>
+        <w:tc>
+          <w:tcPr>
+            <w:tcW w:type="dxa" w:w="900"/>
+            <w:tcBorders>
+              <w:top w:val="single" w:color="D5DCE6" w:sz="4"/>
+              <w:left w:val="single" w:color="D5DCE6" w:sz="4"/>
+              <w:bottom w:val="single" w:color="D5DCE6" w:sz="4"/>
+              <w:right w:val="single" w:color="D5DCE6" w:sz="4"/>
+            </w:tcBorders>
+            <w:shd w:fill="FFFFFF" w:color="auto" w:val="clear"/>
+            <w:tcMar>
+              <w:top w:type="dxa" w:w="50"/>
+              <w:left w:type="dxa" w:w="100"/>
+              <w:bottom w:type="dxa" w:w="50"/>
+              <w:right w:type="dxa" w:w="100"/>
+            </w:tcMar>
+          </w:tcPr>
+          <w:p>
+            <w:pPr>
+              <w:spacing w:before="0" w:after="0" w:line="240"/>
+            </w:pPr>
+            <w:r>
+              <w:rPr>
+                <w:rFonts w:ascii="Calibri" w:cs="Calibri" w:eastAsia="Calibri" w:hAnsi="Calibri"/>
+                <w:sz w:val="19"/>
+                <w:szCs w:val="19"/>
+              </w:rPr>
+              <w:t xml:space="preserve">15%</w:t>
+            </w:r>
+          </w:p>
+        </w:tc>
+        <w:tc>
+          <w:tcPr>
+            <w:tcW w:type="dxa" w:w="5580"/>
+            <w:tcBorders>
+              <w:top w:val="single" w:color="D5DCE6" w:sz="4"/>
+              <w:left w:val="single" w:color="D5DCE6" w:sz="4"/>
+              <w:bottom w:val="single" w:color="D5DCE6" w:sz="4"/>
+              <w:right w:val="single" w:color="D5DCE6" w:sz="4"/>
+            </w:tcBorders>
+            <w:shd w:fill="FFFFFF" w:color="auto" w:val="clear"/>
+            <w:tcMar>
+              <w:top w:type="dxa" w:w="50"/>
+              <w:left w:type="dxa" w:w="100"/>
+              <w:bottom w:type="dxa" w:w="50"/>
+              <w:right w:type="dxa" w:w="100"/>
+            </w:tcMar>
+          </w:tcPr>
+          <w:p>
+            <w:pPr>
+              <w:spacing w:before="0" w:after="0" w:line="240"/>
+            </w:pPr>
+            <w:r>
+              <w:rPr>
+                <w:rFonts w:ascii="Calibri" w:cs="Calibri" w:eastAsia="Calibri" w:hAnsi="Calibri"/>
+                <w:sz w:val="19"/>
+                <w:szCs w:val="19"/>
+              </w:rPr>
+              <w:t xml:space="preserve">Your own words: what you did, how you proved it, what remains</w:t>
+            </w:r>
+          </w:p>
+        </w:tc>
+      </w:tr>
+      <w:tr>
+        <w:trPr>
+          <w:cantSplit/>
+        </w:trPr>
+        <w:tc>
+          <w:tcPr>
+            <w:tcW w:type="dxa" w:w="3600"/>
+            <w:tcBorders>
+              <w:top w:val="single" w:color="D5DCE6" w:sz="4"/>
+              <w:left w:val="single" w:color="D5DCE6" w:sz="4"/>
+              <w:bottom w:val="single" w:color="D5DCE6" w:sz="4"/>
+              <w:right w:val="single" w:color="D5DCE6" w:sz="4"/>
+            </w:tcBorders>
+            <w:shd w:fill="F4F6FA" w:color="auto" w:val="clear"/>
+            <w:tcMar>
+              <w:top w:type="dxa" w:w="50"/>
+              <w:left w:type="dxa" w:w="100"/>
+              <w:bottom w:type="dxa" w:w="50"/>
+              <w:right w:type="dxa" w:w="100"/>
+            </w:tcMar>
+          </w:tcPr>
+          <w:p>
+            <w:pPr>
+              <w:spacing w:before="0" w:after="0" w:line="240"/>
+            </w:pPr>
+            <w:r>
+              <w:rPr>
+                <w:rFonts w:ascii="Calibri" w:cs="Calibri" w:eastAsia="Calibri" w:hAnsi="Calibri"/>
+                <w:sz w:val="19"/>
+                <w:szCs w:val="19"/>
+              </w:rPr>
+              <w:t xml:space="preserve">Stakeholder communication (fields 14–15, panel)</w:t>
+            </w:r>
+          </w:p>
+        </w:tc>
+        <w:tc>
+          <w:tcPr>
+            <w:tcW w:type="dxa" w:w="900"/>
+            <w:tcBorders>
+              <w:top w:val="single" w:color="D5DCE6" w:sz="4"/>
+              <w:left w:val="single" w:color="D5DCE6" w:sz="4"/>
+              <w:bottom w:val="single" w:color="D5DCE6" w:sz="4"/>
+              <w:right w:val="single" w:color="D5DCE6" w:sz="4"/>
+            </w:tcBorders>
+            <w:shd w:fill="F4F6FA" w:color="auto" w:val="clear"/>
+            <w:tcMar>
+              <w:top w:type="dxa" w:w="50"/>
+              <w:left w:type="dxa" w:w="100"/>
+              <w:bottom w:type="dxa" w:w="50"/>
+              <w:right w:type="dxa" w:w="100"/>
+            </w:tcMar>
+          </w:tcPr>
+          <w:p>
+            <w:pPr>
+              <w:spacing w:before="0" w:after="0" w:line="240"/>
+            </w:pPr>
+            <w:r>
+              <w:rPr>
+                <w:rFonts w:ascii="Calibri" w:cs="Calibri" w:eastAsia="Calibri" w:hAnsi="Calibri"/>
+                <w:sz w:val="19"/>
+                <w:szCs w:val="19"/>
+              </w:rPr>
+              <w:t xml:space="preserve">15%</w:t>
+            </w:r>
+          </w:p>
+        </w:tc>
+        <w:tc>
+          <w:tcPr>
+            <w:tcW w:type="dxa" w:w="5580"/>
+            <w:tcBorders>
+              <w:top w:val="single" w:color="D5DCE6" w:sz="4"/>
+              <w:left w:val="single" w:color="D5DCE6" w:sz="4"/>
+              <w:bottom w:val="single" w:color="D5DCE6" w:sz="4"/>
+              <w:right w:val="single" w:color="D5DCE6" w:sz="4"/>
+            </w:tcBorders>
+            <w:shd w:fill="F4F6FA" w:color="auto" w:val="clear"/>
+            <w:tcMar>
+              <w:top w:type="dxa" w:w="50"/>
+              <w:left w:type="dxa" w:w="100"/>
+              <w:bottom w:type="dxa" w:w="50"/>
+              <w:right w:type="dxa" w:w="100"/>
+            </w:tcMar>
+          </w:tcPr>
+          <w:p>
+            <w:pPr>
+              <w:spacing w:before="0" w:after="0" w:line="240"/>
+            </w:pPr>
+            <w:r>
+              <w:rPr>
+                <w:rFonts w:ascii="Calibri" w:cs="Calibri" w:eastAsia="Calibri" w:hAnsi="Calibri"/>
+                <w:sz w:val="19"/>
+                <w:szCs w:val="19"/>
+              </w:rPr>
+              <w:t xml:space="preserve">You answer the pushback without giving up a correct position, in plain language</w:t>
+            </w:r>
+          </w:p>
+        </w:tc>
+      </w:tr>
+    </w:tbl>
+    <w:p>
+      <w:pPr>
+        <w:spacing w:before="0" w:after="60" w:line="240"/>
+      </w:pPr>
+      <w:r>
+        <w:rPr>
+          <w:rFonts w:ascii="Calibri" w:cs="Calibri" w:eastAsia="Calibri" w:hAnsi="Calibri"/>
+          <w:sz w:val="21"/>
+          <w:szCs w:val="21"/>
+        </w:rPr>
+        <w:t xml:space="preserve"/>
+      </w:r>
+    </w:p>
+    <w:p>
+      <w:pPr>
+        <w:spacing w:before="0" w:after="80" w:line="240"/>
+      </w:pPr>
+      <w:r>
+        <w:rPr>
+          <w:rFonts w:ascii="Calibri" w:cs="Calibri" w:eastAsia="Calibri" w:hAnsi="Calibri"/>
+          <w:b/>
+          <w:bCs/>
+          <w:sz w:val="21"/>
+          <w:szCs w:val="21"/>
+        </w:rPr>
+        <w:t xml:space="preserve">Stakeholder panels</w:t>
+      </w:r>
+      <w:r>
+        <w:rPr>
+          <w:rFonts w:ascii="Calibri" w:cs="Calibri" w:eastAsia="Calibri" w:hAnsi="Calibri"/>
+          <w:sz w:val="21"/>
+          <w:szCs w:val="21"/>
+        </w:rPr>
+        <w:t xml:space="preserve"> (Intermediate session 16, Advanced session 12) are marked on the same rubric. Present one piece of your work to an auditor, a developer and a business owner, 3 minutes each plus one question. If your conclusion changes between audiences, the panel is marked resubmit. Full preparation steps are in the </w:t>
+      </w:r>
+      <w:r>
+        <w:rPr>
+          <w:rFonts w:ascii="Calibri" w:cs="Calibri" w:eastAsia="Calibri" w:hAnsi="Calibri"/>
+          <w:b/>
+          <w:bCs/>
+          <w:sz w:val="21"/>
+          <w:szCs w:val="21"/>
+        </w:rPr>
+        <w:t xml:space="preserve">Stakeholder Panel Brief</w:t>
+      </w:r>
+      <w:r>
+        <w:rPr>
+          <w:rFonts w:ascii="Calibri" w:cs="Calibri" w:eastAsia="Calibri" w:hAnsi="Calibri"/>
+          <w:sz w:val="21"/>
+          <w:szCs w:val="21"/>
+        </w:rPr>
+        <w:t xml:space="preserve">.</w:t>
       </w:r>
     </w:p>
     <w:tbl>

</xml_diff>

<commit_message>
Revert Course 2 graded-work briefs and User Guide rubric additions (Course 1 controls framing does not fit Course 2)
Co-Authored-By: Claude Opus 5.5 <noreply@anthropic.com>
Claude-Session: https://claude.ai/code/session_018fWq9UNCNi5rGqwUiTA1Zk
</commit_message>
<xml_diff>
--- a/materials/00-start-here/GRC-Trainee-User-Guide-Start-to-Finish.docx
+++ b/materials/00-start-here/GRC-Trainee-User-Guide-Start-to-Finish.docx
@@ -6829,25 +6829,7 @@
           <w:sz w:val="21"/>
           <w:szCs w:val="21"/>
         </w:rPr>
-        <w:t xml:space="preserve"> complete the lab, then submit it by the deadline in section 12. The full brief for each is in </w:t>
-      </w:r>
-      <w:r>
-        <w:rPr>
-          <w:rFonts w:ascii="Calibri" w:cs="Calibri" w:eastAsia="Calibri" w:hAnsi="Calibri"/>
-          <w:b/>
-          <w:bCs/>
-          <w:sz w:val="21"/>
-          <w:szCs w:val="21"/>
-        </w:rPr>
-        <w:t xml:space="preserve">Marked Build Briefs — Intermediate</w:t>
-      </w:r>
-      <w:r>
-        <w:rPr>
-          <w:rFonts w:ascii="Calibri" w:cs="Calibri" w:eastAsia="Calibri" w:hAnsi="Calibri"/>
-          <w:sz w:val="21"/>
-          <w:szCs w:val="21"/>
-        </w:rPr>
-        <w:t xml:space="preserve"> (Course Materials). Marking is done by a TIB instructor.</w:t>
+        <w:t xml:space="preserve"> complete the lab, then submit your Field 13 write-up and every part's capture by the deadline in section 12. Marking is done by a TIB instructor.</w:t>
       </w:r>
     </w:p>
     <w:p>
@@ -9433,25 +9415,7 @@
           <w:sz w:val="21"/>
           <w:szCs w:val="21"/>
         </w:rPr>
-        <w:t xml:space="preserve"> submit each by the deadline in section 12. The full brief for each is in </w:t>
-      </w:r>
-      <w:r>
-        <w:rPr>
-          <w:rFonts w:ascii="Calibri" w:cs="Calibri" w:eastAsia="Calibri" w:hAnsi="Calibri"/>
-          <w:b/>
-          <w:bCs/>
-          <w:sz w:val="21"/>
-          <w:szCs w:val="21"/>
-        </w:rPr>
-        <w:t xml:space="preserve">Marked Deliverable Briefs — Advanced</w:t>
-      </w:r>
-      <w:r>
-        <w:rPr>
-          <w:rFonts w:ascii="Calibri" w:cs="Calibri" w:eastAsia="Calibri" w:hAnsi="Calibri"/>
-          <w:sz w:val="21"/>
-          <w:szCs w:val="21"/>
-        </w:rPr>
-        <w:t xml:space="preserve"> (Course Materials).</w:t>
+        <w:t xml:space="preserve"> submit each for marking as your enrolment instructions say.</w:t>
       </w:r>
     </w:p>
     <w:p>
@@ -11364,767 +11328,7 @@
           <w:sz w:val="21"/>
           <w:szCs w:val="21"/>
         </w:rPr>
-        <w:t xml:space="preserve">How to submit: copy fields 1–14 of the lab and a capture for every part into one Word or PDF file named with the lab code and your name (for example B1_Your-Name.docx), and send it as your enrolment instructions say. Work built outside your ZZ_TRAIN_ namespace, with no verification evidence, or with a write-up copied from the model is returned for resubmission. Resubmissions are due one week after return. A piece passes at 60 or above, with no rubric line below 40.</w:t>
-      </w:r>
-    </w:p>
-    <w:tbl>
-      <w:tblPr>
-        <w:tblW w:type="dxa" w:w="10080"/>
-        <w:tblLayout w:type="fixed"/>
-      </w:tblPr>
-      <w:tblGrid>
-        <w:gridCol w:w="3600"/>
-        <w:gridCol w:w="900"/>
-        <w:gridCol w:w="5580"/>
-      </w:tblGrid>
-      <w:tr>
-        <w:trPr>
-          <w:tblHeader/>
-        </w:trPr>
-        <w:tc>
-          <w:tcPr>
-            <w:tcW w:type="dxa" w:w="3600"/>
-            <w:tcBorders>
-              <w:top w:val="single" w:color="D5DCE6" w:sz="4"/>
-              <w:left w:val="single" w:color="D5DCE6" w:sz="4"/>
-              <w:bottom w:val="single" w:color="D5DCE6" w:sz="4"/>
-              <w:right w:val="single" w:color="D5DCE6" w:sz="4"/>
-            </w:tcBorders>
-            <w:shd w:fill="1B3358" w:color="auto" w:val="clear"/>
-            <w:tcMar>
-              <w:top w:type="dxa" w:w="50"/>
-              <w:left w:type="dxa" w:w="100"/>
-              <w:bottom w:type="dxa" w:w="50"/>
-              <w:right w:type="dxa" w:w="100"/>
-            </w:tcMar>
-          </w:tcPr>
-          <w:p>
-            <w:pPr>
-              <w:spacing w:before="0" w:after="0" w:line="240"/>
-            </w:pPr>
-            <w:r>
-              <w:rPr>
-                <w:rFonts w:ascii="Calibri" w:cs="Calibri" w:eastAsia="Calibri" w:hAnsi="Calibri"/>
-                <w:b/>
-                <w:bCs/>
-                <w:color w:val="FFFFFF"/>
-                <w:sz w:val="19"/>
-                <w:szCs w:val="19"/>
-              </w:rPr>
-              <w:t xml:space="preserve">Rubric line</w:t>
-            </w:r>
-          </w:p>
-        </w:tc>
-        <w:tc>
-          <w:tcPr>
-            <w:tcW w:type="dxa" w:w="900"/>
-            <w:tcBorders>
-              <w:top w:val="single" w:color="D5DCE6" w:sz="4"/>
-              <w:left w:val="single" w:color="D5DCE6" w:sz="4"/>
-              <w:bottom w:val="single" w:color="D5DCE6" w:sz="4"/>
-              <w:right w:val="single" w:color="D5DCE6" w:sz="4"/>
-            </w:tcBorders>
-            <w:shd w:fill="1B3358" w:color="auto" w:val="clear"/>
-            <w:tcMar>
-              <w:top w:type="dxa" w:w="50"/>
-              <w:left w:type="dxa" w:w="100"/>
-              <w:bottom w:type="dxa" w:w="50"/>
-              <w:right w:type="dxa" w:w="100"/>
-            </w:tcMar>
-          </w:tcPr>
-          <w:p>
-            <w:pPr>
-              <w:spacing w:before="0" w:after="0" w:line="240"/>
-            </w:pPr>
-            <w:r>
-              <w:rPr>
-                <w:rFonts w:ascii="Calibri" w:cs="Calibri" w:eastAsia="Calibri" w:hAnsi="Calibri"/>
-                <w:b/>
-                <w:bCs/>
-                <w:color w:val="FFFFFF"/>
-                <w:sz w:val="19"/>
-                <w:szCs w:val="19"/>
-              </w:rPr>
-              <w:t xml:space="preserve">Weight</w:t>
-            </w:r>
-          </w:p>
-        </w:tc>
-        <w:tc>
-          <w:tcPr>
-            <w:tcW w:type="dxa" w:w="5580"/>
-            <w:tcBorders>
-              <w:top w:val="single" w:color="D5DCE6" w:sz="4"/>
-              <w:left w:val="single" w:color="D5DCE6" w:sz="4"/>
-              <w:bottom w:val="single" w:color="D5DCE6" w:sz="4"/>
-              <w:right w:val="single" w:color="D5DCE6" w:sz="4"/>
-            </w:tcBorders>
-            <w:shd w:fill="1B3358" w:color="auto" w:val="clear"/>
-            <w:tcMar>
-              <w:top w:type="dxa" w:w="50"/>
-              <w:left w:type="dxa" w:w="100"/>
-              <w:bottom w:type="dxa" w:w="50"/>
-              <w:right w:type="dxa" w:w="100"/>
-            </w:tcMar>
-          </w:tcPr>
-          <w:p>
-            <w:pPr>
-              <w:spacing w:before="0" w:after="0" w:line="240"/>
-            </w:pPr>
-            <w:r>
-              <w:rPr>
-                <w:rFonts w:ascii="Calibri" w:cs="Calibri" w:eastAsia="Calibri" w:hAnsi="Calibri"/>
-                <w:b/>
-                <w:bCs/>
-                <w:color w:val="FFFFFF"/>
-                <w:sz w:val="19"/>
-                <w:szCs w:val="19"/>
-              </w:rPr>
-              <w:t xml:space="preserve">What the marker is asking</w:t>
-            </w:r>
-          </w:p>
-        </w:tc>
-      </w:tr>
-      <w:tr>
-        <w:trPr>
-          <w:cantSplit/>
-        </w:trPr>
-        <w:tc>
-          <w:tcPr>
-            <w:tcW w:type="dxa" w:w="3600"/>
-            <w:tcBorders>
-              <w:top w:val="single" w:color="D5DCE6" w:sz="4"/>
-              <w:left w:val="single" w:color="D5DCE6" w:sz="4"/>
-              <w:bottom w:val="single" w:color="D5DCE6" w:sz="4"/>
-              <w:right w:val="single" w:color="D5DCE6" w:sz="4"/>
-            </w:tcBorders>
-            <w:shd w:fill="FFFFFF" w:color="auto" w:val="clear"/>
-            <w:tcMar>
-              <w:top w:type="dxa" w:w="50"/>
-              <w:left w:type="dxa" w:w="100"/>
-              <w:bottom w:type="dxa" w:w="50"/>
-              <w:right w:type="dxa" w:w="100"/>
-            </w:tcMar>
-          </w:tcPr>
-          <w:p>
-            <w:pPr>
-              <w:spacing w:before="0" w:after="0" w:line="240"/>
-            </w:pPr>
-            <w:r>
-              <w:rPr>
-                <w:rFonts w:ascii="Calibri" w:cs="Calibri" w:eastAsia="Calibri" w:hAnsi="Calibri"/>
-                <w:sz w:val="19"/>
-                <w:szCs w:val="19"/>
-              </w:rPr>
-              <w:t xml:space="preserve">Diagnosis &amp; scope (fields 1–8)</w:t>
-            </w:r>
-          </w:p>
-        </w:tc>
-        <w:tc>
-          <w:tcPr>
-            <w:tcW w:type="dxa" w:w="900"/>
-            <w:tcBorders>
-              <w:top w:val="single" w:color="D5DCE6" w:sz="4"/>
-              <w:left w:val="single" w:color="D5DCE6" w:sz="4"/>
-              <w:bottom w:val="single" w:color="D5DCE6" w:sz="4"/>
-              <w:right w:val="single" w:color="D5DCE6" w:sz="4"/>
-            </w:tcBorders>
-            <w:shd w:fill="FFFFFF" w:color="auto" w:val="clear"/>
-            <w:tcMar>
-              <w:top w:type="dxa" w:w="50"/>
-              <w:left w:type="dxa" w:w="100"/>
-              <w:bottom w:type="dxa" w:w="50"/>
-              <w:right w:type="dxa" w:w="100"/>
-            </w:tcMar>
-          </w:tcPr>
-          <w:p>
-            <w:pPr>
-              <w:spacing w:before="0" w:after="0" w:line="240"/>
-            </w:pPr>
-            <w:r>
-              <w:rPr>
-                <w:rFonts w:ascii="Calibri" w:cs="Calibri" w:eastAsia="Calibri" w:hAnsi="Calibri"/>
-                <w:sz w:val="19"/>
-                <w:szCs w:val="19"/>
-              </w:rPr>
-              <w:t xml:space="preserve">20%</w:t>
-            </w:r>
-          </w:p>
-        </w:tc>
-        <w:tc>
-          <w:tcPr>
-            <w:tcW w:type="dxa" w:w="5580"/>
-            <w:tcBorders>
-              <w:top w:val="single" w:color="D5DCE6" w:sz="4"/>
-              <w:left w:val="single" w:color="D5DCE6" w:sz="4"/>
-              <w:bottom w:val="single" w:color="D5DCE6" w:sz="4"/>
-              <w:right w:val="single" w:color="D5DCE6" w:sz="4"/>
-            </w:tcBorders>
-            <w:shd w:fill="FFFFFF" w:color="auto" w:val="clear"/>
-            <w:tcMar>
-              <w:top w:type="dxa" w:w="50"/>
-              <w:left w:type="dxa" w:w="100"/>
-              <w:bottom w:type="dxa" w:w="50"/>
-              <w:right w:type="dxa" w:w="100"/>
-            </w:tcMar>
-          </w:tcPr>
-          <w:p>
-            <w:pPr>
-              <w:spacing w:before="0" w:after="0" w:line="240"/>
-            </w:pPr>
-            <w:r>
-              <w:rPr>
-                <w:rFonts w:ascii="Calibri" w:cs="Calibri" w:eastAsia="Calibri" w:hAnsi="Calibri"/>
-                <w:sz w:val="19"/>
-                <w:szCs w:val="19"/>
-              </w:rPr>
-              <w:t xml:space="preserve">What is broken or needed, why it matters, the full scope and how you confirmed it</w:t>
-            </w:r>
-          </w:p>
-        </w:tc>
-      </w:tr>
-      <w:tr>
-        <w:trPr>
-          <w:cantSplit/>
-        </w:trPr>
-        <w:tc>
-          <w:tcPr>
-            <w:tcW w:type="dxa" w:w="3600"/>
-            <w:tcBorders>
-              <w:top w:val="single" w:color="D5DCE6" w:sz="4"/>
-              <w:left w:val="single" w:color="D5DCE6" w:sz="4"/>
-              <w:bottom w:val="single" w:color="D5DCE6" w:sz="4"/>
-              <w:right w:val="single" w:color="D5DCE6" w:sz="4"/>
-            </w:tcBorders>
-            <w:shd w:fill="F4F6FA" w:color="auto" w:val="clear"/>
-            <w:tcMar>
-              <w:top w:type="dxa" w:w="50"/>
-              <w:left w:type="dxa" w:w="100"/>
-              <w:bottom w:type="dxa" w:w="50"/>
-              <w:right w:type="dxa" w:w="100"/>
-            </w:tcMar>
-          </w:tcPr>
-          <w:p>
-            <w:pPr>
-              <w:spacing w:before="0" w:after="0" w:line="240"/>
-            </w:pPr>
-            <w:r>
-              <w:rPr>
-                <w:rFonts w:ascii="Calibri" w:cs="Calibri" w:eastAsia="Calibri" w:hAnsi="Calibri"/>
-                <w:sz w:val="19"/>
-                <w:szCs w:val="19"/>
-              </w:rPr>
-              <w:t xml:space="preserve">Design / fix approach (fields 5, 9)</w:t>
-            </w:r>
-          </w:p>
-        </w:tc>
-        <w:tc>
-          <w:tcPr>
-            <w:tcW w:type="dxa" w:w="900"/>
-            <w:tcBorders>
-              <w:top w:val="single" w:color="D5DCE6" w:sz="4"/>
-              <w:left w:val="single" w:color="D5DCE6" w:sz="4"/>
-              <w:bottom w:val="single" w:color="D5DCE6" w:sz="4"/>
-              <w:right w:val="single" w:color="D5DCE6" w:sz="4"/>
-            </w:tcBorders>
-            <w:shd w:fill="F4F6FA" w:color="auto" w:val="clear"/>
-            <w:tcMar>
-              <w:top w:type="dxa" w:w="50"/>
-              <w:left w:type="dxa" w:w="100"/>
-              <w:bottom w:type="dxa" w:w="50"/>
-              <w:right w:type="dxa" w:w="100"/>
-            </w:tcMar>
-          </w:tcPr>
-          <w:p>
-            <w:pPr>
-              <w:spacing w:before="0" w:after="0" w:line="240"/>
-            </w:pPr>
-            <w:r>
-              <w:rPr>
-                <w:rFonts w:ascii="Calibri" w:cs="Calibri" w:eastAsia="Calibri" w:hAnsi="Calibri"/>
-                <w:sz w:val="19"/>
-                <w:szCs w:val="19"/>
-              </w:rPr>
-              <w:t xml:space="preserve">15%</w:t>
-            </w:r>
-          </w:p>
-        </w:tc>
-        <w:tc>
-          <w:tcPr>
-            <w:tcW w:type="dxa" w:w="5580"/>
-            <w:tcBorders>
-              <w:top w:val="single" w:color="D5DCE6" w:sz="4"/>
-              <w:left w:val="single" w:color="D5DCE6" w:sz="4"/>
-              <w:bottom w:val="single" w:color="D5DCE6" w:sz="4"/>
-              <w:right w:val="single" w:color="D5DCE6" w:sz="4"/>
-            </w:tcBorders>
-            <w:shd w:fill="F4F6FA" w:color="auto" w:val="clear"/>
-            <w:tcMar>
-              <w:top w:type="dxa" w:w="50"/>
-              <w:left w:type="dxa" w:w="100"/>
-              <w:bottom w:type="dxa" w:w="50"/>
-              <w:right w:type="dxa" w:w="100"/>
-            </w:tcMar>
-          </w:tcPr>
-          <w:p>
-            <w:pPr>
-              <w:spacing w:before="0" w:after="0" w:line="240"/>
-            </w:pPr>
-            <w:r>
-              <w:rPr>
-                <w:rFonts w:ascii="Calibri" w:cs="Calibri" w:eastAsia="Calibri" w:hAnsi="Calibri"/>
-                <w:sz w:val="19"/>
-                <w:szCs w:val="19"/>
-              </w:rPr>
-              <w:t xml:space="preserve">The target design is right and the order of work is justified</w:t>
-            </w:r>
-          </w:p>
-        </w:tc>
-      </w:tr>
-      <w:tr>
-        <w:trPr>
-          <w:cantSplit/>
-        </w:trPr>
-        <w:tc>
-          <w:tcPr>
-            <w:tcW w:type="dxa" w:w="3600"/>
-            <w:tcBorders>
-              <w:top w:val="single" w:color="D5DCE6" w:sz="4"/>
-              <w:left w:val="single" w:color="D5DCE6" w:sz="4"/>
-              <w:bottom w:val="single" w:color="D5DCE6" w:sz="4"/>
-              <w:right w:val="single" w:color="D5DCE6" w:sz="4"/>
-            </w:tcBorders>
-            <w:shd w:fill="FFFFFF" w:color="auto" w:val="clear"/>
-            <w:tcMar>
-              <w:top w:type="dxa" w:w="50"/>
-              <w:left w:type="dxa" w:w="100"/>
-              <w:bottom w:type="dxa" w:w="50"/>
-              <w:right w:type="dxa" w:w="100"/>
-            </w:tcMar>
-          </w:tcPr>
-          <w:p>
-            <w:pPr>
-              <w:spacing w:before="0" w:after="0" w:line="240"/>
-            </w:pPr>
-            <w:r>
-              <w:rPr>
-                <w:rFonts w:ascii="Calibri" w:cs="Calibri" w:eastAsia="Calibri" w:hAnsi="Calibri"/>
-                <w:sz w:val="19"/>
-                <w:szCs w:val="19"/>
-              </w:rPr>
-              <w:t xml:space="preserve">Build accuracy (field 11)</w:t>
-            </w:r>
-          </w:p>
-        </w:tc>
-        <w:tc>
-          <w:tcPr>
-            <w:tcW w:type="dxa" w:w="900"/>
-            <w:tcBorders>
-              <w:top w:val="single" w:color="D5DCE6" w:sz="4"/>
-              <w:left w:val="single" w:color="D5DCE6" w:sz="4"/>
-              <w:bottom w:val="single" w:color="D5DCE6" w:sz="4"/>
-              <w:right w:val="single" w:color="D5DCE6" w:sz="4"/>
-            </w:tcBorders>
-            <w:shd w:fill="FFFFFF" w:color="auto" w:val="clear"/>
-            <w:tcMar>
-              <w:top w:type="dxa" w:w="50"/>
-              <w:left w:type="dxa" w:w="100"/>
-              <w:bottom w:type="dxa" w:w="50"/>
-              <w:right w:type="dxa" w:w="100"/>
-            </w:tcMar>
-          </w:tcPr>
-          <w:p>
-            <w:pPr>
-              <w:spacing w:before="0" w:after="0" w:line="240"/>
-            </w:pPr>
-            <w:r>
-              <w:rPr>
-                <w:rFonts w:ascii="Calibri" w:cs="Calibri" w:eastAsia="Calibri" w:hAnsi="Calibri"/>
-                <w:sz w:val="19"/>
-                <w:szCs w:val="19"/>
-              </w:rPr>
-              <w:t xml:space="preserve">20%</w:t>
-            </w:r>
-          </w:p>
-        </w:tc>
-        <w:tc>
-          <w:tcPr>
-            <w:tcW w:type="dxa" w:w="5580"/>
-            <w:tcBorders>
-              <w:top w:val="single" w:color="D5DCE6" w:sz="4"/>
-              <w:left w:val="single" w:color="D5DCE6" w:sz="4"/>
-              <w:bottom w:val="single" w:color="D5DCE6" w:sz="4"/>
-              <w:right w:val="single" w:color="D5DCE6" w:sz="4"/>
-            </w:tcBorders>
-            <w:shd w:fill="FFFFFF" w:color="auto" w:val="clear"/>
-            <w:tcMar>
-              <w:top w:type="dxa" w:w="50"/>
-              <w:left w:type="dxa" w:w="100"/>
-              <w:bottom w:type="dxa" w:w="50"/>
-              <w:right w:type="dxa" w:w="100"/>
-            </w:tcMar>
-          </w:tcPr>
-          <w:p>
-            <w:pPr>
-              <w:spacing w:before="0" w:after="0" w:line="240"/>
-            </w:pPr>
-            <w:r>
-              <w:rPr>
-                <w:rFonts w:ascii="Calibri" w:cs="Calibri" w:eastAsia="Calibri" w:hAnsi="Calibri"/>
-                <w:sz w:val="19"/>
-                <w:szCs w:val="19"/>
-              </w:rPr>
-              <w:t xml:space="preserve">Every part built correctly in your own ZZ_TRAIN_ copy</w:t>
-            </w:r>
-          </w:p>
-        </w:tc>
-      </w:tr>
-      <w:tr>
-        <w:trPr>
-          <w:cantSplit/>
-        </w:trPr>
-        <w:tc>
-          <w:tcPr>
-            <w:tcW w:type="dxa" w:w="3600"/>
-            <w:tcBorders>
-              <w:top w:val="single" w:color="D5DCE6" w:sz="4"/>
-              <w:left w:val="single" w:color="D5DCE6" w:sz="4"/>
-              <w:bottom w:val="single" w:color="D5DCE6" w:sz="4"/>
-              <w:right w:val="single" w:color="D5DCE6" w:sz="4"/>
-            </w:tcBorders>
-            <w:shd w:fill="F4F6FA" w:color="auto" w:val="clear"/>
-            <w:tcMar>
-              <w:top w:type="dxa" w:w="50"/>
-              <w:left w:type="dxa" w:w="100"/>
-              <w:bottom w:type="dxa" w:w="50"/>
-              <w:right w:type="dxa" w:w="100"/>
-            </w:tcMar>
-          </w:tcPr>
-          <w:p>
-            <w:pPr>
-              <w:spacing w:before="0" w:after="0" w:line="240"/>
-            </w:pPr>
-            <w:r>
-              <w:rPr>
-                <w:rFonts w:ascii="Calibri" w:cs="Calibri" w:eastAsia="Calibri" w:hAnsi="Calibri"/>
-                <w:sz w:val="19"/>
-                <w:szCs w:val="19"/>
-              </w:rPr>
-              <w:t xml:space="preserve">Verification evidence (fields 10, 12)</w:t>
-            </w:r>
-          </w:p>
-        </w:tc>
-        <w:tc>
-          <w:tcPr>
-            <w:tcW w:type="dxa" w:w="900"/>
-            <w:tcBorders>
-              <w:top w:val="single" w:color="D5DCE6" w:sz="4"/>
-              <w:left w:val="single" w:color="D5DCE6" w:sz="4"/>
-              <w:bottom w:val="single" w:color="D5DCE6" w:sz="4"/>
-              <w:right w:val="single" w:color="D5DCE6" w:sz="4"/>
-            </w:tcBorders>
-            <w:shd w:fill="F4F6FA" w:color="auto" w:val="clear"/>
-            <w:tcMar>
-              <w:top w:type="dxa" w:w="50"/>
-              <w:left w:type="dxa" w:w="100"/>
-              <w:bottom w:type="dxa" w:w="50"/>
-              <w:right w:type="dxa" w:w="100"/>
-            </w:tcMar>
-          </w:tcPr>
-          <w:p>
-            <w:pPr>
-              <w:spacing w:before="0" w:after="0" w:line="240"/>
-            </w:pPr>
-            <w:r>
-              <w:rPr>
-                <w:rFonts w:ascii="Calibri" w:cs="Calibri" w:eastAsia="Calibri" w:hAnsi="Calibri"/>
-                <w:sz w:val="19"/>
-                <w:szCs w:val="19"/>
-              </w:rPr>
-              <w:t xml:space="preserve">15%</w:t>
-            </w:r>
-          </w:p>
-        </w:tc>
-        <w:tc>
-          <w:tcPr>
-            <w:tcW w:type="dxa" w:w="5580"/>
-            <w:tcBorders>
-              <w:top w:val="single" w:color="D5DCE6" w:sz="4"/>
-              <w:left w:val="single" w:color="D5DCE6" w:sz="4"/>
-              <w:bottom w:val="single" w:color="D5DCE6" w:sz="4"/>
-              <w:right w:val="single" w:color="D5DCE6" w:sz="4"/>
-            </w:tcBorders>
-            <w:shd w:fill="F4F6FA" w:color="auto" w:val="clear"/>
-            <w:tcMar>
-              <w:top w:type="dxa" w:w="50"/>
-              <w:left w:type="dxa" w:w="100"/>
-              <w:bottom w:type="dxa" w:w="50"/>
-              <w:right w:type="dxa" w:w="100"/>
-            </w:tcMar>
-          </w:tcPr>
-          <w:p>
-            <w:pPr>
-              <w:spacing w:before="0" w:after="0" w:line="240"/>
-            </w:pPr>
-            <w:r>
-              <w:rPr>
-                <w:rFonts w:ascii="Calibri" w:cs="Calibri" w:eastAsia="Calibri" w:hAnsi="Calibri"/>
-                <w:sz w:val="19"/>
-                <w:szCs w:val="19"/>
-              </w:rPr>
-              <w:t xml:space="preserve">A capture for every part proves it works, including the negative test</w:t>
-            </w:r>
-          </w:p>
-        </w:tc>
-      </w:tr>
-      <w:tr>
-        <w:trPr>
-          <w:cantSplit/>
-        </w:trPr>
-        <w:tc>
-          <w:tcPr>
-            <w:tcW w:type="dxa" w:w="3600"/>
-            <w:tcBorders>
-              <w:top w:val="single" w:color="D5DCE6" w:sz="4"/>
-              <w:left w:val="single" w:color="D5DCE6" w:sz="4"/>
-              <w:bottom w:val="single" w:color="D5DCE6" w:sz="4"/>
-              <w:right w:val="single" w:color="D5DCE6" w:sz="4"/>
-            </w:tcBorders>
-            <w:shd w:fill="FFFFFF" w:color="auto" w:val="clear"/>
-            <w:tcMar>
-              <w:top w:type="dxa" w:w="50"/>
-              <w:left w:type="dxa" w:w="100"/>
-              <w:bottom w:type="dxa" w:w="50"/>
-              <w:right w:type="dxa" w:w="100"/>
-            </w:tcMar>
-          </w:tcPr>
-          <w:p>
-            <w:pPr>
-              <w:spacing w:before="0" w:after="0" w:line="240"/>
-            </w:pPr>
-            <w:r>
-              <w:rPr>
-                <w:rFonts w:ascii="Calibri" w:cs="Calibri" w:eastAsia="Calibri" w:hAnsi="Calibri"/>
-                <w:sz w:val="19"/>
-                <w:szCs w:val="19"/>
-              </w:rPr>
-              <w:t xml:space="preserve">Write-up quality (field 13)</w:t>
-            </w:r>
-          </w:p>
-        </w:tc>
-        <w:tc>
-          <w:tcPr>
-            <w:tcW w:type="dxa" w:w="900"/>
-            <w:tcBorders>
-              <w:top w:val="single" w:color="D5DCE6" w:sz="4"/>
-              <w:left w:val="single" w:color="D5DCE6" w:sz="4"/>
-              <w:bottom w:val="single" w:color="D5DCE6" w:sz="4"/>
-              <w:right w:val="single" w:color="D5DCE6" w:sz="4"/>
-            </w:tcBorders>
-            <w:shd w:fill="FFFFFF" w:color="auto" w:val="clear"/>
-            <w:tcMar>
-              <w:top w:type="dxa" w:w="50"/>
-              <w:left w:type="dxa" w:w="100"/>
-              <w:bottom w:type="dxa" w:w="50"/>
-              <w:right w:type="dxa" w:w="100"/>
-            </w:tcMar>
-          </w:tcPr>
-          <w:p>
-            <w:pPr>
-              <w:spacing w:before="0" w:after="0" w:line="240"/>
-            </w:pPr>
-            <w:r>
-              <w:rPr>
-                <w:rFonts w:ascii="Calibri" w:cs="Calibri" w:eastAsia="Calibri" w:hAnsi="Calibri"/>
-                <w:sz w:val="19"/>
-                <w:szCs w:val="19"/>
-              </w:rPr>
-              <w:t xml:space="preserve">15%</w:t>
-            </w:r>
-          </w:p>
-        </w:tc>
-        <w:tc>
-          <w:tcPr>
-            <w:tcW w:type="dxa" w:w="5580"/>
-            <w:tcBorders>
-              <w:top w:val="single" w:color="D5DCE6" w:sz="4"/>
-              <w:left w:val="single" w:color="D5DCE6" w:sz="4"/>
-              <w:bottom w:val="single" w:color="D5DCE6" w:sz="4"/>
-              <w:right w:val="single" w:color="D5DCE6" w:sz="4"/>
-            </w:tcBorders>
-            <w:shd w:fill="FFFFFF" w:color="auto" w:val="clear"/>
-            <w:tcMar>
-              <w:top w:type="dxa" w:w="50"/>
-              <w:left w:type="dxa" w:w="100"/>
-              <w:bottom w:type="dxa" w:w="50"/>
-              <w:right w:type="dxa" w:w="100"/>
-            </w:tcMar>
-          </w:tcPr>
-          <w:p>
-            <w:pPr>
-              <w:spacing w:before="0" w:after="0" w:line="240"/>
-            </w:pPr>
-            <w:r>
-              <w:rPr>
-                <w:rFonts w:ascii="Calibri" w:cs="Calibri" w:eastAsia="Calibri" w:hAnsi="Calibri"/>
-                <w:sz w:val="19"/>
-                <w:szCs w:val="19"/>
-              </w:rPr>
-              <w:t xml:space="preserve">Your own words: what you did, how you proved it, what remains</w:t>
-            </w:r>
-          </w:p>
-        </w:tc>
-      </w:tr>
-      <w:tr>
-        <w:trPr>
-          <w:cantSplit/>
-        </w:trPr>
-        <w:tc>
-          <w:tcPr>
-            <w:tcW w:type="dxa" w:w="3600"/>
-            <w:tcBorders>
-              <w:top w:val="single" w:color="D5DCE6" w:sz="4"/>
-              <w:left w:val="single" w:color="D5DCE6" w:sz="4"/>
-              <w:bottom w:val="single" w:color="D5DCE6" w:sz="4"/>
-              <w:right w:val="single" w:color="D5DCE6" w:sz="4"/>
-            </w:tcBorders>
-            <w:shd w:fill="F4F6FA" w:color="auto" w:val="clear"/>
-            <w:tcMar>
-              <w:top w:type="dxa" w:w="50"/>
-              <w:left w:type="dxa" w:w="100"/>
-              <w:bottom w:type="dxa" w:w="50"/>
-              <w:right w:type="dxa" w:w="100"/>
-            </w:tcMar>
-          </w:tcPr>
-          <w:p>
-            <w:pPr>
-              <w:spacing w:before="0" w:after="0" w:line="240"/>
-            </w:pPr>
-            <w:r>
-              <w:rPr>
-                <w:rFonts w:ascii="Calibri" w:cs="Calibri" w:eastAsia="Calibri" w:hAnsi="Calibri"/>
-                <w:sz w:val="19"/>
-                <w:szCs w:val="19"/>
-              </w:rPr>
-              <w:t xml:space="preserve">Stakeholder communication (fields 14–15, panel)</w:t>
-            </w:r>
-          </w:p>
-        </w:tc>
-        <w:tc>
-          <w:tcPr>
-            <w:tcW w:type="dxa" w:w="900"/>
-            <w:tcBorders>
-              <w:top w:val="single" w:color="D5DCE6" w:sz="4"/>
-              <w:left w:val="single" w:color="D5DCE6" w:sz="4"/>
-              <w:bottom w:val="single" w:color="D5DCE6" w:sz="4"/>
-              <w:right w:val="single" w:color="D5DCE6" w:sz="4"/>
-            </w:tcBorders>
-            <w:shd w:fill="F4F6FA" w:color="auto" w:val="clear"/>
-            <w:tcMar>
-              <w:top w:type="dxa" w:w="50"/>
-              <w:left w:type="dxa" w:w="100"/>
-              <w:bottom w:type="dxa" w:w="50"/>
-              <w:right w:type="dxa" w:w="100"/>
-            </w:tcMar>
-          </w:tcPr>
-          <w:p>
-            <w:pPr>
-              <w:spacing w:before="0" w:after="0" w:line="240"/>
-            </w:pPr>
-            <w:r>
-              <w:rPr>
-                <w:rFonts w:ascii="Calibri" w:cs="Calibri" w:eastAsia="Calibri" w:hAnsi="Calibri"/>
-                <w:sz w:val="19"/>
-                <w:szCs w:val="19"/>
-              </w:rPr>
-              <w:t xml:space="preserve">15%</w:t>
-            </w:r>
-          </w:p>
-        </w:tc>
-        <w:tc>
-          <w:tcPr>
-            <w:tcW w:type="dxa" w:w="5580"/>
-            <w:tcBorders>
-              <w:top w:val="single" w:color="D5DCE6" w:sz="4"/>
-              <w:left w:val="single" w:color="D5DCE6" w:sz="4"/>
-              <w:bottom w:val="single" w:color="D5DCE6" w:sz="4"/>
-              <w:right w:val="single" w:color="D5DCE6" w:sz="4"/>
-            </w:tcBorders>
-            <w:shd w:fill="F4F6FA" w:color="auto" w:val="clear"/>
-            <w:tcMar>
-              <w:top w:type="dxa" w:w="50"/>
-              <w:left w:type="dxa" w:w="100"/>
-              <w:bottom w:type="dxa" w:w="50"/>
-              <w:right w:type="dxa" w:w="100"/>
-            </w:tcMar>
-          </w:tcPr>
-          <w:p>
-            <w:pPr>
-              <w:spacing w:before="0" w:after="0" w:line="240"/>
-            </w:pPr>
-            <w:r>
-              <w:rPr>
-                <w:rFonts w:ascii="Calibri" w:cs="Calibri" w:eastAsia="Calibri" w:hAnsi="Calibri"/>
-                <w:sz w:val="19"/>
-                <w:szCs w:val="19"/>
-              </w:rPr>
-              <w:t xml:space="preserve">You answer the pushback without giving up a correct position, in plain language</w:t>
-            </w:r>
-          </w:p>
-        </w:tc>
-      </w:tr>
-    </w:tbl>
-    <w:p>
-      <w:pPr>
-        <w:spacing w:before="0" w:after="60" w:line="240"/>
-      </w:pPr>
-      <w:r>
-        <w:rPr>
-          <w:rFonts w:ascii="Calibri" w:cs="Calibri" w:eastAsia="Calibri" w:hAnsi="Calibri"/>
-          <w:sz w:val="21"/>
-          <w:szCs w:val="21"/>
-        </w:rPr>
-        <w:t xml:space="preserve"/>
-      </w:r>
-    </w:p>
-    <w:p>
-      <w:pPr>
-        <w:spacing w:before="0" w:after="80" w:line="240"/>
-      </w:pPr>
-      <w:r>
-        <w:rPr>
-          <w:rFonts w:ascii="Calibri" w:cs="Calibri" w:eastAsia="Calibri" w:hAnsi="Calibri"/>
-          <w:b/>
-          <w:bCs/>
-          <w:sz w:val="21"/>
-          <w:szCs w:val="21"/>
-        </w:rPr>
-        <w:t xml:space="preserve">Stakeholder panels</w:t>
-      </w:r>
-      <w:r>
-        <w:rPr>
-          <w:rFonts w:ascii="Calibri" w:cs="Calibri" w:eastAsia="Calibri" w:hAnsi="Calibri"/>
-          <w:sz w:val="21"/>
-          <w:szCs w:val="21"/>
-        </w:rPr>
-        <w:t xml:space="preserve"> (Intermediate session 16, Advanced session 12) are marked on the same rubric. Present one piece of your work to an auditor, a developer and a business owner, 3 minutes each plus one question. If your conclusion changes between audiences, the panel is marked resubmit. Full preparation steps are in the </w:t>
-      </w:r>
-      <w:r>
-        <w:rPr>
-          <w:rFonts w:ascii="Calibri" w:cs="Calibri" w:eastAsia="Calibri" w:hAnsi="Calibri"/>
-          <w:b/>
-          <w:bCs/>
-          <w:sz w:val="21"/>
-          <w:szCs w:val="21"/>
-        </w:rPr>
-        <w:t xml:space="preserve">Stakeholder Panel Brief</w:t>
-      </w:r>
-      <w:r>
-        <w:rPr>
-          <w:rFonts w:ascii="Calibri" w:cs="Calibri" w:eastAsia="Calibri" w:hAnsi="Calibri"/>
-          <w:sz w:val="21"/>
-          <w:szCs w:val="21"/>
-        </w:rPr>
-        <w:t xml:space="preserve">.</w:t>
+        <w:t xml:space="preserve">Submit your Field 13 write-up and the capture from every part of the lab. Work built outside your ZZ_TRAIN_ namespace, with no verification evidence, or with a write-up copied from the model is returned for resubmission. Resubmissions are due one week after return. A piece passes at 60 or above, with no rubric line below 40.</w:t>
       </w:r>
     </w:p>
     <w:tbl>

</xml_diff>

<commit_message>
Course 2 User Guide: no graded work; certificate = all labs completed; review-and-close sessions
Co-Authored-By: Claude Opus 5.5 <noreply@anthropic.com>
Claude-Session: https://claude.ai/code/session_018fWq9UNCNi5rGqwUiTA1Zk
</commit_message>
<xml_diff>
--- a/materials/00-start-here/GRC-Trainee-User-Guide-Start-to-Finish.docx
+++ b/materials/00-start-here/GRC-Trainee-User-Guide-Start-to-Finish.docx
@@ -1028,7 +1028,7 @@
                 <w:sz w:val="19"/>
                 <w:szCs w:val="19"/>
               </w:rPr>
-              <w:t xml:space="preserve">All 12 modules marked complete, then the Foundations check in session 1</w:t>
+              <w:t xml:space="preserve">All 12 modules marked complete before session 1</w:t>
             </w:r>
           </w:p>
         </w:tc>
@@ -1162,7 +1162,7 @@
                 <w:sz w:val="19"/>
                 <w:szCs w:val="19"/>
               </w:rPr>
-              <w:t xml:space="preserve">4  Marked builds</w:t>
+              <w:t xml:space="preserve">4  Intermediate review</w:t>
             </w:r>
           </w:p>
         </w:tc>
@@ -1193,7 +1193,7 @@
                 <w:sz w:val="19"/>
                 <w:szCs w:val="19"/>
               </w:rPr>
-              <w:t xml:space="preserve">Labs B1 (S3), B3 (S9), B10 (S12)</w:t>
+              <w:t xml:space="preserve">Session 16 — review and close</w:t>
             </w:r>
           </w:p>
         </w:tc>
@@ -1224,7 +1224,7 @@
                 <w:sz w:val="19"/>
                 <w:szCs w:val="19"/>
               </w:rPr>
-              <w:t xml:space="preserve">All three passed</w:t>
+              <w:t xml:space="preserve">All 18 labs complete → Intermediate certificate</w:t>
             </w:r>
           </w:p>
         </w:tc>
@@ -1260,7 +1260,7 @@
                 <w:sz w:val="19"/>
                 <w:szCs w:val="19"/>
               </w:rPr>
-              <w:t xml:space="preserve">5  Intermediate panel</w:t>
+              <w:t xml:space="preserve">6  Advanced</w:t>
             </w:r>
           </w:p>
         </w:tc>
@@ -1291,7 +1291,7 @@
                 <w:sz w:val="19"/>
                 <w:szCs w:val="19"/>
               </w:rPr>
-              <w:t xml:space="preserve">Session 16 — stakeholder panel</w:t>
+              <w:t xml:space="preserve">By session → Advanced · 12 sessions (11 live labs, 7 self-study)</w:t>
             </w:r>
           </w:p>
         </w:tc>
@@ -1322,7 +1322,7 @@
                 <w:sz w:val="19"/>
                 <w:szCs w:val="19"/>
               </w:rPr>
-              <w:t xml:space="preserve">Panel passed → Intermediate certificate</w:t>
+              <w:t xml:space="preserve">All 18 labs marked complete</w:t>
             </w:r>
           </w:p>
         </w:tc>
@@ -1358,7 +1358,7 @@
                 <w:sz w:val="19"/>
                 <w:szCs w:val="19"/>
               </w:rPr>
-              <w:t xml:space="preserve">6  Advanced</w:t>
+              <w:t xml:space="preserve">6  Advanced review</w:t>
             </w:r>
           </w:p>
         </w:tc>
@@ -1389,7 +1389,7 @@
                 <w:sz w:val="19"/>
                 <w:szCs w:val="19"/>
               </w:rPr>
-              <w:t xml:space="preserve">By session → Advanced · 12 sessions (11 live labs, 7 self-study)</w:t>
+              <w:t xml:space="preserve">Session 12 — review and close</w:t>
             </w:r>
           </w:p>
         </w:tc>
@@ -1420,203 +1420,7 @@
                 <w:sz w:val="19"/>
                 <w:szCs w:val="19"/>
               </w:rPr>
-              <w:t xml:space="preserve">All 18 labs marked complete</w:t>
-            </w:r>
-          </w:p>
-        </w:tc>
-      </w:tr>
-      <w:tr>
-        <w:trPr>
-          <w:cantSplit/>
-        </w:trPr>
-        <w:tc>
-          <w:tcPr>
-            <w:tcW w:type="dxa" w:w="2300"/>
-            <w:tcBorders>
-              <w:top w:val="single" w:color="D5DCE6" w:sz="4"/>
-              <w:left w:val="single" w:color="D5DCE6" w:sz="4"/>
-              <w:bottom w:val="single" w:color="D5DCE6" w:sz="4"/>
-              <w:right w:val="single" w:color="D5DCE6" w:sz="4"/>
-            </w:tcBorders>
-            <w:shd w:fill="FFFFFF" w:color="auto" w:val="clear"/>
-            <w:tcMar>
-              <w:top w:type="dxa" w:w="50"/>
-              <w:left w:type="dxa" w:w="100"/>
-              <w:bottom w:type="dxa" w:w="50"/>
-              <w:right w:type="dxa" w:w="100"/>
-            </w:tcMar>
-          </w:tcPr>
-          <w:p>
-            <w:pPr>
-              <w:spacing w:before="0" w:after="0" w:line="240"/>
-            </w:pPr>
-            <w:r>
-              <w:rPr>
-                <w:rFonts w:ascii="Calibri" w:cs="Calibri" w:eastAsia="Calibri" w:hAnsi="Calibri"/>
-                <w:sz w:val="19"/>
-                <w:szCs w:val="19"/>
-              </w:rPr>
-              <w:t xml:space="preserve">7  Marked deliverables</w:t>
-            </w:r>
-          </w:p>
-        </w:tc>
-        <w:tc>
-          <w:tcPr>
-            <w:tcW w:type="dxa" w:w="4380"/>
-            <w:tcBorders>
-              <w:top w:val="single" w:color="D5DCE6" w:sz="4"/>
-              <w:left w:val="single" w:color="D5DCE6" w:sz="4"/>
-              <w:bottom w:val="single" w:color="D5DCE6" w:sz="4"/>
-              <w:right w:val="single" w:color="D5DCE6" w:sz="4"/>
-            </w:tcBorders>
-            <w:shd w:fill="FFFFFF" w:color="auto" w:val="clear"/>
-            <w:tcMar>
-              <w:top w:type="dxa" w:w="50"/>
-              <w:left w:type="dxa" w:w="100"/>
-              <w:bottom w:type="dxa" w:w="50"/>
-              <w:right w:type="dxa" w:w="100"/>
-            </w:tcMar>
-          </w:tcPr>
-          <w:p>
-            <w:pPr>
-              <w:spacing w:before="0" w:after="0" w:line="240"/>
-            </w:pPr>
-            <w:r>
-              <w:rPr>
-                <w:rFonts w:ascii="Calibri" w:cs="Calibri" w:eastAsia="Calibri" w:hAnsi="Calibri"/>
-                <w:sz w:val="19"/>
-                <w:szCs w:val="19"/>
-              </w:rPr>
-              <w:t xml:space="preserve">Labs B12 (S6), C12 (S10), D7 (S11)</w:t>
-            </w:r>
-          </w:p>
-        </w:tc>
-        <w:tc>
-          <w:tcPr>
-            <w:tcW w:type="dxa" w:w="3400"/>
-            <w:tcBorders>
-              <w:top w:val="single" w:color="D5DCE6" w:sz="4"/>
-              <w:left w:val="single" w:color="D5DCE6" w:sz="4"/>
-              <w:bottom w:val="single" w:color="D5DCE6" w:sz="4"/>
-              <w:right w:val="single" w:color="D5DCE6" w:sz="4"/>
-            </w:tcBorders>
-            <w:shd w:fill="FFFFFF" w:color="auto" w:val="clear"/>
-            <w:tcMar>
-              <w:top w:type="dxa" w:w="50"/>
-              <w:left w:type="dxa" w:w="100"/>
-              <w:bottom w:type="dxa" w:w="50"/>
-              <w:right w:type="dxa" w:w="100"/>
-            </w:tcMar>
-          </w:tcPr>
-          <w:p>
-            <w:pPr>
-              <w:spacing w:before="0" w:after="0" w:line="240"/>
-            </w:pPr>
-            <w:r>
-              <w:rPr>
-                <w:rFonts w:ascii="Calibri" w:cs="Calibri" w:eastAsia="Calibri" w:hAnsi="Calibri"/>
-                <w:sz w:val="19"/>
-                <w:szCs w:val="19"/>
-              </w:rPr>
-              <w:t xml:space="preserve">All three passed</w:t>
-            </w:r>
-          </w:p>
-        </w:tc>
-      </w:tr>
-      <w:tr>
-        <w:trPr>
-          <w:cantSplit/>
-        </w:trPr>
-        <w:tc>
-          <w:tcPr>
-            <w:tcW w:type="dxa" w:w="2300"/>
-            <w:tcBorders>
-              <w:top w:val="single" w:color="D5DCE6" w:sz="4"/>
-              <w:left w:val="single" w:color="D5DCE6" w:sz="4"/>
-              <w:bottom w:val="single" w:color="D5DCE6" w:sz="4"/>
-              <w:right w:val="single" w:color="D5DCE6" w:sz="4"/>
-            </w:tcBorders>
-            <w:shd w:fill="F4F6FA" w:color="auto" w:val="clear"/>
-            <w:tcMar>
-              <w:top w:type="dxa" w:w="50"/>
-              <w:left w:type="dxa" w:w="100"/>
-              <w:bottom w:type="dxa" w:w="50"/>
-              <w:right w:type="dxa" w:w="100"/>
-            </w:tcMar>
-          </w:tcPr>
-          <w:p>
-            <w:pPr>
-              <w:spacing w:before="0" w:after="0" w:line="240"/>
-            </w:pPr>
-            <w:r>
-              <w:rPr>
-                <w:rFonts w:ascii="Calibri" w:cs="Calibri" w:eastAsia="Calibri" w:hAnsi="Calibri"/>
-                <w:sz w:val="19"/>
-                <w:szCs w:val="19"/>
-              </w:rPr>
-              <w:t xml:space="preserve">8  Advanced panel</w:t>
-            </w:r>
-          </w:p>
-        </w:tc>
-        <w:tc>
-          <w:tcPr>
-            <w:tcW w:type="dxa" w:w="4380"/>
-            <w:tcBorders>
-              <w:top w:val="single" w:color="D5DCE6" w:sz="4"/>
-              <w:left w:val="single" w:color="D5DCE6" w:sz="4"/>
-              <w:bottom w:val="single" w:color="D5DCE6" w:sz="4"/>
-              <w:right w:val="single" w:color="D5DCE6" w:sz="4"/>
-            </w:tcBorders>
-            <w:shd w:fill="F4F6FA" w:color="auto" w:val="clear"/>
-            <w:tcMar>
-              <w:top w:type="dxa" w:w="50"/>
-              <w:left w:type="dxa" w:w="100"/>
-              <w:bottom w:type="dxa" w:w="50"/>
-              <w:right w:type="dxa" w:w="100"/>
-            </w:tcMar>
-          </w:tcPr>
-          <w:p>
-            <w:pPr>
-              <w:spacing w:before="0" w:after="0" w:line="240"/>
-            </w:pPr>
-            <w:r>
-              <w:rPr>
-                <w:rFonts w:ascii="Calibri" w:cs="Calibri" w:eastAsia="Calibri" w:hAnsi="Calibri"/>
-                <w:sz w:val="19"/>
-                <w:szCs w:val="19"/>
-              </w:rPr>
-              <w:t xml:space="preserve">Session 12 — stakeholder panel</w:t>
-            </w:r>
-          </w:p>
-        </w:tc>
-        <w:tc>
-          <w:tcPr>
-            <w:tcW w:type="dxa" w:w="3400"/>
-            <w:tcBorders>
-              <w:top w:val="single" w:color="D5DCE6" w:sz="4"/>
-              <w:left w:val="single" w:color="D5DCE6" w:sz="4"/>
-              <w:bottom w:val="single" w:color="D5DCE6" w:sz="4"/>
-              <w:right w:val="single" w:color="D5DCE6" w:sz="4"/>
-            </w:tcBorders>
-            <w:shd w:fill="F4F6FA" w:color="auto" w:val="clear"/>
-            <w:tcMar>
-              <w:top w:type="dxa" w:w="50"/>
-              <w:left w:type="dxa" w:w="100"/>
-              <w:bottom w:type="dxa" w:w="50"/>
-              <w:right w:type="dxa" w:w="100"/>
-            </w:tcMar>
-          </w:tcPr>
-          <w:p>
-            <w:pPr>
-              <w:spacing w:before="0" w:after="0" w:line="240"/>
-            </w:pPr>
-            <w:r>
-              <w:rPr>
-                <w:rFonts w:ascii="Calibri" w:cs="Calibri" w:eastAsia="Calibri" w:hAnsi="Calibri"/>
-                <w:sz w:val="19"/>
-                <w:szCs w:val="19"/>
-              </w:rPr>
-              <w:t xml:space="preserve">Panel passed → Advanced certificate</w:t>
+              <w:t xml:space="preserve">All 18 labs complete → Advanced certificate</w:t>
             </w:r>
           </w:p>
         </w:tc>
@@ -2911,7 +2715,7 @@
           <w:sz w:val="21"/>
           <w:szCs w:val="21"/>
         </w:rPr>
-        <w:t xml:space="preserve"> are sessions without a lab: the kickoff clinic and the stakeholder panels.</w:t>
+        <w:t xml:space="preserve"> are sessions without a lab: the kickoff clinic and the review-and-close sessions.</w:t>
       </w:r>
     </w:p>
     <w:p>
@@ -2967,7 +2771,7 @@
           <w:sz w:val="21"/>
           <w:szCs w:val="21"/>
         </w:rPr>
-        <w:t xml:space="preserve"> mark graded work: the Foundations check, the marked builds and deliverables, and the panels.</w:t>
+        <w:t xml:space="preserve"> mark the session where the level's certificate is confirmed.</w:t>
       </w:r>
     </w:p>
     <w:p>
@@ -4395,7 +4199,7 @@
           <w:sz w:val="21"/>
           <w:szCs w:val="21"/>
         </w:rPr>
-        <w:t xml:space="preserve">Mark each module complete. Session 1 opens with a clinic on anything you found hard, and the Foundations check.</w:t>
+        <w:t xml:space="preserve">Mark each module complete. Session 1 opens with a clinic on anything you found hard.</w:t>
       </w:r>
     </w:p>
     <w:p>
@@ -4559,7 +4363,7 @@
                 <w:sz w:val="19"/>
                 <w:szCs w:val="19"/>
               </w:rPr>
-              <w:t xml:space="preserve">Graded work</w:t>
+              <w:t xml:space="preserve">Notes</w:t>
             </w:r>
           </w:p>
         </w:tc>
@@ -4664,14 +4468,6 @@
             <w:pPr>
               <w:spacing w:before="0" w:after="0" w:line="240"/>
             </w:pPr>
-            <w:r>
-              <w:rPr>
-                <w:rFonts w:ascii="Calibri" w:cs="Calibri" w:eastAsia="Calibri" w:hAnsi="Calibri"/>
-                <w:sz w:val="19"/>
-                <w:szCs w:val="19"/>
-              </w:rPr>
-              <w:t xml:space="preserve">Foundations check</w:t>
-            </w:r>
           </w:p>
         </w:tc>
       </w:tr>
@@ -4878,14 +4674,6 @@
             <w:pPr>
               <w:spacing w:before="0" w:after="0" w:line="240"/>
             </w:pPr>
-            <w:r>
-              <w:rPr>
-                <w:rFonts w:ascii="Calibri" w:cs="Calibri" w:eastAsia="Calibri" w:hAnsi="Calibri"/>
-                <w:sz w:val="19"/>
-                <w:szCs w:val="19"/>
-              </w:rPr>
-              <w:t xml:space="preserve">Marked build 1: PFCG role from the matrix (B1) · submit by 23:59 CT on the day of session 4</w:t>
-            </w:r>
           </w:p>
         </w:tc>
       </w:tr>
@@ -5504,14 +5292,6 @@
             <w:pPr>
               <w:spacing w:before="0" w:after="0" w:line="240"/>
             </w:pPr>
-            <w:r>
-              <w:rPr>
-                <w:rFonts w:ascii="Calibri" w:cs="Calibri" w:eastAsia="Calibri" w:hAnsi="Calibri"/>
-                <w:sz w:val="19"/>
-                <w:szCs w:val="19"/>
-              </w:rPr>
-              <w:t xml:space="preserve">Marked build 2: MSMP / BRF+ workflow (B3) · submit by 23:59 CT on the day of session 10</w:t>
-            </w:r>
           </w:p>
         </w:tc>
       </w:tr>
@@ -5821,14 +5601,6 @@
             <w:pPr>
               <w:spacing w:before="0" w:after="0" w:line="240"/>
             </w:pPr>
-            <w:r>
-              <w:rPr>
-                <w:rFonts w:ascii="Calibri" w:cs="Calibri" w:eastAsia="Calibri" w:hAnsi="Calibri"/>
-                <w:sz w:val="19"/>
-                <w:szCs w:val="19"/>
-              </w:rPr>
-              <w:t xml:space="preserve">Marked build 3: Fiori OData &amp; S_SERVICE (B10) · submit by 23:59 CT on the day of session 13</w:t>
-            </w:r>
           </w:p>
         </w:tc>
       </w:tr>
@@ -6695,20 +6467,20 @@
                 <w:sz w:val="19"/>
                 <w:szCs w:val="19"/>
               </w:rPr>
-              <w:t xml:space="preserve">Stakeholder panel (no lab)</w:t>
-            </w:r>
-          </w:p>
-          <w:p>
-            <w:pPr>
-              <w:spacing w:before="0" w:after="0" w:line="240"/>
-            </w:pPr>
-            <w:r>
-              <w:rPr>
-                <w:rFonts w:ascii="Calibri" w:cs="Calibri" w:eastAsia="Calibri" w:hAnsi="Calibri"/>
-                <w:sz w:val="19"/>
-                <w:szCs w:val="19"/>
-              </w:rPr>
-              <w:t xml:space="preserve">present one design-and-build to an auditor, a developer and a business owner + close</w:t>
+              <w:t xml:space="preserve">Review and close (no lab)</w:t>
+            </w:r>
+          </w:p>
+          <w:p>
+            <w:pPr>
+              <w:spacing w:before="0" w:after="0" w:line="240"/>
+            </w:pPr>
+            <w:r>
+              <w:rPr>
+                <w:rFonts w:ascii="Calibri" w:cs="Calibri" w:eastAsia="Calibri" w:hAnsi="Calibri"/>
+                <w:sz w:val="19"/>
+                <w:szCs w:val="19"/>
+              </w:rPr>
+              <w:t xml:space="preserve">walk back through the level's builds, open questions, the Advanced pathway and career next steps</w:t>
             </w:r>
           </w:p>
         </w:tc>
@@ -6739,7 +6511,7 @@
                 <w:sz w:val="19"/>
                 <w:szCs w:val="19"/>
               </w:rPr>
-              <w:t xml:space="preserve">Panel graded · Intermediate certificate</w:t>
+              <w:t xml:space="preserve">Intermediate certificate: all labs completed</w:t>
             </w:r>
           </w:p>
         </w:tc>
@@ -6801,7 +6573,7 @@
           <w:sz w:val="21"/>
           <w:szCs w:val="21"/>
         </w:rPr>
-        <w:t xml:space="preserve"> finish all 12 Foundations modules and confirm your training-system logon and ZZ_TRAIN_ namespace work. The Foundations check is run by a TIB instructor — arrange it as your enrolment instructions say.</w:t>
+        <w:t xml:space="preserve"> finish all 12 Foundations modules and confirm your training-system logon and ZZ_TRAIN_ namespace work.</w:t>
       </w:r>
     </w:p>
     <w:p>
@@ -6821,7 +6593,7 @@
           <w:sz w:val="21"/>
           <w:szCs w:val="21"/>
         </w:rPr>
-        <w:t xml:space="preserve">Marked builds (B1, B3, B10):</w:t>
+        <w:t xml:space="preserve">S16 Review and close:</w:t>
       </w:r>
       <w:r>
         <w:rPr>
@@ -6829,35 +6601,7 @@
           <w:sz w:val="21"/>
           <w:szCs w:val="21"/>
         </w:rPr>
-        <w:t xml:space="preserve"> complete the lab, then submit your Field 13 write-up and every part's capture by the deadline in section 12. Marking is done by a TIB instructor.</w:t>
-      </w:r>
-    </w:p>
-    <w:p>
-      <w:pPr>
-        <w:pStyle w:val="ListParagraph"/>
-        <w:numPr>
-          <w:ilvl w:val="0"/>
-          <w:numId w:val="2"/>
-        </w:numPr>
-        <w:spacing w:before="0" w:after="40" w:line="240"/>
-      </w:pPr>
-      <w:r>
-        <w:rPr>
-          <w:rFonts w:ascii="Calibri" w:cs="Calibri" w:eastAsia="Calibri" w:hAnsi="Calibri"/>
-          <w:b/>
-          <w:bCs/>
-          <w:sz w:val="21"/>
-          <w:szCs w:val="21"/>
-        </w:rPr>
-        <w:t xml:space="preserve">S16 Stakeholder panel:</w:t>
-      </w:r>
-      <w:r>
-        <w:rPr>
-          <w:rFonts w:ascii="Calibri" w:cs="Calibri" w:eastAsia="Calibri" w:hAnsi="Calibri"/>
-          <w:sz w:val="21"/>
-          <w:szCs w:val="21"/>
-        </w:rPr>
-        <w:t xml:space="preserve"> present one design-and-build to an auditor, a developer and a business owner. Self-study trainees sit the panel with TIB instructors.</w:t>
+        <w:t xml:space="preserve"> walk back through the level's builds, bring open questions, and plan the Advanced level and your career next steps.</w:t>
       </w:r>
     </w:p>
     <w:p>
@@ -7021,7 +6765,7 @@
                 <w:sz w:val="19"/>
                 <w:szCs w:val="19"/>
               </w:rPr>
-              <w:t xml:space="preserve">Graded work</w:t>
+              <w:t xml:space="preserve">Notes</w:t>
             </w:r>
           </w:p>
         </w:tc>
@@ -7126,14 +6870,6 @@
             <w:pPr>
               <w:spacing w:before="0" w:after="0" w:line="240"/>
             </w:pPr>
-            <w:r>
-              <w:rPr>
-                <w:rFonts w:ascii="Calibri" w:cs="Calibri" w:eastAsia="Calibri" w:hAnsi="Calibri"/>
-                <w:sz w:val="19"/>
-                <w:szCs w:val="19"/>
-              </w:rPr>
-              <w:t xml:space="preserve">Entry check</w:t>
-            </w:r>
           </w:p>
         </w:tc>
       </w:tr>
@@ -8018,14 +7754,6 @@
             <w:pPr>
               <w:spacing w:before="0" w:after="0" w:line="240"/>
             </w:pPr>
-            <w:r>
-              <w:rPr>
-                <w:rFonts w:ascii="Calibri" w:cs="Calibri" w:eastAsia="Calibri" w:hAnsi="Calibri"/>
-                <w:sz w:val="19"/>
-                <w:szCs w:val="19"/>
-              </w:rPr>
-              <w:t xml:space="preserve">Marked deliverable 1: Security Audit Log filters (B12) · submit by 23:59 CT on the day of session 7</w:t>
-            </w:r>
           </w:p>
         </w:tc>
       </w:tr>
@@ -8807,14 +8535,6 @@
             <w:pPr>
               <w:spacing w:before="0" w:after="0" w:line="240"/>
             </w:pPr>
-            <w:r>
-              <w:rPr>
-                <w:rFonts w:ascii="Calibri" w:cs="Calibri" w:eastAsia="Calibri" w:hAnsi="Calibri"/>
-                <w:sz w:val="19"/>
-                <w:szCs w:val="19"/>
-              </w:rPr>
-              <w:t xml:space="preserve">Marked deliverable 2: auditor evidence pack (C12) · submit by 23:59 CT on the day of session 11</w:t>
-            </w:r>
           </w:p>
         </w:tc>
       </w:tr>
@@ -8918,14 +8638,6 @@
             <w:pPr>
               <w:spacing w:before="0" w:after="0" w:line="240"/>
             </w:pPr>
-            <w:r>
-              <w:rPr>
-                <w:rFonts w:ascii="Calibri" w:cs="Calibri" w:eastAsia="Calibri" w:hAnsi="Calibri"/>
-                <w:sz w:val="19"/>
-                <w:szCs w:val="19"/>
-              </w:rPr>
-              <w:t xml:space="preserve">Marked deliverable 3: mitigating-control evidence review (D7) · submit by 23:59 CT on the day of session 12</w:t>
-            </w:r>
           </w:p>
         </w:tc>
       </w:tr>
@@ -9114,20 +8826,20 @@
                 <w:sz w:val="19"/>
                 <w:szCs w:val="19"/>
               </w:rPr>
-              <w:t xml:space="preserve">Stakeholder panel (no lab)</w:t>
-            </w:r>
-          </w:p>
-          <w:p>
-            <w:pPr>
-              <w:spacing w:before="0" w:after="0" w:line="240"/>
-            </w:pPr>
-            <w:r>
-              <w:rPr>
-                <w:rFonts w:ascii="Calibri" w:cs="Calibri" w:eastAsia="Calibri" w:hAnsi="Calibri"/>
-                <w:sz w:val="19"/>
-                <w:szCs w:val="19"/>
-              </w:rPr>
-              <w:t xml:space="preserve">one go-live or support resolution to an auditor, a developer and a business owner + close</w:t>
+              <w:t xml:space="preserve">Review and close (no lab)</w:t>
+            </w:r>
+          </w:p>
+          <w:p>
+            <w:pPr>
+              <w:spacing w:before="0" w:after="0" w:line="240"/>
+            </w:pPr>
+            <w:r>
+              <w:rPr>
+                <w:rFonts w:ascii="Calibri" w:cs="Calibri" w:eastAsia="Calibri" w:hAnsi="Calibri"/>
+                <w:sz w:val="19"/>
+                <w:szCs w:val="19"/>
+              </w:rPr>
+              <w:t xml:space="preserve">walk back through the level's go-live and support work, open questions and career next steps</w:t>
             </w:r>
           </w:p>
         </w:tc>
@@ -9158,7 +8870,7 @@
                 <w:sz w:val="19"/>
                 <w:szCs w:val="19"/>
               </w:rPr>
-              <w:t xml:space="preserve">Panel graded · Advanced certificate</w:t>
+              <w:t xml:space="preserve">Advanced certificate: all labs completed</w:t>
             </w:r>
           </w:p>
         </w:tc>
@@ -9407,7 +9119,7 @@
           <w:sz w:val="21"/>
           <w:szCs w:val="21"/>
         </w:rPr>
-        <w:t xml:space="preserve">Marked deliverables (B12, C12, D7):</w:t>
+        <w:t xml:space="preserve">S12 Review and close:</w:t>
       </w:r>
       <w:r>
         <w:rPr>
@@ -9415,35 +9127,7 @@
           <w:sz w:val="21"/>
           <w:szCs w:val="21"/>
         </w:rPr>
-        <w:t xml:space="preserve"> submit each for marking as your enrolment instructions say.</w:t>
-      </w:r>
-    </w:p>
-    <w:p>
-      <w:pPr>
-        <w:pStyle w:val="ListParagraph"/>
-        <w:numPr>
-          <w:ilvl w:val="0"/>
-          <w:numId w:val="2"/>
-        </w:numPr>
-        <w:spacing w:before="0" w:after="40" w:line="240"/>
-      </w:pPr>
-      <w:r>
-        <w:rPr>
-          <w:rFonts w:ascii="Calibri" w:cs="Calibri" w:eastAsia="Calibri" w:hAnsi="Calibri"/>
-          <w:b/>
-          <w:bCs/>
-          <w:sz w:val="21"/>
-          <w:szCs w:val="21"/>
-        </w:rPr>
-        <w:t xml:space="preserve">S12 Stakeholder panel:</w:t>
-      </w:r>
-      <w:r>
-        <w:rPr>
-          <w:rFonts w:ascii="Calibri" w:cs="Calibri" w:eastAsia="Calibri" w:hAnsi="Calibri"/>
-          <w:sz w:val="21"/>
-          <w:szCs w:val="21"/>
-        </w:rPr>
-        <w:t xml:space="preserve"> one go-live or support resolution, presented to an auditor, a developer and a business owner, with TIB instructors.</w:t>
+        <w:t xml:space="preserve"> walk back through the level's go-live and support work, open questions and career next steps.</w:t>
       </w:r>
     </w:p>
     <w:p>
@@ -9741,7 +9425,7 @@
                 <w:sz w:val="19"/>
                 <w:szCs w:val="19"/>
               </w:rPr>
-              <w:t xml:space="preserve">S1–S4 · Foundations check · marked build B1</w:t>
+              <w:t xml:space="preserve">S1–S4</w:t>
             </w:r>
           </w:p>
         </w:tc>
@@ -9870,7 +9554,7 @@
                 <w:sz w:val="19"/>
                 <w:szCs w:val="19"/>
               </w:rPr>
-              <w:t xml:space="preserve">S5–S8 · marked deliverable B12 · self-study C11, B9</w:t>
+              <w:t xml:space="preserve">S5–S8 · self-study C11, B9</w:t>
             </w:r>
           </w:p>
         </w:tc>
@@ -9937,7 +9621,7 @@
                 <w:sz w:val="19"/>
                 <w:szCs w:val="19"/>
               </w:rPr>
-              <w:t xml:space="preserve">S9–S12 · marked builds B3 and B10</w:t>
+              <w:t xml:space="preserve">S9–S12</w:t>
             </w:r>
           </w:p>
         </w:tc>
@@ -9968,7 +9652,7 @@
                 <w:sz w:val="19"/>
                 <w:szCs w:val="19"/>
               </w:rPr>
-              <w:t xml:space="preserve">S9–S12 · deliverables C12 and D7 · self-study C9, D1 · panel</w:t>
+              <w:t xml:space="preserve">S9–S12 · self-study C9, D1 · review and close</w:t>
             </w:r>
           </w:p>
         </w:tc>
@@ -10035,7 +9719,7 @@
                 <w:sz w:val="19"/>
                 <w:szCs w:val="19"/>
               </w:rPr>
-              <w:t xml:space="preserve">S13–S16 · self-study B6, A7, B7, B8 · panel</w:t>
+              <w:t xml:space="preserve">S13–S16 · self-study B6, A7, B7, B8 · review and close</w:t>
             </w:r>
           </w:p>
         </w:tc>
@@ -10100,7 +9784,7 @@
           <w:sz w:val="21"/>
           <w:szCs w:val="21"/>
         </w:rPr>
-        <w:t xml:space="preserve">One session per sitting. Do not skip the write-up or the pushback — they are what the panel tests.</w:t>
+        <w:t xml:space="preserve">One session per sitting. Do not skip the write-up or the pushback — they are how you check your own understanding against the model answer.</w:t>
       </w:r>
     </w:p>
     <w:p>
@@ -10157,1167 +9841,6 @@
         <w:t xml:space="preserve">12. Certificates</w:t>
       </w:r>
     </w:p>
-    <w:tbl>
-      <w:tblPr>
-        <w:tblW w:type="dxa" w:w="10080"/>
-        <w:tblLayout w:type="fixed"/>
-      </w:tblPr>
-      <w:tblGrid>
-        <w:gridCol w:w="2700"/>
-        <w:gridCol w:w="1400"/>
-        <w:gridCol w:w="1000"/>
-        <w:gridCol w:w="3080"/>
-        <w:gridCol w:w="1900"/>
-      </w:tblGrid>
-      <w:tr>
-        <w:trPr>
-          <w:tblHeader/>
-        </w:trPr>
-        <w:tc>
-          <w:tcPr>
-            <w:tcW w:type="dxa" w:w="2700"/>
-            <w:tcBorders>
-              <w:top w:val="single" w:color="D5DCE6" w:sz="4"/>
-              <w:left w:val="single" w:color="D5DCE6" w:sz="4"/>
-              <w:bottom w:val="single" w:color="D5DCE6" w:sz="4"/>
-              <w:right w:val="single" w:color="D5DCE6" w:sz="4"/>
-            </w:tcBorders>
-            <w:shd w:fill="1B3358" w:color="auto" w:val="clear"/>
-            <w:tcMar>
-              <w:top w:type="dxa" w:w="50"/>
-              <w:left w:type="dxa" w:w="100"/>
-              <w:bottom w:type="dxa" w:w="50"/>
-              <w:right w:type="dxa" w:w="100"/>
-            </w:tcMar>
-          </w:tcPr>
-          <w:p>
-            <w:pPr>
-              <w:spacing w:before="0" w:after="0" w:line="240"/>
-            </w:pPr>
-            <w:r>
-              <w:rPr>
-                <w:rFonts w:ascii="Calibri" w:cs="Calibri" w:eastAsia="Calibri" w:hAnsi="Calibri"/>
-                <w:b/>
-                <w:bCs/>
-                <w:color w:val="FFFFFF"/>
-                <w:sz w:val="19"/>
-                <w:szCs w:val="19"/>
-              </w:rPr>
-              <w:t xml:space="preserve">Marked work</w:t>
-            </w:r>
-          </w:p>
-        </w:tc>
-        <w:tc>
-          <w:tcPr>
-            <w:tcW w:type="dxa" w:w="1400"/>
-            <w:tcBorders>
-              <w:top w:val="single" w:color="D5DCE6" w:sz="4"/>
-              <w:left w:val="single" w:color="D5DCE6" w:sz="4"/>
-              <w:bottom w:val="single" w:color="D5DCE6" w:sz="4"/>
-              <w:right w:val="single" w:color="D5DCE6" w:sz="4"/>
-            </w:tcBorders>
-            <w:shd w:fill="1B3358" w:color="auto" w:val="clear"/>
-            <w:tcMar>
-              <w:top w:type="dxa" w:w="50"/>
-              <w:left w:type="dxa" w:w="100"/>
-              <w:bottom w:type="dxa" w:w="50"/>
-              <w:right w:type="dxa" w:w="100"/>
-            </w:tcMar>
-          </w:tcPr>
-          <w:p>
-            <w:pPr>
-              <w:spacing w:before="0" w:after="0" w:line="240"/>
-            </w:pPr>
-            <w:r>
-              <w:rPr>
-                <w:rFonts w:ascii="Calibri" w:cs="Calibri" w:eastAsia="Calibri" w:hAnsi="Calibri"/>
-                <w:b/>
-                <w:bCs/>
-                <w:color w:val="FFFFFF"/>
-                <w:sz w:val="19"/>
-                <w:szCs w:val="19"/>
-              </w:rPr>
-              <w:t xml:space="preserve">Level</w:t>
-            </w:r>
-          </w:p>
-        </w:tc>
-        <w:tc>
-          <w:tcPr>
-            <w:tcW w:type="dxa" w:w="1000"/>
-            <w:tcBorders>
-              <w:top w:val="single" w:color="D5DCE6" w:sz="4"/>
-              <w:left w:val="single" w:color="D5DCE6" w:sz="4"/>
-              <w:bottom w:val="single" w:color="D5DCE6" w:sz="4"/>
-              <w:right w:val="single" w:color="D5DCE6" w:sz="4"/>
-            </w:tcBorders>
-            <w:shd w:fill="1B3358" w:color="auto" w:val="clear"/>
-            <w:tcMar>
-              <w:top w:type="dxa" w:w="50"/>
-              <w:left w:type="dxa" w:w="100"/>
-              <w:bottom w:type="dxa" w:w="50"/>
-              <w:right w:type="dxa" w:w="100"/>
-            </w:tcMar>
-          </w:tcPr>
-          <w:p>
-            <w:pPr>
-              <w:spacing w:before="0" w:after="0" w:line="240"/>
-            </w:pPr>
-            <w:r>
-              <w:rPr>
-                <w:rFonts w:ascii="Calibri" w:cs="Calibri" w:eastAsia="Calibri" w:hAnsi="Calibri"/>
-                <w:b/>
-                <w:bCs/>
-                <w:color w:val="FFFFFF"/>
-                <w:sz w:val="19"/>
-                <w:szCs w:val="19"/>
-              </w:rPr>
-              <w:t xml:space="preserve">Set in</w:t>
-            </w:r>
-          </w:p>
-        </w:tc>
-        <w:tc>
-          <w:tcPr>
-            <w:tcW w:type="dxa" w:w="3080"/>
-            <w:tcBorders>
-              <w:top w:val="single" w:color="D5DCE6" w:sz="4"/>
-              <w:left w:val="single" w:color="D5DCE6" w:sz="4"/>
-              <w:bottom w:val="single" w:color="D5DCE6" w:sz="4"/>
-              <w:right w:val="single" w:color="D5DCE6" w:sz="4"/>
-            </w:tcBorders>
-            <w:shd w:fill="1B3358" w:color="auto" w:val="clear"/>
-            <w:tcMar>
-              <w:top w:type="dxa" w:w="50"/>
-              <w:left w:type="dxa" w:w="100"/>
-              <w:bottom w:type="dxa" w:w="50"/>
-              <w:right w:type="dxa" w:w="100"/>
-            </w:tcMar>
-          </w:tcPr>
-          <w:p>
-            <w:pPr>
-              <w:spacing w:before="0" w:after="0" w:line="240"/>
-            </w:pPr>
-            <w:r>
-              <w:rPr>
-                <w:rFonts w:ascii="Calibri" w:cs="Calibri" w:eastAsia="Calibri" w:hAnsi="Calibri"/>
-                <w:b/>
-                <w:bCs/>
-                <w:color w:val="FFFFFF"/>
-                <w:sz w:val="19"/>
-                <w:szCs w:val="19"/>
-              </w:rPr>
-              <w:t xml:space="preserve">Submit by</w:t>
-            </w:r>
-          </w:p>
-        </w:tc>
-        <w:tc>
-          <w:tcPr>
-            <w:tcW w:type="dxa" w:w="1900"/>
-            <w:tcBorders>
-              <w:top w:val="single" w:color="D5DCE6" w:sz="4"/>
-              <w:left w:val="single" w:color="D5DCE6" w:sz="4"/>
-              <w:bottom w:val="single" w:color="D5DCE6" w:sz="4"/>
-              <w:right w:val="single" w:color="D5DCE6" w:sz="4"/>
-            </w:tcBorders>
-            <w:shd w:fill="1B3358" w:color="auto" w:val="clear"/>
-            <w:tcMar>
-              <w:top w:type="dxa" w:w="50"/>
-              <w:left w:type="dxa" w:w="100"/>
-              <w:bottom w:type="dxa" w:w="50"/>
-              <w:right w:type="dxa" w:w="100"/>
-            </w:tcMar>
-          </w:tcPr>
-          <w:p>
-            <w:pPr>
-              <w:spacing w:before="0" w:after="0" w:line="240"/>
-            </w:pPr>
-            <w:r>
-              <w:rPr>
-                <w:rFonts w:ascii="Calibri" w:cs="Calibri" w:eastAsia="Calibri" w:hAnsi="Calibri"/>
-                <w:b/>
-                <w:bCs/>
-                <w:color w:val="FFFFFF"/>
-                <w:sz w:val="19"/>
-                <w:szCs w:val="19"/>
-              </w:rPr>
-              <w:t xml:space="preserve">Returned</w:t>
-            </w:r>
-          </w:p>
-        </w:tc>
-      </w:tr>
-      <w:tr>
-        <w:trPr>
-          <w:cantSplit/>
-        </w:trPr>
-        <w:tc>
-          <w:tcPr>
-            <w:tcW w:type="dxa" w:w="2700"/>
-            <w:tcBorders>
-              <w:top w:val="single" w:color="D5DCE6" w:sz="4"/>
-              <w:left w:val="single" w:color="D5DCE6" w:sz="4"/>
-              <w:bottom w:val="single" w:color="D5DCE6" w:sz="4"/>
-              <w:right w:val="single" w:color="D5DCE6" w:sz="4"/>
-            </w:tcBorders>
-            <w:shd w:fill="FFFFFF" w:color="auto" w:val="clear"/>
-            <w:tcMar>
-              <w:top w:type="dxa" w:w="50"/>
-              <w:left w:type="dxa" w:w="100"/>
-              <w:bottom w:type="dxa" w:w="50"/>
-              <w:right w:type="dxa" w:w="100"/>
-            </w:tcMar>
-          </w:tcPr>
-          <w:p>
-            <w:pPr>
-              <w:spacing w:before="0" w:after="0" w:line="240"/>
-            </w:pPr>
-            <w:r>
-              <w:rPr>
-                <w:rFonts w:ascii="Calibri" w:cs="Calibri" w:eastAsia="Calibri" w:hAnsi="Calibri"/>
-                <w:sz w:val="19"/>
-                <w:szCs w:val="19"/>
-              </w:rPr>
-              <w:t xml:space="preserve">B1 — PFCG role build</w:t>
-            </w:r>
-          </w:p>
-        </w:tc>
-        <w:tc>
-          <w:tcPr>
-            <w:tcW w:type="dxa" w:w="1400"/>
-            <w:tcBorders>
-              <w:top w:val="single" w:color="D5DCE6" w:sz="4"/>
-              <w:left w:val="single" w:color="D5DCE6" w:sz="4"/>
-              <w:bottom w:val="single" w:color="D5DCE6" w:sz="4"/>
-              <w:right w:val="single" w:color="D5DCE6" w:sz="4"/>
-            </w:tcBorders>
-            <w:shd w:fill="FFFFFF" w:color="auto" w:val="clear"/>
-            <w:tcMar>
-              <w:top w:type="dxa" w:w="50"/>
-              <w:left w:type="dxa" w:w="100"/>
-              <w:bottom w:type="dxa" w:w="50"/>
-              <w:right w:type="dxa" w:w="100"/>
-            </w:tcMar>
-          </w:tcPr>
-          <w:p>
-            <w:pPr>
-              <w:spacing w:before="0" w:after="0" w:line="240"/>
-            </w:pPr>
-            <w:r>
-              <w:rPr>
-                <w:rFonts w:ascii="Calibri" w:cs="Calibri" w:eastAsia="Calibri" w:hAnsi="Calibri"/>
-                <w:sz w:val="19"/>
-                <w:szCs w:val="19"/>
-              </w:rPr>
-              <w:t xml:space="preserve">Intermediate</w:t>
-            </w:r>
-          </w:p>
-        </w:tc>
-        <w:tc>
-          <w:tcPr>
-            <w:tcW w:type="dxa" w:w="1000"/>
-            <w:tcBorders>
-              <w:top w:val="single" w:color="D5DCE6" w:sz="4"/>
-              <w:left w:val="single" w:color="D5DCE6" w:sz="4"/>
-              <w:bottom w:val="single" w:color="D5DCE6" w:sz="4"/>
-              <w:right w:val="single" w:color="D5DCE6" w:sz="4"/>
-            </w:tcBorders>
-            <w:shd w:fill="FFFFFF" w:color="auto" w:val="clear"/>
-            <w:tcMar>
-              <w:top w:type="dxa" w:w="50"/>
-              <w:left w:type="dxa" w:w="100"/>
-              <w:bottom w:type="dxa" w:w="50"/>
-              <w:right w:type="dxa" w:w="100"/>
-            </w:tcMar>
-          </w:tcPr>
-          <w:p>
-            <w:pPr>
-              <w:spacing w:before="0" w:after="0" w:line="240"/>
-            </w:pPr>
-            <w:r>
-              <w:rPr>
-                <w:rFonts w:ascii="Calibri" w:cs="Calibri" w:eastAsia="Calibri" w:hAnsi="Calibri"/>
-                <w:sz w:val="19"/>
-                <w:szCs w:val="19"/>
-              </w:rPr>
-              <w:t xml:space="preserve">S3</w:t>
-            </w:r>
-          </w:p>
-        </w:tc>
-        <w:tc>
-          <w:tcPr>
-            <w:tcW w:type="dxa" w:w="3080"/>
-            <w:tcBorders>
-              <w:top w:val="single" w:color="D5DCE6" w:sz="4"/>
-              <w:left w:val="single" w:color="D5DCE6" w:sz="4"/>
-              <w:bottom w:val="single" w:color="D5DCE6" w:sz="4"/>
-              <w:right w:val="single" w:color="D5DCE6" w:sz="4"/>
-            </w:tcBorders>
-            <w:shd w:fill="FFFFFF" w:color="auto" w:val="clear"/>
-            <w:tcMar>
-              <w:top w:type="dxa" w:w="50"/>
-              <w:left w:type="dxa" w:w="100"/>
-              <w:bottom w:type="dxa" w:w="50"/>
-              <w:right w:type="dxa" w:w="100"/>
-            </w:tcMar>
-          </w:tcPr>
-          <w:p>
-            <w:pPr>
-              <w:spacing w:before="0" w:after="0" w:line="240"/>
-            </w:pPr>
-            <w:r>
-              <w:rPr>
-                <w:rFonts w:ascii="Calibri" w:cs="Calibri" w:eastAsia="Calibri" w:hAnsi="Calibri"/>
-                <w:sz w:val="19"/>
-                <w:szCs w:val="19"/>
-              </w:rPr>
-              <w:t xml:space="preserve">23:59 CT on the day of S4</w:t>
-            </w:r>
-          </w:p>
-        </w:tc>
-        <w:tc>
-          <w:tcPr>
-            <w:tcW w:type="dxa" w:w="1900"/>
-            <w:tcBorders>
-              <w:top w:val="single" w:color="D5DCE6" w:sz="4"/>
-              <w:left w:val="single" w:color="D5DCE6" w:sz="4"/>
-              <w:bottom w:val="single" w:color="D5DCE6" w:sz="4"/>
-              <w:right w:val="single" w:color="D5DCE6" w:sz="4"/>
-            </w:tcBorders>
-            <w:shd w:fill="FFFFFF" w:color="auto" w:val="clear"/>
-            <w:tcMar>
-              <w:top w:type="dxa" w:w="50"/>
-              <w:left w:type="dxa" w:w="100"/>
-              <w:bottom w:type="dxa" w:w="50"/>
-              <w:right w:type="dxa" w:w="100"/>
-            </w:tcMar>
-          </w:tcPr>
-          <w:p>
-            <w:pPr>
-              <w:spacing w:before="0" w:after="0" w:line="240"/>
-            </w:pPr>
-            <w:r>
-              <w:rPr>
-                <w:rFonts w:ascii="Calibri" w:cs="Calibri" w:eastAsia="Calibri" w:hAnsi="Calibri"/>
-                <w:sz w:val="19"/>
-                <w:szCs w:val="19"/>
-              </w:rPr>
-              <w:t xml:space="preserve">S6</w:t>
-            </w:r>
-          </w:p>
-        </w:tc>
-      </w:tr>
-      <w:tr>
-        <w:trPr>
-          <w:cantSplit/>
-        </w:trPr>
-        <w:tc>
-          <w:tcPr>
-            <w:tcW w:type="dxa" w:w="2700"/>
-            <w:tcBorders>
-              <w:top w:val="single" w:color="D5DCE6" w:sz="4"/>
-              <w:left w:val="single" w:color="D5DCE6" w:sz="4"/>
-              <w:bottom w:val="single" w:color="D5DCE6" w:sz="4"/>
-              <w:right w:val="single" w:color="D5DCE6" w:sz="4"/>
-            </w:tcBorders>
-            <w:shd w:fill="F4F6FA" w:color="auto" w:val="clear"/>
-            <w:tcMar>
-              <w:top w:type="dxa" w:w="50"/>
-              <w:left w:type="dxa" w:w="100"/>
-              <w:bottom w:type="dxa" w:w="50"/>
-              <w:right w:type="dxa" w:w="100"/>
-            </w:tcMar>
-          </w:tcPr>
-          <w:p>
-            <w:pPr>
-              <w:spacing w:before="0" w:after="0" w:line="240"/>
-            </w:pPr>
-            <w:r>
-              <w:rPr>
-                <w:rFonts w:ascii="Calibri" w:cs="Calibri" w:eastAsia="Calibri" w:hAnsi="Calibri"/>
-                <w:sz w:val="19"/>
-                <w:szCs w:val="19"/>
-              </w:rPr>
-              <w:t xml:space="preserve">B3 — MSMP / BRF+ build</w:t>
-            </w:r>
-          </w:p>
-        </w:tc>
-        <w:tc>
-          <w:tcPr>
-            <w:tcW w:type="dxa" w:w="1400"/>
-            <w:tcBorders>
-              <w:top w:val="single" w:color="D5DCE6" w:sz="4"/>
-              <w:left w:val="single" w:color="D5DCE6" w:sz="4"/>
-              <w:bottom w:val="single" w:color="D5DCE6" w:sz="4"/>
-              <w:right w:val="single" w:color="D5DCE6" w:sz="4"/>
-            </w:tcBorders>
-            <w:shd w:fill="F4F6FA" w:color="auto" w:val="clear"/>
-            <w:tcMar>
-              <w:top w:type="dxa" w:w="50"/>
-              <w:left w:type="dxa" w:w="100"/>
-              <w:bottom w:type="dxa" w:w="50"/>
-              <w:right w:type="dxa" w:w="100"/>
-            </w:tcMar>
-          </w:tcPr>
-          <w:p>
-            <w:pPr>
-              <w:spacing w:before="0" w:after="0" w:line="240"/>
-            </w:pPr>
-            <w:r>
-              <w:rPr>
-                <w:rFonts w:ascii="Calibri" w:cs="Calibri" w:eastAsia="Calibri" w:hAnsi="Calibri"/>
-                <w:sz w:val="19"/>
-                <w:szCs w:val="19"/>
-              </w:rPr>
-              <w:t xml:space="preserve">Intermediate</w:t>
-            </w:r>
-          </w:p>
-        </w:tc>
-        <w:tc>
-          <w:tcPr>
-            <w:tcW w:type="dxa" w:w="1000"/>
-            <w:tcBorders>
-              <w:top w:val="single" w:color="D5DCE6" w:sz="4"/>
-              <w:left w:val="single" w:color="D5DCE6" w:sz="4"/>
-              <w:bottom w:val="single" w:color="D5DCE6" w:sz="4"/>
-              <w:right w:val="single" w:color="D5DCE6" w:sz="4"/>
-            </w:tcBorders>
-            <w:shd w:fill="F4F6FA" w:color="auto" w:val="clear"/>
-            <w:tcMar>
-              <w:top w:type="dxa" w:w="50"/>
-              <w:left w:type="dxa" w:w="100"/>
-              <w:bottom w:type="dxa" w:w="50"/>
-              <w:right w:type="dxa" w:w="100"/>
-            </w:tcMar>
-          </w:tcPr>
-          <w:p>
-            <w:pPr>
-              <w:spacing w:before="0" w:after="0" w:line="240"/>
-            </w:pPr>
-            <w:r>
-              <w:rPr>
-                <w:rFonts w:ascii="Calibri" w:cs="Calibri" w:eastAsia="Calibri" w:hAnsi="Calibri"/>
-                <w:sz w:val="19"/>
-                <w:szCs w:val="19"/>
-              </w:rPr>
-              <w:t xml:space="preserve">S9</w:t>
-            </w:r>
-          </w:p>
-        </w:tc>
-        <w:tc>
-          <w:tcPr>
-            <w:tcW w:type="dxa" w:w="3080"/>
-            <w:tcBorders>
-              <w:top w:val="single" w:color="D5DCE6" w:sz="4"/>
-              <w:left w:val="single" w:color="D5DCE6" w:sz="4"/>
-              <w:bottom w:val="single" w:color="D5DCE6" w:sz="4"/>
-              <w:right w:val="single" w:color="D5DCE6" w:sz="4"/>
-            </w:tcBorders>
-            <w:shd w:fill="F4F6FA" w:color="auto" w:val="clear"/>
-            <w:tcMar>
-              <w:top w:type="dxa" w:w="50"/>
-              <w:left w:type="dxa" w:w="100"/>
-              <w:bottom w:type="dxa" w:w="50"/>
-              <w:right w:type="dxa" w:w="100"/>
-            </w:tcMar>
-          </w:tcPr>
-          <w:p>
-            <w:pPr>
-              <w:spacing w:before="0" w:after="0" w:line="240"/>
-            </w:pPr>
-            <w:r>
-              <w:rPr>
-                <w:rFonts w:ascii="Calibri" w:cs="Calibri" w:eastAsia="Calibri" w:hAnsi="Calibri"/>
-                <w:sz w:val="19"/>
-                <w:szCs w:val="19"/>
-              </w:rPr>
-              <w:t xml:space="preserve">23:59 CT on the day of S10</w:t>
-            </w:r>
-          </w:p>
-        </w:tc>
-        <w:tc>
-          <w:tcPr>
-            <w:tcW w:type="dxa" w:w="1900"/>
-            <w:tcBorders>
-              <w:top w:val="single" w:color="D5DCE6" w:sz="4"/>
-              <w:left w:val="single" w:color="D5DCE6" w:sz="4"/>
-              <w:bottom w:val="single" w:color="D5DCE6" w:sz="4"/>
-              <w:right w:val="single" w:color="D5DCE6" w:sz="4"/>
-            </w:tcBorders>
-            <w:shd w:fill="F4F6FA" w:color="auto" w:val="clear"/>
-            <w:tcMar>
-              <w:top w:type="dxa" w:w="50"/>
-              <w:left w:type="dxa" w:w="100"/>
-              <w:bottom w:type="dxa" w:w="50"/>
-              <w:right w:type="dxa" w:w="100"/>
-            </w:tcMar>
-          </w:tcPr>
-          <w:p>
-            <w:pPr>
-              <w:spacing w:before="0" w:after="0" w:line="240"/>
-            </w:pPr>
-            <w:r>
-              <w:rPr>
-                <w:rFonts w:ascii="Calibri" w:cs="Calibri" w:eastAsia="Calibri" w:hAnsi="Calibri"/>
-                <w:sz w:val="19"/>
-                <w:szCs w:val="19"/>
-              </w:rPr>
-              <w:t xml:space="preserve">S12</w:t>
-            </w:r>
-          </w:p>
-        </w:tc>
-      </w:tr>
-      <w:tr>
-        <w:trPr>
-          <w:cantSplit/>
-        </w:trPr>
-        <w:tc>
-          <w:tcPr>
-            <w:tcW w:type="dxa" w:w="2700"/>
-            <w:tcBorders>
-              <w:top w:val="single" w:color="D5DCE6" w:sz="4"/>
-              <w:left w:val="single" w:color="D5DCE6" w:sz="4"/>
-              <w:bottom w:val="single" w:color="D5DCE6" w:sz="4"/>
-              <w:right w:val="single" w:color="D5DCE6" w:sz="4"/>
-            </w:tcBorders>
-            <w:shd w:fill="FFFFFF" w:color="auto" w:val="clear"/>
-            <w:tcMar>
-              <w:top w:type="dxa" w:w="50"/>
-              <w:left w:type="dxa" w:w="100"/>
-              <w:bottom w:type="dxa" w:w="50"/>
-              <w:right w:type="dxa" w:w="100"/>
-            </w:tcMar>
-          </w:tcPr>
-          <w:p>
-            <w:pPr>
-              <w:spacing w:before="0" w:after="0" w:line="240"/>
-            </w:pPr>
-            <w:r>
-              <w:rPr>
-                <w:rFonts w:ascii="Calibri" w:cs="Calibri" w:eastAsia="Calibri" w:hAnsi="Calibri"/>
-                <w:sz w:val="19"/>
-                <w:szCs w:val="19"/>
-              </w:rPr>
-              <w:t xml:space="preserve">B10 — OData &amp; S_SERVICE</w:t>
-            </w:r>
-          </w:p>
-        </w:tc>
-        <w:tc>
-          <w:tcPr>
-            <w:tcW w:type="dxa" w:w="1400"/>
-            <w:tcBorders>
-              <w:top w:val="single" w:color="D5DCE6" w:sz="4"/>
-              <w:left w:val="single" w:color="D5DCE6" w:sz="4"/>
-              <w:bottom w:val="single" w:color="D5DCE6" w:sz="4"/>
-              <w:right w:val="single" w:color="D5DCE6" w:sz="4"/>
-            </w:tcBorders>
-            <w:shd w:fill="FFFFFF" w:color="auto" w:val="clear"/>
-            <w:tcMar>
-              <w:top w:type="dxa" w:w="50"/>
-              <w:left w:type="dxa" w:w="100"/>
-              <w:bottom w:type="dxa" w:w="50"/>
-              <w:right w:type="dxa" w:w="100"/>
-            </w:tcMar>
-          </w:tcPr>
-          <w:p>
-            <w:pPr>
-              <w:spacing w:before="0" w:after="0" w:line="240"/>
-            </w:pPr>
-            <w:r>
-              <w:rPr>
-                <w:rFonts w:ascii="Calibri" w:cs="Calibri" w:eastAsia="Calibri" w:hAnsi="Calibri"/>
-                <w:sz w:val="19"/>
-                <w:szCs w:val="19"/>
-              </w:rPr>
-              <w:t xml:space="preserve">Intermediate</w:t>
-            </w:r>
-          </w:p>
-        </w:tc>
-        <w:tc>
-          <w:tcPr>
-            <w:tcW w:type="dxa" w:w="1000"/>
-            <w:tcBorders>
-              <w:top w:val="single" w:color="D5DCE6" w:sz="4"/>
-              <w:left w:val="single" w:color="D5DCE6" w:sz="4"/>
-              <w:bottom w:val="single" w:color="D5DCE6" w:sz="4"/>
-              <w:right w:val="single" w:color="D5DCE6" w:sz="4"/>
-            </w:tcBorders>
-            <w:shd w:fill="FFFFFF" w:color="auto" w:val="clear"/>
-            <w:tcMar>
-              <w:top w:type="dxa" w:w="50"/>
-              <w:left w:type="dxa" w:w="100"/>
-              <w:bottom w:type="dxa" w:w="50"/>
-              <w:right w:type="dxa" w:w="100"/>
-            </w:tcMar>
-          </w:tcPr>
-          <w:p>
-            <w:pPr>
-              <w:spacing w:before="0" w:after="0" w:line="240"/>
-            </w:pPr>
-            <w:r>
-              <w:rPr>
-                <w:rFonts w:ascii="Calibri" w:cs="Calibri" w:eastAsia="Calibri" w:hAnsi="Calibri"/>
-                <w:sz w:val="19"/>
-                <w:szCs w:val="19"/>
-              </w:rPr>
-              <w:t xml:space="preserve">S12</w:t>
-            </w:r>
-          </w:p>
-        </w:tc>
-        <w:tc>
-          <w:tcPr>
-            <w:tcW w:type="dxa" w:w="3080"/>
-            <w:tcBorders>
-              <w:top w:val="single" w:color="D5DCE6" w:sz="4"/>
-              <w:left w:val="single" w:color="D5DCE6" w:sz="4"/>
-              <w:bottom w:val="single" w:color="D5DCE6" w:sz="4"/>
-              <w:right w:val="single" w:color="D5DCE6" w:sz="4"/>
-            </w:tcBorders>
-            <w:shd w:fill="FFFFFF" w:color="auto" w:val="clear"/>
-            <w:tcMar>
-              <w:top w:type="dxa" w:w="50"/>
-              <w:left w:type="dxa" w:w="100"/>
-              <w:bottom w:type="dxa" w:w="50"/>
-              <w:right w:type="dxa" w:w="100"/>
-            </w:tcMar>
-          </w:tcPr>
-          <w:p>
-            <w:pPr>
-              <w:spacing w:before="0" w:after="0" w:line="240"/>
-            </w:pPr>
-            <w:r>
-              <w:rPr>
-                <w:rFonts w:ascii="Calibri" w:cs="Calibri" w:eastAsia="Calibri" w:hAnsi="Calibri"/>
-                <w:sz w:val="19"/>
-                <w:szCs w:val="19"/>
-              </w:rPr>
-              <w:t xml:space="preserve">23:59 CT on the day of S13</w:t>
-            </w:r>
-          </w:p>
-        </w:tc>
-        <w:tc>
-          <w:tcPr>
-            <w:tcW w:type="dxa" w:w="1900"/>
-            <w:tcBorders>
-              <w:top w:val="single" w:color="D5DCE6" w:sz="4"/>
-              <w:left w:val="single" w:color="D5DCE6" w:sz="4"/>
-              <w:bottom w:val="single" w:color="D5DCE6" w:sz="4"/>
-              <w:right w:val="single" w:color="D5DCE6" w:sz="4"/>
-            </w:tcBorders>
-            <w:shd w:fill="FFFFFF" w:color="auto" w:val="clear"/>
-            <w:tcMar>
-              <w:top w:type="dxa" w:w="50"/>
-              <w:left w:type="dxa" w:w="100"/>
-              <w:bottom w:type="dxa" w:w="50"/>
-              <w:right w:type="dxa" w:w="100"/>
-            </w:tcMar>
-          </w:tcPr>
-          <w:p>
-            <w:pPr>
-              <w:spacing w:before="0" w:after="0" w:line="240"/>
-            </w:pPr>
-            <w:r>
-              <w:rPr>
-                <w:rFonts w:ascii="Calibri" w:cs="Calibri" w:eastAsia="Calibri" w:hAnsi="Calibri"/>
-                <w:sz w:val="19"/>
-                <w:szCs w:val="19"/>
-              </w:rPr>
-              <w:t xml:space="preserve">S15</w:t>
-            </w:r>
-          </w:p>
-        </w:tc>
-      </w:tr>
-      <w:tr>
-        <w:trPr>
-          <w:cantSplit/>
-        </w:trPr>
-        <w:tc>
-          <w:tcPr>
-            <w:tcW w:type="dxa" w:w="2700"/>
-            <w:tcBorders>
-              <w:top w:val="single" w:color="D5DCE6" w:sz="4"/>
-              <w:left w:val="single" w:color="D5DCE6" w:sz="4"/>
-              <w:bottom w:val="single" w:color="D5DCE6" w:sz="4"/>
-              <w:right w:val="single" w:color="D5DCE6" w:sz="4"/>
-            </w:tcBorders>
-            <w:shd w:fill="F4F6FA" w:color="auto" w:val="clear"/>
-            <w:tcMar>
-              <w:top w:type="dxa" w:w="50"/>
-              <w:left w:type="dxa" w:w="100"/>
-              <w:bottom w:type="dxa" w:w="50"/>
-              <w:right w:type="dxa" w:w="100"/>
-            </w:tcMar>
-          </w:tcPr>
-          <w:p>
-            <w:pPr>
-              <w:spacing w:before="0" w:after="0" w:line="240"/>
-            </w:pPr>
-            <w:r>
-              <w:rPr>
-                <w:rFonts w:ascii="Calibri" w:cs="Calibri" w:eastAsia="Calibri" w:hAnsi="Calibri"/>
-                <w:sz w:val="19"/>
-                <w:szCs w:val="19"/>
-              </w:rPr>
-              <w:t xml:space="preserve">B12 — Security Audit Log</w:t>
-            </w:r>
-          </w:p>
-        </w:tc>
-        <w:tc>
-          <w:tcPr>
-            <w:tcW w:type="dxa" w:w="1400"/>
-            <w:tcBorders>
-              <w:top w:val="single" w:color="D5DCE6" w:sz="4"/>
-              <w:left w:val="single" w:color="D5DCE6" w:sz="4"/>
-              <w:bottom w:val="single" w:color="D5DCE6" w:sz="4"/>
-              <w:right w:val="single" w:color="D5DCE6" w:sz="4"/>
-            </w:tcBorders>
-            <w:shd w:fill="F4F6FA" w:color="auto" w:val="clear"/>
-            <w:tcMar>
-              <w:top w:type="dxa" w:w="50"/>
-              <w:left w:type="dxa" w:w="100"/>
-              <w:bottom w:type="dxa" w:w="50"/>
-              <w:right w:type="dxa" w:w="100"/>
-            </w:tcMar>
-          </w:tcPr>
-          <w:p>
-            <w:pPr>
-              <w:spacing w:before="0" w:after="0" w:line="240"/>
-            </w:pPr>
-            <w:r>
-              <w:rPr>
-                <w:rFonts w:ascii="Calibri" w:cs="Calibri" w:eastAsia="Calibri" w:hAnsi="Calibri"/>
-                <w:sz w:val="19"/>
-                <w:szCs w:val="19"/>
-              </w:rPr>
-              <w:t xml:space="preserve">Advanced</w:t>
-            </w:r>
-          </w:p>
-        </w:tc>
-        <w:tc>
-          <w:tcPr>
-            <w:tcW w:type="dxa" w:w="1000"/>
-            <w:tcBorders>
-              <w:top w:val="single" w:color="D5DCE6" w:sz="4"/>
-              <w:left w:val="single" w:color="D5DCE6" w:sz="4"/>
-              <w:bottom w:val="single" w:color="D5DCE6" w:sz="4"/>
-              <w:right w:val="single" w:color="D5DCE6" w:sz="4"/>
-            </w:tcBorders>
-            <w:shd w:fill="F4F6FA" w:color="auto" w:val="clear"/>
-            <w:tcMar>
-              <w:top w:type="dxa" w:w="50"/>
-              <w:left w:type="dxa" w:w="100"/>
-              <w:bottom w:type="dxa" w:w="50"/>
-              <w:right w:type="dxa" w:w="100"/>
-            </w:tcMar>
-          </w:tcPr>
-          <w:p>
-            <w:pPr>
-              <w:spacing w:before="0" w:after="0" w:line="240"/>
-            </w:pPr>
-            <w:r>
-              <w:rPr>
-                <w:rFonts w:ascii="Calibri" w:cs="Calibri" w:eastAsia="Calibri" w:hAnsi="Calibri"/>
-                <w:sz w:val="19"/>
-                <w:szCs w:val="19"/>
-              </w:rPr>
-              <w:t xml:space="preserve">S6</w:t>
-            </w:r>
-          </w:p>
-        </w:tc>
-        <w:tc>
-          <w:tcPr>
-            <w:tcW w:type="dxa" w:w="3080"/>
-            <w:tcBorders>
-              <w:top w:val="single" w:color="D5DCE6" w:sz="4"/>
-              <w:left w:val="single" w:color="D5DCE6" w:sz="4"/>
-              <w:bottom w:val="single" w:color="D5DCE6" w:sz="4"/>
-              <w:right w:val="single" w:color="D5DCE6" w:sz="4"/>
-            </w:tcBorders>
-            <w:shd w:fill="F4F6FA" w:color="auto" w:val="clear"/>
-            <w:tcMar>
-              <w:top w:type="dxa" w:w="50"/>
-              <w:left w:type="dxa" w:w="100"/>
-              <w:bottom w:type="dxa" w:w="50"/>
-              <w:right w:type="dxa" w:w="100"/>
-            </w:tcMar>
-          </w:tcPr>
-          <w:p>
-            <w:pPr>
-              <w:spacing w:before="0" w:after="0" w:line="240"/>
-            </w:pPr>
-            <w:r>
-              <w:rPr>
-                <w:rFonts w:ascii="Calibri" w:cs="Calibri" w:eastAsia="Calibri" w:hAnsi="Calibri"/>
-                <w:sz w:val="19"/>
-                <w:szCs w:val="19"/>
-              </w:rPr>
-              <w:t xml:space="preserve">23:59 CT on the day of S7</w:t>
-            </w:r>
-          </w:p>
-        </w:tc>
-        <w:tc>
-          <w:tcPr>
-            <w:tcW w:type="dxa" w:w="1900"/>
-            <w:tcBorders>
-              <w:top w:val="single" w:color="D5DCE6" w:sz="4"/>
-              <w:left w:val="single" w:color="D5DCE6" w:sz="4"/>
-              <w:bottom w:val="single" w:color="D5DCE6" w:sz="4"/>
-              <w:right w:val="single" w:color="D5DCE6" w:sz="4"/>
-            </w:tcBorders>
-            <w:shd w:fill="F4F6FA" w:color="auto" w:val="clear"/>
-            <w:tcMar>
-              <w:top w:type="dxa" w:w="50"/>
-              <w:left w:type="dxa" w:w="100"/>
-              <w:bottom w:type="dxa" w:w="50"/>
-              <w:right w:type="dxa" w:w="100"/>
-            </w:tcMar>
-          </w:tcPr>
-          <w:p>
-            <w:pPr>
-              <w:spacing w:before="0" w:after="0" w:line="240"/>
-            </w:pPr>
-            <w:r>
-              <w:rPr>
-                <w:rFonts w:ascii="Calibri" w:cs="Calibri" w:eastAsia="Calibri" w:hAnsi="Calibri"/>
-                <w:sz w:val="19"/>
-                <w:szCs w:val="19"/>
-              </w:rPr>
-              <w:t xml:space="preserve">S9</w:t>
-            </w:r>
-          </w:p>
-        </w:tc>
-      </w:tr>
-      <w:tr>
-        <w:trPr>
-          <w:cantSplit/>
-        </w:trPr>
-        <w:tc>
-          <w:tcPr>
-            <w:tcW w:type="dxa" w:w="2700"/>
-            <w:tcBorders>
-              <w:top w:val="single" w:color="D5DCE6" w:sz="4"/>
-              <w:left w:val="single" w:color="D5DCE6" w:sz="4"/>
-              <w:bottom w:val="single" w:color="D5DCE6" w:sz="4"/>
-              <w:right w:val="single" w:color="D5DCE6" w:sz="4"/>
-            </w:tcBorders>
-            <w:shd w:fill="FFFFFF" w:color="auto" w:val="clear"/>
-            <w:tcMar>
-              <w:top w:type="dxa" w:w="50"/>
-              <w:left w:type="dxa" w:w="100"/>
-              <w:bottom w:type="dxa" w:w="50"/>
-              <w:right w:type="dxa" w:w="100"/>
-            </w:tcMar>
-          </w:tcPr>
-          <w:p>
-            <w:pPr>
-              <w:spacing w:before="0" w:after="0" w:line="240"/>
-            </w:pPr>
-            <w:r>
-              <w:rPr>
-                <w:rFonts w:ascii="Calibri" w:cs="Calibri" w:eastAsia="Calibri" w:hAnsi="Calibri"/>
-                <w:sz w:val="19"/>
-                <w:szCs w:val="19"/>
-              </w:rPr>
-              <w:t xml:space="preserve">C12 — Auditor evidence pack</w:t>
-            </w:r>
-          </w:p>
-        </w:tc>
-        <w:tc>
-          <w:tcPr>
-            <w:tcW w:type="dxa" w:w="1400"/>
-            <w:tcBorders>
-              <w:top w:val="single" w:color="D5DCE6" w:sz="4"/>
-              <w:left w:val="single" w:color="D5DCE6" w:sz="4"/>
-              <w:bottom w:val="single" w:color="D5DCE6" w:sz="4"/>
-              <w:right w:val="single" w:color="D5DCE6" w:sz="4"/>
-            </w:tcBorders>
-            <w:shd w:fill="FFFFFF" w:color="auto" w:val="clear"/>
-            <w:tcMar>
-              <w:top w:type="dxa" w:w="50"/>
-              <w:left w:type="dxa" w:w="100"/>
-              <w:bottom w:type="dxa" w:w="50"/>
-              <w:right w:type="dxa" w:w="100"/>
-            </w:tcMar>
-          </w:tcPr>
-          <w:p>
-            <w:pPr>
-              <w:spacing w:before="0" w:after="0" w:line="240"/>
-            </w:pPr>
-            <w:r>
-              <w:rPr>
-                <w:rFonts w:ascii="Calibri" w:cs="Calibri" w:eastAsia="Calibri" w:hAnsi="Calibri"/>
-                <w:sz w:val="19"/>
-                <w:szCs w:val="19"/>
-              </w:rPr>
-              <w:t xml:space="preserve">Advanced</w:t>
-            </w:r>
-          </w:p>
-        </w:tc>
-        <w:tc>
-          <w:tcPr>
-            <w:tcW w:type="dxa" w:w="1000"/>
-            <w:tcBorders>
-              <w:top w:val="single" w:color="D5DCE6" w:sz="4"/>
-              <w:left w:val="single" w:color="D5DCE6" w:sz="4"/>
-              <w:bottom w:val="single" w:color="D5DCE6" w:sz="4"/>
-              <w:right w:val="single" w:color="D5DCE6" w:sz="4"/>
-            </w:tcBorders>
-            <w:shd w:fill="FFFFFF" w:color="auto" w:val="clear"/>
-            <w:tcMar>
-              <w:top w:type="dxa" w:w="50"/>
-              <w:left w:type="dxa" w:w="100"/>
-              <w:bottom w:type="dxa" w:w="50"/>
-              <w:right w:type="dxa" w:w="100"/>
-            </w:tcMar>
-          </w:tcPr>
-          <w:p>
-            <w:pPr>
-              <w:spacing w:before="0" w:after="0" w:line="240"/>
-            </w:pPr>
-            <w:r>
-              <w:rPr>
-                <w:rFonts w:ascii="Calibri" w:cs="Calibri" w:eastAsia="Calibri" w:hAnsi="Calibri"/>
-                <w:sz w:val="19"/>
-                <w:szCs w:val="19"/>
-              </w:rPr>
-              <w:t xml:space="preserve">S10</w:t>
-            </w:r>
-          </w:p>
-        </w:tc>
-        <w:tc>
-          <w:tcPr>
-            <w:tcW w:type="dxa" w:w="3080"/>
-            <w:tcBorders>
-              <w:top w:val="single" w:color="D5DCE6" w:sz="4"/>
-              <w:left w:val="single" w:color="D5DCE6" w:sz="4"/>
-              <w:bottom w:val="single" w:color="D5DCE6" w:sz="4"/>
-              <w:right w:val="single" w:color="D5DCE6" w:sz="4"/>
-            </w:tcBorders>
-            <w:shd w:fill="FFFFFF" w:color="auto" w:val="clear"/>
-            <w:tcMar>
-              <w:top w:type="dxa" w:w="50"/>
-              <w:left w:type="dxa" w:w="100"/>
-              <w:bottom w:type="dxa" w:w="50"/>
-              <w:right w:type="dxa" w:w="100"/>
-            </w:tcMar>
-          </w:tcPr>
-          <w:p>
-            <w:pPr>
-              <w:spacing w:before="0" w:after="0" w:line="240"/>
-            </w:pPr>
-            <w:r>
-              <w:rPr>
-                <w:rFonts w:ascii="Calibri" w:cs="Calibri" w:eastAsia="Calibri" w:hAnsi="Calibri"/>
-                <w:sz w:val="19"/>
-                <w:szCs w:val="19"/>
-              </w:rPr>
-              <w:t xml:space="preserve">23:59 CT on the day of S11</w:t>
-            </w:r>
-          </w:p>
-        </w:tc>
-        <w:tc>
-          <w:tcPr>
-            <w:tcW w:type="dxa" w:w="1900"/>
-            <w:tcBorders>
-              <w:top w:val="single" w:color="D5DCE6" w:sz="4"/>
-              <w:left w:val="single" w:color="D5DCE6" w:sz="4"/>
-              <w:bottom w:val="single" w:color="D5DCE6" w:sz="4"/>
-              <w:right w:val="single" w:color="D5DCE6" w:sz="4"/>
-            </w:tcBorders>
-            <w:shd w:fill="FFFFFF" w:color="auto" w:val="clear"/>
-            <w:tcMar>
-              <w:top w:type="dxa" w:w="50"/>
-              <w:left w:type="dxa" w:w="100"/>
-              <w:bottom w:type="dxa" w:w="50"/>
-              <w:right w:type="dxa" w:w="100"/>
-            </w:tcMar>
-          </w:tcPr>
-          <w:p>
-            <w:pPr>
-              <w:spacing w:before="0" w:after="0" w:line="240"/>
-            </w:pPr>
-            <w:r>
-              <w:rPr>
-                <w:rFonts w:ascii="Calibri" w:cs="Calibri" w:eastAsia="Calibri" w:hAnsi="Calibri"/>
-                <w:sz w:val="19"/>
-                <w:szCs w:val="19"/>
-              </w:rPr>
-              <w:t xml:space="preserve">S12</w:t>
-            </w:r>
-          </w:p>
-        </w:tc>
-      </w:tr>
-      <w:tr>
-        <w:trPr>
-          <w:cantSplit/>
-        </w:trPr>
-        <w:tc>
-          <w:tcPr>
-            <w:tcW w:type="dxa" w:w="2700"/>
-            <w:tcBorders>
-              <w:top w:val="single" w:color="D5DCE6" w:sz="4"/>
-              <w:left w:val="single" w:color="D5DCE6" w:sz="4"/>
-              <w:bottom w:val="single" w:color="D5DCE6" w:sz="4"/>
-              <w:right w:val="single" w:color="D5DCE6" w:sz="4"/>
-            </w:tcBorders>
-            <w:shd w:fill="F4F6FA" w:color="auto" w:val="clear"/>
-            <w:tcMar>
-              <w:top w:type="dxa" w:w="50"/>
-              <w:left w:type="dxa" w:w="100"/>
-              <w:bottom w:type="dxa" w:w="50"/>
-              <w:right w:type="dxa" w:w="100"/>
-            </w:tcMar>
-          </w:tcPr>
-          <w:p>
-            <w:pPr>
-              <w:spacing w:before="0" w:after="0" w:line="240"/>
-            </w:pPr>
-            <w:r>
-              <w:rPr>
-                <w:rFonts w:ascii="Calibri" w:cs="Calibri" w:eastAsia="Calibri" w:hAnsi="Calibri"/>
-                <w:sz w:val="19"/>
-                <w:szCs w:val="19"/>
-              </w:rPr>
-              <w:t xml:space="preserve">D7 — Mitigating controls</w:t>
-            </w:r>
-          </w:p>
-        </w:tc>
-        <w:tc>
-          <w:tcPr>
-            <w:tcW w:type="dxa" w:w="1400"/>
-            <w:tcBorders>
-              <w:top w:val="single" w:color="D5DCE6" w:sz="4"/>
-              <w:left w:val="single" w:color="D5DCE6" w:sz="4"/>
-              <w:bottom w:val="single" w:color="D5DCE6" w:sz="4"/>
-              <w:right w:val="single" w:color="D5DCE6" w:sz="4"/>
-            </w:tcBorders>
-            <w:shd w:fill="F4F6FA" w:color="auto" w:val="clear"/>
-            <w:tcMar>
-              <w:top w:type="dxa" w:w="50"/>
-              <w:left w:type="dxa" w:w="100"/>
-              <w:bottom w:type="dxa" w:w="50"/>
-              <w:right w:type="dxa" w:w="100"/>
-            </w:tcMar>
-          </w:tcPr>
-          <w:p>
-            <w:pPr>
-              <w:spacing w:before="0" w:after="0" w:line="240"/>
-            </w:pPr>
-            <w:r>
-              <w:rPr>
-                <w:rFonts w:ascii="Calibri" w:cs="Calibri" w:eastAsia="Calibri" w:hAnsi="Calibri"/>
-                <w:sz w:val="19"/>
-                <w:szCs w:val="19"/>
-              </w:rPr>
-              <w:t xml:space="preserve">Advanced</w:t>
-            </w:r>
-          </w:p>
-        </w:tc>
-        <w:tc>
-          <w:tcPr>
-            <w:tcW w:type="dxa" w:w="1000"/>
-            <w:tcBorders>
-              <w:top w:val="single" w:color="D5DCE6" w:sz="4"/>
-              <w:left w:val="single" w:color="D5DCE6" w:sz="4"/>
-              <w:bottom w:val="single" w:color="D5DCE6" w:sz="4"/>
-              <w:right w:val="single" w:color="D5DCE6" w:sz="4"/>
-            </w:tcBorders>
-            <w:shd w:fill="F4F6FA" w:color="auto" w:val="clear"/>
-            <w:tcMar>
-              <w:top w:type="dxa" w:w="50"/>
-              <w:left w:type="dxa" w:w="100"/>
-              <w:bottom w:type="dxa" w:w="50"/>
-              <w:right w:type="dxa" w:w="100"/>
-            </w:tcMar>
-          </w:tcPr>
-          <w:p>
-            <w:pPr>
-              <w:spacing w:before="0" w:after="0" w:line="240"/>
-            </w:pPr>
-            <w:r>
-              <w:rPr>
-                <w:rFonts w:ascii="Calibri" w:cs="Calibri" w:eastAsia="Calibri" w:hAnsi="Calibri"/>
-                <w:sz w:val="19"/>
-                <w:szCs w:val="19"/>
-              </w:rPr>
-              <w:t xml:space="preserve">S11</w:t>
-            </w:r>
-          </w:p>
-        </w:tc>
-        <w:tc>
-          <w:tcPr>
-            <w:tcW w:type="dxa" w:w="3080"/>
-            <w:tcBorders>
-              <w:top w:val="single" w:color="D5DCE6" w:sz="4"/>
-              <w:left w:val="single" w:color="D5DCE6" w:sz="4"/>
-              <w:bottom w:val="single" w:color="D5DCE6" w:sz="4"/>
-              <w:right w:val="single" w:color="D5DCE6" w:sz="4"/>
-            </w:tcBorders>
-            <w:shd w:fill="F4F6FA" w:color="auto" w:val="clear"/>
-            <w:tcMar>
-              <w:top w:type="dxa" w:w="50"/>
-              <w:left w:type="dxa" w:w="100"/>
-              <w:bottom w:type="dxa" w:w="50"/>
-              <w:right w:type="dxa" w:w="100"/>
-            </w:tcMar>
-          </w:tcPr>
-          <w:p>
-            <w:pPr>
-              <w:spacing w:before="0" w:after="0" w:line="240"/>
-            </w:pPr>
-            <w:r>
-              <w:rPr>
-                <w:rFonts w:ascii="Calibri" w:cs="Calibri" w:eastAsia="Calibri" w:hAnsi="Calibri"/>
-                <w:sz w:val="19"/>
-                <w:szCs w:val="19"/>
-              </w:rPr>
-              <w:t xml:space="preserve">23:59 CT on the day of S12</w:t>
-            </w:r>
-          </w:p>
-        </w:tc>
-        <w:tc>
-          <w:tcPr>
-            <w:tcW w:type="dxa" w:w="1900"/>
-            <w:tcBorders>
-              <w:top w:val="single" w:color="D5DCE6" w:sz="4"/>
-              <w:left w:val="single" w:color="D5DCE6" w:sz="4"/>
-              <w:bottom w:val="single" w:color="D5DCE6" w:sz="4"/>
-              <w:right w:val="single" w:color="D5DCE6" w:sz="4"/>
-            </w:tcBorders>
-            <w:shd w:fill="F4F6FA" w:color="auto" w:val="clear"/>
-            <w:tcMar>
-              <w:top w:type="dxa" w:w="50"/>
-              <w:left w:type="dxa" w:w="100"/>
-              <w:bottom w:type="dxa" w:w="50"/>
-              <w:right w:type="dxa" w:w="100"/>
-            </w:tcMar>
-          </w:tcPr>
-          <w:p>
-            <w:pPr>
-              <w:spacing w:before="0" w:after="0" w:line="240"/>
-            </w:pPr>
-            <w:r>
-              <w:rPr>
-                <w:rFonts w:ascii="Calibri" w:cs="Calibri" w:eastAsia="Calibri" w:hAnsi="Calibri"/>
-                <w:sz w:val="19"/>
-                <w:szCs w:val="19"/>
-              </w:rPr>
-              <w:t xml:space="preserve">Within one week</w:t>
-            </w:r>
-          </w:p>
-        </w:tc>
-      </w:tr>
-    </w:tbl>
-    <w:p>
-      <w:pPr>
-        <w:spacing w:before="0" w:after="60" w:line="240"/>
-      </w:pPr>
-      <w:r>
-        <w:rPr>
-          <w:rFonts w:ascii="Calibri" w:cs="Calibri" w:eastAsia="Calibri" w:hAnsi="Calibri"/>
-          <w:sz w:val="21"/>
-          <w:szCs w:val="21"/>
-        </w:rPr>
-        <w:t xml:space="preserve"/>
-      </w:r>
-    </w:p>
     <w:p>
       <w:pPr>
         <w:spacing w:before="0" w:after="80" w:line="240"/>
@@ -11328,7 +9851,7 @@
           <w:sz w:val="21"/>
           <w:szCs w:val="21"/>
         </w:rPr>
-        <w:t xml:space="preserve">Submit your Field 13 write-up and the capture from every part of the lab. Work built outside your ZZ_TRAIN_ namespace, with no verification evidence, or with a write-up copied from the model is returned for resubmission. Resubmissions are due one week after return. A piece passes at 60 or above, with no rubric line below 40.</w:t>
+        <w:t xml:space="preserve">There are no marked assignments or panels in this course. Your certificate confirms you completed every lab of the level.</w:t>
       </w:r>
     </w:p>
     <w:tbl>
@@ -11475,7 +9998,7 @@
                 <w:sz w:val="19"/>
                 <w:szCs w:val="19"/>
               </w:rPr>
-              <w:t xml:space="preserve">Marked builds B1, B3 and B10 passed · Intermediate stakeholder panel passed</w:t>
+              <w:t xml:space="preserve">All 18 Intermediate labs (14 live, 4 self-study) marked complete in the console · Foundations 1–12 complete · live trainees: attendance at the sessions</w:t>
             </w:r>
           </w:p>
         </w:tc>
@@ -11542,7 +10065,7 @@
                 <w:sz w:val="19"/>
                 <w:szCs w:val="19"/>
               </w:rPr>
-              <w:t xml:space="preserve">Marked deliverables B12, C12 and D7 passed · Advanced stakeholder panel passed</w:t>
+              <w:t xml:space="preserve">All 18 Advanced labs (11 live, 7 self-study) marked complete in the console · live trainees: attendance at the sessions</w:t>
             </w:r>
           </w:p>
         </w:tc>
@@ -11574,7 +10097,7 @@
           <w:sz w:val="20"/>
           <w:szCs w:val="20"/>
         </w:rPr>
-        <w:t xml:space="preserve">Mark every lab complete as you go — it is how you and your instructor see your progress. Marked work and panels are graded by TIB instructors, for live and self-study trainees alike. Resume and job-search assistance is included at both levels.</w:t>
+        <w:t xml:space="preserve">Mark every lab complete as you go — it is how you and your instructor see your progress, and how your certificate is confirmed. Write up every lab and answer the pushback before you reveal the model answers: that is where the learning is. Resume and job-search assistance is included at both levels.</w:t>
       </w:r>
     </w:p>
     <w:p>

</xml_diff>